<commit_message>
Upadted git restore and git fetch commands
</commit_message>
<xml_diff>
--- a/git2_and_github_commands_part_two_undoing_and_advanced.docx
+++ b/git2_and_github_commands_part_two_undoing_and_advanced.docx
@@ -141,12 +141,240 @@
           <w:szCs w:val="32"/>
         </w:rPr>
       </w:pPr>
-      <w:r>
+    </w:p>
+    <w:p>
+      <w:pPr>
+        <w:jc w:val="both"/>
+        <w:rPr>
+          <w:b/>
+          <w:bCs/>
+          <w:color w:val="D86DCB" w:themeColor="accent5" w:themeTint="99"/>
+          <w:sz w:val="32"/>
+          <w:szCs w:val="32"/>
+        </w:rPr>
+      </w:pPr>
+      <w:r>
+        <w:rPr>
+          <w:sz w:val="32"/>
+          <w:szCs w:val="32"/>
+        </w:rPr>
+        <w:t xml:space="preserve"># </w:t>
+      </w:r>
+      <w:r>
+        <w:rPr>
+          <w:sz w:val="32"/>
+          <w:szCs w:val="32"/>
+        </w:rPr>
+        <w:t>Completely resets repo to that commit (erases later commits + changes). Use carefully, usually for local cleanup.</w:t>
+      </w:r>
+      <w:r>
+        <w:rPr>
+          <w:sz w:val="32"/>
+          <w:szCs w:val="32"/>
+        </w:rPr>
+        <w:t xml:space="preserve"> We can get the commit hash from </w:t>
+      </w:r>
+      <w:r>
+        <w:rPr>
+          <w:sz w:val="32"/>
+          <w:szCs w:val="32"/>
+        </w:rPr>
+        <w:t>G</w:t>
+      </w:r>
+      <w:r>
+        <w:rPr>
+          <w:sz w:val="32"/>
+          <w:szCs w:val="32"/>
+        </w:rPr>
+        <w:t>it</w:t>
+      </w:r>
+      <w:r>
+        <w:rPr>
+          <w:sz w:val="32"/>
+          <w:szCs w:val="32"/>
+        </w:rPr>
+        <w:t>H</w:t>
+      </w:r>
+      <w:r>
+        <w:rPr>
+          <w:sz w:val="32"/>
+          <w:szCs w:val="32"/>
+        </w:rPr>
+        <w:t>ub repo commits and copy that.</w:t>
+      </w:r>
+    </w:p>
+    <w:p>
+      <w:pPr>
+        <w:jc w:val="both"/>
+        <w:rPr>
+          <w:b/>
+          <w:bCs/>
+          <w:color w:val="D86DCB" w:themeColor="accent5" w:themeTint="99"/>
+          <w:sz w:val="32"/>
+          <w:szCs w:val="32"/>
+        </w:rPr>
+      </w:pPr>
+      <w:r>
+        <w:rPr>
+          <w:b/>
+          <w:bCs/>
+          <w:color w:val="D86DCB" w:themeColor="accent5" w:themeTint="99"/>
+          <w:sz w:val="32"/>
+          <w:szCs w:val="32"/>
+        </w:rPr>
+        <w:t>git reset --hard &lt;</w:t>
+      </w:r>
+      <w:proofErr w:type="spellStart"/>
+      <w:r>
+        <w:rPr>
+          <w:b/>
+          <w:bCs/>
+          <w:color w:val="D86DCB" w:themeColor="accent5" w:themeTint="99"/>
+          <w:sz w:val="32"/>
+          <w:szCs w:val="32"/>
+        </w:rPr>
+        <w:t>commit_hash</w:t>
+      </w:r>
+      <w:proofErr w:type="spellEnd"/>
+      <w:r>
+        <w:rPr>
+          <w:b/>
+          <w:bCs/>
+          <w:color w:val="D86DCB" w:themeColor="accent5" w:themeTint="99"/>
+          <w:sz w:val="32"/>
+          <w:szCs w:val="32"/>
+        </w:rPr>
+        <w:t>&gt;</w:t>
+      </w:r>
+    </w:p>
+    <w:p>
+      <w:pPr>
+        <w:jc w:val="both"/>
+        <w:rPr>
+          <w:sz w:val="32"/>
+          <w:szCs w:val="32"/>
+        </w:rPr>
+      </w:pPr>
+      <w:r>
+        <w:rPr>
+          <w:sz w:val="32"/>
+          <w:szCs w:val="32"/>
+        </w:rPr>
+        <w:t xml:space="preserve"># </w:t>
+      </w:r>
+      <w:r>
+        <w:rPr>
+          <w:sz w:val="32"/>
+          <w:szCs w:val="32"/>
+        </w:rPr>
+        <w:t>Discard all uncommitted changes</w:t>
+      </w:r>
+    </w:p>
+    <w:p>
+      <w:pPr>
+        <w:jc w:val="both"/>
+        <w:rPr>
+          <w:b/>
+          <w:bCs/>
+          <w:color w:val="D86DCB" w:themeColor="accent5" w:themeTint="99"/>
+          <w:sz w:val="32"/>
+          <w:szCs w:val="32"/>
+        </w:rPr>
+      </w:pPr>
+      <w:r>
+        <w:rPr>
+          <w:b/>
+          <w:bCs/>
+          <w:color w:val="D86DCB" w:themeColor="accent5" w:themeTint="99"/>
+          <w:sz w:val="32"/>
+          <w:szCs w:val="32"/>
+        </w:rPr>
+        <w:t>git reset --hard HEAD</w:t>
+      </w:r>
+    </w:p>
+    <w:p>
+      <w:pPr>
+        <w:jc w:val="both"/>
+        <w:rPr>
+          <w:sz w:val="32"/>
+          <w:szCs w:val="32"/>
+        </w:rPr>
+      </w:pPr>
+      <w:r>
+        <w:rPr>
+          <w:sz w:val="32"/>
+          <w:szCs w:val="32"/>
+        </w:rPr>
+        <w:t># Or</w:t>
+      </w:r>
+      <w:r>
+        <w:rPr>
+          <w:sz w:val="32"/>
+          <w:szCs w:val="32"/>
+        </w:rPr>
+        <w:t>, r</w:t>
+      </w:r>
+      <w:r>
+        <w:rPr>
+          <w:sz w:val="32"/>
+          <w:szCs w:val="32"/>
+        </w:rPr>
+        <w:t>emoves the latest commit and its changes.</w:t>
+      </w:r>
+      <w:r>
+        <w:rPr>
+          <w:sz w:val="32"/>
+          <w:szCs w:val="32"/>
+        </w:rPr>
+        <w:t xml:space="preserve"> (This is destructive, be sure first)</w:t>
+      </w:r>
+    </w:p>
+    <w:p>
+      <w:pPr>
+        <w:jc w:val="both"/>
+        <w:rPr>
+          <w:b/>
+          <w:bCs/>
+          <w:color w:val="D86DCB" w:themeColor="accent5" w:themeTint="99"/>
+          <w:sz w:val="32"/>
+          <w:szCs w:val="32"/>
+        </w:rPr>
+      </w:pPr>
+      <w:r>
+        <w:rPr>
+          <w:b/>
+          <w:bCs/>
+          <w:color w:val="D86DCB" w:themeColor="accent5" w:themeTint="99"/>
+          <w:sz w:val="32"/>
+          <w:szCs w:val="32"/>
+        </w:rPr>
+        <w:t>git reset --hard HEAD~1</w:t>
+      </w:r>
+    </w:p>
+    <w:p>
+      <w:pPr>
+        <w:jc w:val="both"/>
         <w:rPr>
           <w:rFonts w:ascii="Segoe UI Emoji" w:hAnsi="Segoe UI Emoji" w:cs="Segoe UI Emoji"/>
           <w:sz w:val="32"/>
           <w:szCs w:val="32"/>
         </w:rPr>
+      </w:pPr>
+    </w:p>
+    <w:p>
+      <w:pPr>
+        <w:jc w:val="both"/>
+        <w:rPr>
+          <w:sz w:val="32"/>
+          <w:szCs w:val="32"/>
+        </w:rPr>
+      </w:pPr>
+      <w:r>
+        <w:rPr>
+          <w:rFonts w:ascii="Segoe UI Emoji" w:hAnsi="Segoe UI Emoji" w:cs="Segoe UI Emoji"/>
+          <w:sz w:val="32"/>
+          <w:szCs w:val="32"/>
+        </w:rPr>
         <w:t xml:space="preserve"># </w:t>
       </w:r>
       <w:r>
@@ -154,44 +382,72 @@
           <w:sz w:val="32"/>
           <w:szCs w:val="32"/>
         </w:rPr>
-        <w:t>Completely resets repo to that commit (erases later commits + changes). Use carefully, usually for local cleanup.</w:t>
-      </w:r>
-      <w:r>
-        <w:rPr>
-          <w:sz w:val="32"/>
-          <w:szCs w:val="32"/>
-        </w:rPr>
-        <w:t xml:space="preserve"> We can get the commit hash from </w:t>
+        <w:t>Keeps our changes staged (like “un-committing” but not deleting).</w:t>
+      </w:r>
+    </w:p>
+    <w:p>
+      <w:pPr>
+        <w:jc w:val="both"/>
+        <w:rPr>
+          <w:b/>
+          <w:bCs/>
+          <w:color w:val="D86DCB" w:themeColor="accent5" w:themeTint="99"/>
+          <w:sz w:val="32"/>
+          <w:szCs w:val="32"/>
+        </w:rPr>
+      </w:pPr>
+      <w:r>
+        <w:rPr>
+          <w:b/>
+          <w:bCs/>
+          <w:color w:val="D86DCB" w:themeColor="accent5" w:themeTint="99"/>
+          <w:sz w:val="32"/>
+          <w:szCs w:val="32"/>
+        </w:rPr>
+        <w:t>git reset --soft &lt;</w:t>
       </w:r>
       <w:proofErr w:type="spellStart"/>
       <w:r>
         <w:rPr>
-          <w:sz w:val="32"/>
-          <w:szCs w:val="32"/>
-        </w:rPr>
-        <w:t>github</w:t>
+          <w:b/>
+          <w:bCs/>
+          <w:color w:val="D86DCB" w:themeColor="accent5" w:themeTint="99"/>
+          <w:sz w:val="32"/>
+          <w:szCs w:val="32"/>
+        </w:rPr>
+        <w:t>commit_hash</w:t>
       </w:r>
       <w:proofErr w:type="spellEnd"/>
       <w:r>
         <w:rPr>
-          <w:sz w:val="32"/>
-          <w:szCs w:val="32"/>
-        </w:rPr>
-        <w:t xml:space="preserve"> repo commits and copy that.</w:t>
-      </w:r>
-    </w:p>
-    <w:p>
-      <w:pPr>
-        <w:jc w:val="both"/>
-        <w:rPr>
           <w:b/>
           <w:bCs/>
           <w:color w:val="D86DCB" w:themeColor="accent5" w:themeTint="99"/>
           <w:sz w:val="32"/>
           <w:szCs w:val="32"/>
         </w:rPr>
-      </w:pPr>
-      <w:r>
+        <w:t>&gt;</w:t>
+      </w:r>
+    </w:p>
+    <w:p>
+      <w:pPr>
+        <w:jc w:val="both"/>
+        <w:rPr>
+          <w:sz w:val="32"/>
+          <w:szCs w:val="32"/>
+        </w:rPr>
+      </w:pPr>
+      <w:r>
+        <w:rPr>
+          <w:sz w:val="32"/>
+          <w:szCs w:val="32"/>
+        </w:rPr>
+        <w:t># Undo the last commit (but keep changes). Use when the commit message or commit contents need fixing</w:t>
+      </w:r>
+    </w:p>
+    <w:p>
+      <w:pPr>
+        <w:jc w:val="both"/>
         <w:rPr>
           <w:b/>
           <w:bCs/>
@@ -199,7 +455,118 @@
           <w:sz w:val="32"/>
           <w:szCs w:val="32"/>
         </w:rPr>
-        <w:t>git reset --hard &lt;</w:t>
+      </w:pPr>
+      <w:r>
+        <w:rPr>
+          <w:b/>
+          <w:bCs/>
+          <w:color w:val="D86DCB" w:themeColor="accent5" w:themeTint="99"/>
+          <w:sz w:val="32"/>
+          <w:szCs w:val="32"/>
+        </w:rPr>
+        <w:t>git reset --soft HEAD~1</w:t>
+      </w:r>
+    </w:p>
+    <w:p>
+      <w:pPr>
+        <w:jc w:val="both"/>
+        <w:rPr>
+          <w:sz w:val="32"/>
+          <w:szCs w:val="32"/>
+        </w:rPr>
+      </w:pPr>
+    </w:p>
+    <w:p>
+      <w:pPr>
+        <w:jc w:val="both"/>
+        <w:rPr>
+          <w:b/>
+          <w:bCs/>
+          <w:sz w:val="32"/>
+          <w:szCs w:val="32"/>
+        </w:rPr>
+      </w:pPr>
+      <w:r>
+        <w:rPr>
+          <w:sz w:val="32"/>
+          <w:szCs w:val="32"/>
+        </w:rPr>
+        <w:lastRenderedPageBreak/>
+        <w:t xml:space="preserve"># </w:t>
+      </w:r>
+      <w:r>
+        <w:rPr>
+          <w:b/>
+          <w:bCs/>
+          <w:sz w:val="32"/>
+          <w:szCs w:val="32"/>
+        </w:rPr>
+        <w:t xml:space="preserve">git </w:t>
+      </w:r>
+      <w:proofErr w:type="gramStart"/>
+      <w:r>
+        <w:rPr>
+          <w:b/>
+          <w:bCs/>
+          <w:sz w:val="32"/>
+          <w:szCs w:val="32"/>
+        </w:rPr>
+        <w:t>revert</w:t>
+      </w:r>
+      <w:proofErr w:type="gramEnd"/>
+      <w:r>
+        <w:rPr>
+          <w:b/>
+          <w:bCs/>
+          <w:sz w:val="32"/>
+          <w:szCs w:val="32"/>
+        </w:rPr>
+        <w:t xml:space="preserve">. </w:t>
+      </w:r>
+      <w:r>
+        <w:rPr>
+          <w:sz w:val="32"/>
+          <w:szCs w:val="32"/>
+        </w:rPr>
+        <w:t>Safest way to undo on shared repos.</w:t>
+      </w:r>
+      <w:r>
+        <w:rPr>
+          <w:b/>
+          <w:bCs/>
+          <w:sz w:val="32"/>
+          <w:szCs w:val="32"/>
+        </w:rPr>
+        <w:t xml:space="preserve"> </w:t>
+      </w:r>
+      <w:r>
+        <w:rPr>
+          <w:sz w:val="32"/>
+          <w:szCs w:val="32"/>
+        </w:rPr>
+        <w:t>Creates a new commit that “reverses” the changes from an old commit.</w:t>
+      </w:r>
+    </w:p>
+    <w:p>
+      <w:pPr>
+        <w:jc w:val="both"/>
+        <w:rPr>
+          <w:b/>
+          <w:bCs/>
+          <w:color w:val="D86DCB" w:themeColor="accent5" w:themeTint="99"/>
+          <w:sz w:val="32"/>
+          <w:szCs w:val="32"/>
+        </w:rPr>
+      </w:pPr>
+      <w:r>
+        <w:rPr>
+          <w:b/>
+          <w:bCs/>
+          <w:color w:val="D86DCB" w:themeColor="accent5" w:themeTint="99"/>
+          <w:sz w:val="32"/>
+          <w:szCs w:val="32"/>
+        </w:rPr>
+        <w:t>git revert &lt;</w:t>
       </w:r>
       <w:proofErr w:type="spellStart"/>
       <w:r>
@@ -228,30 +595,6 @@
       <w:pPr>
         <w:jc w:val="both"/>
         <w:rPr>
-          <w:sz w:val="32"/>
-          <w:szCs w:val="32"/>
-        </w:rPr>
-      </w:pPr>
-      <w:r>
-        <w:rPr>
-          <w:rFonts w:ascii="Segoe UI Emoji" w:hAnsi="Segoe UI Emoji" w:cs="Segoe UI Emoji"/>
-          <w:sz w:val="32"/>
-          <w:szCs w:val="32"/>
-        </w:rPr>
-        <w:t xml:space="preserve"># </w:t>
-      </w:r>
-      <w:r>
-        <w:rPr>
-          <w:sz w:val="32"/>
-          <w:szCs w:val="32"/>
-        </w:rPr>
-        <w:t>Keeps our changes staged (like “un-committing” but not deleting).</w:t>
-      </w:r>
-    </w:p>
-    <w:p>
-      <w:pPr>
-        <w:jc w:val="both"/>
-        <w:rPr>
           <w:b/>
           <w:bCs/>
           <w:color w:val="D86DCB" w:themeColor="accent5" w:themeTint="99"/>
@@ -267,143 +610,7 @@
           <w:sz w:val="32"/>
           <w:szCs w:val="32"/>
         </w:rPr>
-        <w:t>git reset --soft &lt;</w:t>
-      </w:r>
-      <w:proofErr w:type="spellStart"/>
-      <w:r>
-        <w:rPr>
-          <w:b/>
-          <w:bCs/>
-          <w:color w:val="D86DCB" w:themeColor="accent5" w:themeTint="99"/>
-          <w:sz w:val="32"/>
-          <w:szCs w:val="32"/>
-        </w:rPr>
-        <w:t>commit_hash</w:t>
-      </w:r>
-      <w:proofErr w:type="spellEnd"/>
-      <w:r>
-        <w:rPr>
-          <w:b/>
-          <w:bCs/>
-          <w:color w:val="D86DCB" w:themeColor="accent5" w:themeTint="99"/>
-          <w:sz w:val="32"/>
-          <w:szCs w:val="32"/>
-        </w:rPr>
-        <w:t>&gt;</w:t>
-      </w:r>
-    </w:p>
-    <w:p>
-      <w:pPr>
-        <w:jc w:val="both"/>
-        <w:rPr>
-          <w:b/>
-          <w:bCs/>
-          <w:sz w:val="32"/>
-          <w:szCs w:val="32"/>
-        </w:rPr>
-      </w:pPr>
-      <w:r>
-        <w:rPr>
-          <w:sz w:val="32"/>
-          <w:szCs w:val="32"/>
-        </w:rPr>
-        <w:t xml:space="preserve"># </w:t>
-      </w:r>
-      <w:r>
-        <w:rPr>
-          <w:b/>
-          <w:bCs/>
-          <w:sz w:val="32"/>
-          <w:szCs w:val="32"/>
-        </w:rPr>
-        <w:t xml:space="preserve">git </w:t>
-      </w:r>
-      <w:proofErr w:type="gramStart"/>
-      <w:r>
-        <w:rPr>
-          <w:b/>
-          <w:bCs/>
-          <w:sz w:val="32"/>
-          <w:szCs w:val="32"/>
-        </w:rPr>
-        <w:t>revert</w:t>
-      </w:r>
-      <w:proofErr w:type="gramEnd"/>
-      <w:r>
-        <w:rPr>
-          <w:b/>
-          <w:bCs/>
-          <w:sz w:val="32"/>
-          <w:szCs w:val="32"/>
-        </w:rPr>
-        <w:t xml:space="preserve">. </w:t>
-      </w:r>
-      <w:r>
-        <w:rPr>
-          <w:sz w:val="32"/>
-          <w:szCs w:val="32"/>
-        </w:rPr>
-        <w:t>Safest way to undo on shared repos.</w:t>
-      </w:r>
-      <w:r>
-        <w:rPr>
-          <w:b/>
-          <w:bCs/>
-          <w:sz w:val="32"/>
-          <w:szCs w:val="32"/>
-        </w:rPr>
-        <w:t xml:space="preserve"> </w:t>
-      </w:r>
-      <w:r>
-        <w:rPr>
-          <w:sz w:val="32"/>
-          <w:szCs w:val="32"/>
-        </w:rPr>
-        <w:t>Creates a new commit that “reverses” the changes from an old commit.</w:t>
-      </w:r>
-    </w:p>
-    <w:p>
-      <w:pPr>
-        <w:jc w:val="both"/>
-        <w:rPr>
-          <w:b/>
-          <w:bCs/>
-          <w:color w:val="D86DCB" w:themeColor="accent5" w:themeTint="99"/>
-          <w:sz w:val="32"/>
-          <w:szCs w:val="32"/>
-        </w:rPr>
-      </w:pPr>
-      <w:r>
-        <w:rPr>
-          <w:b/>
-          <w:bCs/>
-          <w:color w:val="D86DCB" w:themeColor="accent5" w:themeTint="99"/>
-          <w:sz w:val="32"/>
-          <w:szCs w:val="32"/>
-        </w:rPr>
-        <w:t>git revert &lt;</w:t>
-      </w:r>
-      <w:proofErr w:type="spellStart"/>
-      <w:r>
-        <w:rPr>
-          <w:b/>
-          <w:bCs/>
-          <w:color w:val="D86DCB" w:themeColor="accent5" w:themeTint="99"/>
-          <w:sz w:val="32"/>
-          <w:szCs w:val="32"/>
-        </w:rPr>
-        <w:t>commit_hash</w:t>
-      </w:r>
-      <w:proofErr w:type="spellEnd"/>
-      <w:r>
-        <w:rPr>
-          <w:b/>
-          <w:bCs/>
-          <w:color w:val="D86DCB" w:themeColor="accent5" w:themeTint="99"/>
-          <w:sz w:val="32"/>
-          <w:szCs w:val="32"/>
-        </w:rPr>
-        <w:t>&gt;</w:t>
+        <w:t>git revert HEAD // or this</w:t>
       </w:r>
     </w:p>
     <w:p>
@@ -447,7 +654,21 @@
           <w:sz w:val="32"/>
           <w:szCs w:val="32"/>
         </w:rPr>
-        <w:t>Commit A: add login form</w:t>
+        <w:t>Commit A</w:t>
+      </w:r>
+      <w:r>
+        <w:rPr>
+          <w:sz w:val="32"/>
+          <w:szCs w:val="32"/>
+        </w:rPr>
+        <w:t xml:space="preserve"> pushed to GitHub</w:t>
+      </w:r>
+      <w:r>
+        <w:rPr>
+          <w:sz w:val="32"/>
+          <w:szCs w:val="32"/>
+        </w:rPr>
+        <w:t>: add login form</w:t>
       </w:r>
     </w:p>
     <w:p>
@@ -468,7 +689,21 @@
           <w:sz w:val="32"/>
           <w:szCs w:val="32"/>
         </w:rPr>
-        <w:t xml:space="preserve">Commit B: add bug </w:t>
+        <w:t>Commit B</w:t>
+      </w:r>
+      <w:r>
+        <w:rPr>
+          <w:sz w:val="32"/>
+          <w:szCs w:val="32"/>
+        </w:rPr>
+        <w:t xml:space="preserve"> pushed to GitHub</w:t>
+      </w:r>
+      <w:r>
+        <w:rPr>
+          <w:sz w:val="32"/>
+          <w:szCs w:val="32"/>
+        </w:rPr>
+        <w:t xml:space="preserve">: add bug </w:t>
       </w:r>
       <w:r>
         <w:rPr>
@@ -510,7 +745,6 @@
       </w:pPr>
       <w:r>
         <w:rPr>
-          <w:rFonts w:ascii="Segoe UI Emoji" w:hAnsi="Segoe UI Emoji" w:cs="Segoe UI Emoji"/>
           <w:sz w:val="32"/>
           <w:szCs w:val="32"/>
         </w:rPr>
@@ -562,8 +796,460 @@
           <w:sz w:val="32"/>
           <w:szCs w:val="32"/>
         </w:rPr>
+        <w:t># Introduced in newer Git versions as a replacement for git checkout (when used for files). Undo un</w:t>
+      </w:r>
+      <w:r>
+        <w:rPr>
+          <w:sz w:val="32"/>
+          <w:szCs w:val="32"/>
+        </w:rPr>
+        <w:t>-</w:t>
+      </w:r>
+      <w:r>
+        <w:rPr>
+          <w:sz w:val="32"/>
+          <w:szCs w:val="32"/>
+        </w:rPr>
+        <w:t>staged changes (reset file to last commit):</w:t>
+      </w:r>
+    </w:p>
+    <w:p>
+      <w:pPr>
+        <w:jc w:val="both"/>
+        <w:rPr>
+          <w:b/>
+          <w:bCs/>
+          <w:color w:val="D86DCB" w:themeColor="accent5" w:themeTint="99"/>
+          <w:sz w:val="32"/>
+          <w:szCs w:val="32"/>
+        </w:rPr>
+      </w:pPr>
+      <w:r>
+        <w:rPr>
+          <w:b/>
+          <w:bCs/>
+          <w:color w:val="D86DCB" w:themeColor="accent5" w:themeTint="99"/>
+          <w:sz w:val="32"/>
+          <w:szCs w:val="32"/>
+        </w:rPr>
+        <w:t>git restore file.txt</w:t>
+      </w:r>
+    </w:p>
+    <w:p>
+      <w:pPr>
+        <w:jc w:val="both"/>
+        <w:rPr>
+          <w:b/>
+          <w:bCs/>
+          <w:color w:val="D86DCB" w:themeColor="accent5" w:themeTint="99"/>
+          <w:sz w:val="32"/>
+          <w:szCs w:val="32"/>
+        </w:rPr>
+      </w:pPr>
+      <w:r>
+        <w:rPr>
+          <w:b/>
+          <w:bCs/>
+          <w:color w:val="D86DCB" w:themeColor="accent5" w:themeTint="99"/>
+          <w:sz w:val="32"/>
+          <w:szCs w:val="32"/>
+        </w:rPr>
+        <w:t xml:space="preserve">git </w:t>
+      </w:r>
+      <w:proofErr w:type="gramStart"/>
+      <w:r>
+        <w:rPr>
+          <w:b/>
+          <w:bCs/>
+          <w:color w:val="D86DCB" w:themeColor="accent5" w:themeTint="99"/>
+          <w:sz w:val="32"/>
+          <w:szCs w:val="32"/>
+        </w:rPr>
+        <w:t>restore .</w:t>
+      </w:r>
+      <w:proofErr w:type="gramEnd"/>
+      <w:r>
+        <w:rPr>
+          <w:b/>
+          <w:bCs/>
+          <w:color w:val="D86DCB" w:themeColor="accent5" w:themeTint="99"/>
+          <w:sz w:val="32"/>
+          <w:szCs w:val="32"/>
+        </w:rPr>
+        <w:t xml:space="preserve"> // to restore all tracked files</w:t>
+      </w:r>
+    </w:p>
+    <w:p>
+      <w:pPr>
+        <w:jc w:val="both"/>
+        <w:rPr>
+          <w:sz w:val="32"/>
+          <w:szCs w:val="32"/>
+        </w:rPr>
+      </w:pPr>
+      <w:r>
+        <w:rPr>
+          <w:sz w:val="32"/>
+          <w:szCs w:val="32"/>
+        </w:rPr>
+        <w:t># Undo staged changes (un-add file). Safer than juggling with git checkout + git reset.</w:t>
+      </w:r>
+    </w:p>
+    <w:p>
+      <w:pPr>
+        <w:jc w:val="both"/>
+        <w:rPr>
+          <w:b/>
+          <w:bCs/>
+          <w:color w:val="D86DCB" w:themeColor="accent5" w:themeTint="99"/>
+          <w:sz w:val="32"/>
+          <w:szCs w:val="32"/>
+        </w:rPr>
+      </w:pPr>
+      <w:r>
+        <w:rPr>
+          <w:b/>
+          <w:bCs/>
+          <w:color w:val="D86DCB" w:themeColor="accent5" w:themeTint="99"/>
+          <w:sz w:val="32"/>
+          <w:szCs w:val="32"/>
+        </w:rPr>
+        <w:t>git restore --staged file.txt</w:t>
+      </w:r>
+    </w:p>
+    <w:p>
+      <w:pPr>
+        <w:jc w:val="both"/>
+        <w:rPr>
+          <w:sz w:val="32"/>
+          <w:szCs w:val="32"/>
+        </w:rPr>
+      </w:pPr>
+    </w:p>
+    <w:p>
+      <w:pPr>
+        <w:jc w:val="both"/>
+        <w:rPr>
+          <w:sz w:val="32"/>
+          <w:szCs w:val="32"/>
+        </w:rPr>
+      </w:pPr>
+      <w:r>
+        <w:rPr>
+          <w:sz w:val="32"/>
+          <w:szCs w:val="32"/>
+        </w:rPr>
+        <w:t>git stash:</w:t>
+      </w:r>
+    </w:p>
+    <w:p>
+      <w:pPr>
+        <w:jc w:val="both"/>
+        <w:rPr>
+          <w:sz w:val="32"/>
+          <w:szCs w:val="32"/>
+        </w:rPr>
+      </w:pPr>
+      <w:r>
+        <w:rPr>
+          <w:sz w:val="32"/>
+          <w:szCs w:val="32"/>
+        </w:rPr>
+        <w:t># Temporarily save work without committing (e.g., switching branches quickly). Save changes:</w:t>
+      </w:r>
+    </w:p>
+    <w:p>
+      <w:pPr>
+        <w:jc w:val="both"/>
+        <w:rPr>
+          <w:b/>
+          <w:bCs/>
+          <w:color w:val="D86DCB" w:themeColor="accent5" w:themeTint="99"/>
+          <w:sz w:val="32"/>
+          <w:szCs w:val="32"/>
+        </w:rPr>
+      </w:pPr>
+      <w:r>
+        <w:rPr>
+          <w:b/>
+          <w:bCs/>
+          <w:color w:val="D86DCB" w:themeColor="accent5" w:themeTint="99"/>
+          <w:sz w:val="32"/>
+          <w:szCs w:val="32"/>
+        </w:rPr>
+        <w:t>git stash</w:t>
+      </w:r>
+    </w:p>
+    <w:p>
+      <w:pPr>
+        <w:jc w:val="both"/>
+        <w:rPr>
+          <w:sz w:val="32"/>
+          <w:szCs w:val="32"/>
+        </w:rPr>
+      </w:pPr>
+      <w:r>
+        <w:rPr>
+          <w:sz w:val="32"/>
+          <w:szCs w:val="32"/>
+        </w:rPr>
         <w:lastRenderedPageBreak/>
-        <w:t xml:space="preserve"># Introduced in newer Git versions as a replacement for git checkout (when used for files). Undo </w:t>
+        <w:t># List stashes</w:t>
+      </w:r>
+      <w:r>
+        <w:rPr>
+          <w:sz w:val="32"/>
+          <w:szCs w:val="32"/>
+        </w:rPr>
+        <w:t>. U</w:t>
+      </w:r>
+      <w:r>
+        <w:rPr>
+          <w:sz w:val="32"/>
+          <w:szCs w:val="32"/>
+        </w:rPr>
+        <w:t>sed to view stashes</w:t>
+      </w:r>
+      <w:r>
+        <w:rPr>
+          <w:sz w:val="32"/>
+          <w:szCs w:val="32"/>
+        </w:rPr>
+        <w:t>. See all stashes stored in the box</w:t>
+      </w:r>
+      <w:r>
+        <w:rPr>
+          <w:sz w:val="32"/>
+          <w:szCs w:val="32"/>
+        </w:rPr>
+        <w:t>:</w:t>
+      </w:r>
+    </w:p>
+    <w:p>
+      <w:pPr>
+        <w:jc w:val="both"/>
+        <w:rPr>
+          <w:b/>
+          <w:bCs/>
+          <w:color w:val="D86DCB" w:themeColor="accent5" w:themeTint="99"/>
+          <w:sz w:val="32"/>
+          <w:szCs w:val="32"/>
+        </w:rPr>
+      </w:pPr>
+      <w:r>
+        <w:rPr>
+          <w:b/>
+          <w:bCs/>
+          <w:color w:val="D86DCB" w:themeColor="accent5" w:themeTint="99"/>
+          <w:sz w:val="32"/>
+          <w:szCs w:val="32"/>
+        </w:rPr>
+        <w:t>git stash list</w:t>
+      </w:r>
+    </w:p>
+    <w:p>
+      <w:pPr>
+        <w:jc w:val="both"/>
+        <w:rPr>
+          <w:sz w:val="32"/>
+          <w:szCs w:val="32"/>
+        </w:rPr>
+      </w:pPr>
+      <w:r>
+        <w:rPr>
+          <w:sz w:val="32"/>
+          <w:szCs w:val="32"/>
+        </w:rPr>
+        <w:t># Apply most recent stash:</w:t>
+      </w:r>
+    </w:p>
+    <w:p>
+      <w:pPr>
+        <w:jc w:val="both"/>
+        <w:rPr>
+          <w:b/>
+          <w:bCs/>
+          <w:color w:val="D86DCB" w:themeColor="accent5" w:themeTint="99"/>
+          <w:sz w:val="32"/>
+          <w:szCs w:val="32"/>
+        </w:rPr>
+      </w:pPr>
+      <w:r>
+        <w:rPr>
+          <w:b/>
+          <w:bCs/>
+          <w:color w:val="D86DCB" w:themeColor="accent5" w:themeTint="99"/>
+          <w:sz w:val="32"/>
+          <w:szCs w:val="32"/>
+        </w:rPr>
+        <w:t xml:space="preserve">git stash </w:t>
+      </w:r>
+      <w:proofErr w:type="gramStart"/>
+      <w:r>
+        <w:rPr>
+          <w:b/>
+          <w:bCs/>
+          <w:color w:val="D86DCB" w:themeColor="accent5" w:themeTint="99"/>
+          <w:sz w:val="32"/>
+          <w:szCs w:val="32"/>
+        </w:rPr>
+        <w:t>apply</w:t>
+      </w:r>
+      <w:proofErr w:type="gramEnd"/>
+    </w:p>
+    <w:p>
+      <w:pPr>
+        <w:jc w:val="both"/>
+        <w:rPr>
+          <w:sz w:val="32"/>
+          <w:szCs w:val="32"/>
+        </w:rPr>
+      </w:pPr>
+      <w:r>
+        <w:rPr>
+          <w:sz w:val="32"/>
+          <w:szCs w:val="32"/>
+        </w:rPr>
+        <w:t># Apply &amp; remove:</w:t>
+      </w:r>
+    </w:p>
+    <w:p>
+      <w:pPr>
+        <w:jc w:val="both"/>
+        <w:rPr>
+          <w:b/>
+          <w:bCs/>
+          <w:color w:val="D86DCB" w:themeColor="accent5" w:themeTint="99"/>
+          <w:sz w:val="32"/>
+          <w:szCs w:val="32"/>
+        </w:rPr>
+      </w:pPr>
+      <w:r>
+        <w:rPr>
+          <w:b/>
+          <w:bCs/>
+          <w:color w:val="D86DCB" w:themeColor="accent5" w:themeTint="99"/>
+          <w:sz w:val="32"/>
+          <w:szCs w:val="32"/>
+        </w:rPr>
+        <w:t>git stash pop</w:t>
+      </w:r>
+    </w:p>
+    <w:p>
+      <w:pPr>
+        <w:jc w:val="both"/>
+        <w:rPr>
+          <w:sz w:val="32"/>
+          <w:szCs w:val="32"/>
+        </w:rPr>
+      </w:pPr>
+      <w:r>
+        <w:rPr>
+          <w:sz w:val="32"/>
+          <w:szCs w:val="32"/>
+        </w:rPr>
+        <w:t># Drop a stash:</w:t>
+      </w:r>
+    </w:p>
+    <w:p>
+      <w:pPr>
+        <w:jc w:val="both"/>
+        <w:rPr>
+          <w:b/>
+          <w:bCs/>
+          <w:color w:val="D86DCB" w:themeColor="accent5" w:themeTint="99"/>
+          <w:sz w:val="32"/>
+          <w:szCs w:val="32"/>
+        </w:rPr>
+      </w:pPr>
+      <w:r>
+        <w:rPr>
+          <w:b/>
+          <w:bCs/>
+          <w:color w:val="D86DCB" w:themeColor="accent5" w:themeTint="99"/>
+          <w:sz w:val="32"/>
+          <w:szCs w:val="32"/>
+        </w:rPr>
+        <w:t>git stash drop stash</w:t>
+      </w:r>
+      <w:proofErr w:type="gramStart"/>
+      <w:r>
+        <w:rPr>
+          <w:b/>
+          <w:bCs/>
+          <w:color w:val="D86DCB" w:themeColor="accent5" w:themeTint="99"/>
+          <w:sz w:val="32"/>
+          <w:szCs w:val="32"/>
+        </w:rPr>
+        <w:t>@{</w:t>
+      </w:r>
+      <w:proofErr w:type="gramEnd"/>
+      <w:r>
+        <w:rPr>
+          <w:b/>
+          <w:bCs/>
+          <w:color w:val="D86DCB" w:themeColor="accent5" w:themeTint="99"/>
+          <w:sz w:val="32"/>
+          <w:szCs w:val="32"/>
+        </w:rPr>
+        <w:t>0}</w:t>
+      </w:r>
+    </w:p>
+    <w:p>
+      <w:pPr>
+        <w:jc w:val="both"/>
+        <w:rPr>
+          <w:sz w:val="32"/>
+          <w:szCs w:val="32"/>
+        </w:rPr>
+      </w:pPr>
+      <w:r>
+        <w:rPr>
+          <w:sz w:val="32"/>
+          <w:szCs w:val="32"/>
+        </w:rPr>
+        <w:t># Example workflow:</w:t>
+      </w:r>
+    </w:p>
+    <w:p>
+      <w:pPr>
+        <w:jc w:val="both"/>
+        <w:rPr>
+          <w:sz w:val="32"/>
+          <w:szCs w:val="32"/>
+        </w:rPr>
+      </w:pPr>
+      <w:r>
+        <w:rPr>
+          <w:sz w:val="32"/>
+          <w:szCs w:val="32"/>
+        </w:rPr>
+        <w:t>Editing code → need to pull new changes → stash → pull → apply stash back.</w:t>
+      </w:r>
+    </w:p>
+    <w:p>
+      <w:pPr>
+        <w:jc w:val="both"/>
+        <w:rPr>
+          <w:sz w:val="32"/>
+          <w:szCs w:val="32"/>
+        </w:rPr>
+      </w:pPr>
+    </w:p>
+    <w:p>
+      <w:pPr>
+        <w:jc w:val="both"/>
+        <w:rPr>
+          <w:sz w:val="32"/>
+          <w:szCs w:val="32"/>
+        </w:rPr>
+      </w:pPr>
+      <w:r>
+        <w:rPr>
+          <w:sz w:val="32"/>
+          <w:szCs w:val="32"/>
+        </w:rPr>
+        <w:t xml:space="preserve">Recover Deleted Branches &amp; Commits (git </w:t>
       </w:r>
       <w:proofErr w:type="spellStart"/>
       <w:r>
@@ -571,7 +1257,7 @@
           <w:sz w:val="32"/>
           <w:szCs w:val="32"/>
         </w:rPr>
-        <w:t>unstaged</w:t>
+        <w:t>reflog</w:t>
       </w:r>
       <w:proofErr w:type="spellEnd"/>
       <w:r>
@@ -579,7 +1265,53 @@
           <w:sz w:val="32"/>
           <w:szCs w:val="32"/>
         </w:rPr>
-        <w:t xml:space="preserve"> changes (reset file to last commit):</w:t>
+        <w:t>):</w:t>
+      </w:r>
+    </w:p>
+    <w:p>
+      <w:pPr>
+        <w:jc w:val="both"/>
+        <w:rPr>
+          <w:sz w:val="32"/>
+          <w:szCs w:val="32"/>
+        </w:rPr>
+      </w:pPr>
+      <w:r>
+        <w:rPr>
+          <w:sz w:val="32"/>
+          <w:szCs w:val="32"/>
+        </w:rPr>
+        <w:t># Even if we delete commits or branches, Git usually remembers them in its log.</w:t>
+      </w:r>
+      <w:r>
+        <w:rPr>
+          <w:sz w:val="32"/>
+          <w:szCs w:val="32"/>
+        </w:rPr>
+        <w:t xml:space="preserve"> </w:t>
+      </w:r>
+      <w:r>
+        <w:rPr>
+          <w:sz w:val="32"/>
+          <w:szCs w:val="32"/>
+        </w:rPr>
+        <w:t xml:space="preserve">View </w:t>
+      </w:r>
+      <w:proofErr w:type="spellStart"/>
+      <w:r>
+        <w:rPr>
+          <w:sz w:val="32"/>
+          <w:szCs w:val="32"/>
+        </w:rPr>
+        <w:t>reflog</w:t>
+      </w:r>
+      <w:proofErr w:type="spellEnd"/>
+      <w:r>
+        <w:rPr>
+          <w:sz w:val="32"/>
+          <w:szCs w:val="32"/>
+        </w:rPr>
+        <w:t>:</w:t>
       </w:r>
     </w:p>
     <w:p>
@@ -601,28 +1333,10 @@
           <w:sz w:val="32"/>
           <w:szCs w:val="32"/>
         </w:rPr>
-        <w:t>git restore file.txt</w:t>
-      </w:r>
-    </w:p>
-    <w:p>
-      <w:pPr>
-        <w:jc w:val="both"/>
-        <w:rPr>
-          <w:sz w:val="32"/>
-          <w:szCs w:val="32"/>
-        </w:rPr>
-      </w:pPr>
-      <w:r>
-        <w:rPr>
-          <w:sz w:val="32"/>
-          <w:szCs w:val="32"/>
-        </w:rPr>
-        <w:t># Undo staged changes (un-add file). Safer than juggling with git checkout + git reset.</w:t>
-      </w:r>
-    </w:p>
-    <w:p>
-      <w:pPr>
-        <w:jc w:val="both"/>
+        <w:t xml:space="preserve">git </w:t>
+      </w:r>
+      <w:proofErr w:type="spellStart"/>
+      <w:r>
         <w:rPr>
           <w:b/>
           <w:bCs/>
@@ -630,8 +1344,36 @@
           <w:sz w:val="32"/>
           <w:szCs w:val="32"/>
         </w:rPr>
-      </w:pPr>
-      <w:r>
+        <w:t>reflog</w:t>
+      </w:r>
+      <w:proofErr w:type="spellEnd"/>
+    </w:p>
+    <w:p>
+      <w:pPr>
+        <w:jc w:val="both"/>
+        <w:rPr>
+          <w:sz w:val="32"/>
+          <w:szCs w:val="32"/>
+        </w:rPr>
+      </w:pPr>
+      <w:r>
+        <w:rPr>
+          <w:sz w:val="32"/>
+          <w:szCs w:val="32"/>
+        </w:rPr>
+        <w:t xml:space="preserve"># </w:t>
+      </w:r>
+      <w:r>
+        <w:rPr>
+          <w:sz w:val="32"/>
+          <w:szCs w:val="32"/>
+        </w:rPr>
+        <w:t>Output example:</w:t>
+      </w:r>
+    </w:p>
+    <w:p>
+      <w:pPr>
+        <w:jc w:val="both"/>
         <w:rPr>
           <w:b/>
           <w:bCs/>
@@ -639,53 +1381,8 @@
           <w:sz w:val="32"/>
           <w:szCs w:val="32"/>
         </w:rPr>
-        <w:t>git restore --staged file.txt</w:t>
-      </w:r>
-    </w:p>
-    <w:p>
-      <w:pPr>
-        <w:jc w:val="both"/>
-        <w:rPr>
-          <w:sz w:val="32"/>
-          <w:szCs w:val="32"/>
-        </w:rPr>
-      </w:pPr>
-    </w:p>
-    <w:p>
-      <w:pPr>
-        <w:jc w:val="both"/>
-        <w:rPr>
-          <w:sz w:val="32"/>
-          <w:szCs w:val="32"/>
-        </w:rPr>
-      </w:pPr>
-      <w:r>
-        <w:rPr>
-          <w:sz w:val="32"/>
-          <w:szCs w:val="32"/>
-        </w:rPr>
-        <w:t>git stash:</w:t>
-      </w:r>
-    </w:p>
-    <w:p>
-      <w:pPr>
-        <w:jc w:val="both"/>
-        <w:rPr>
-          <w:sz w:val="32"/>
-          <w:szCs w:val="32"/>
-        </w:rPr>
-      </w:pPr>
-      <w:r>
-        <w:rPr>
-          <w:sz w:val="32"/>
-          <w:szCs w:val="32"/>
-        </w:rPr>
-        <w:t># Temporarily save work without committing (e.g., switching branches quickly). Save changes:</w:t>
-      </w:r>
-    </w:p>
-    <w:p>
-      <w:pPr>
-        <w:jc w:val="both"/>
+      </w:pPr>
+      <w:r>
         <w:rPr>
           <w:b/>
           <w:bCs/>
@@ -693,7 +1390,9 @@
           <w:sz w:val="32"/>
           <w:szCs w:val="32"/>
         </w:rPr>
-      </w:pPr>
+        <w:t>a1b2c3d HEAD</w:t>
+      </w:r>
+      <w:proofErr w:type="gramStart"/>
       <w:r>
         <w:rPr>
           <w:b/>
@@ -702,56 +1401,10 @@
           <w:sz w:val="32"/>
           <w:szCs w:val="32"/>
         </w:rPr>
-        <w:t>git stash</w:t>
-      </w:r>
-    </w:p>
-    <w:p>
-      <w:pPr>
-        <w:jc w:val="both"/>
-        <w:rPr>
-          <w:sz w:val="32"/>
-          <w:szCs w:val="32"/>
-        </w:rPr>
-      </w:pPr>
-      <w:r>
-        <w:rPr>
-          <w:sz w:val="32"/>
-          <w:szCs w:val="32"/>
-        </w:rPr>
-        <w:t># List stashes</w:t>
-      </w:r>
-      <w:r>
-        <w:rPr>
-          <w:sz w:val="32"/>
-          <w:szCs w:val="32"/>
-        </w:rPr>
-        <w:t>. U</w:t>
-      </w:r>
-      <w:r>
-        <w:rPr>
-          <w:sz w:val="32"/>
-          <w:szCs w:val="32"/>
-        </w:rPr>
-        <w:t>sed to view stashes</w:t>
-      </w:r>
-      <w:r>
-        <w:rPr>
-          <w:sz w:val="32"/>
-          <w:szCs w:val="32"/>
-        </w:rPr>
-        <w:t>. See all stashes stored in the box</w:t>
-      </w:r>
-      <w:r>
-        <w:rPr>
-          <w:sz w:val="32"/>
-          <w:szCs w:val="32"/>
-        </w:rPr>
-        <w:t>:</w:t>
-      </w:r>
-    </w:p>
-    <w:p>
-      <w:pPr>
-        <w:jc w:val="both"/>
+        <w:t>@{</w:t>
+      </w:r>
+      <w:proofErr w:type="gramEnd"/>
+      <w:r>
         <w:rPr>
           <w:b/>
           <w:bCs/>
@@ -759,8 +1412,12 @@
           <w:sz w:val="32"/>
           <w:szCs w:val="32"/>
         </w:rPr>
-      </w:pPr>
-      <w:r>
+        <w:t>0}: commit: Fix bug</w:t>
+      </w:r>
+    </w:p>
+    <w:p>
+      <w:pPr>
+        <w:jc w:val="both"/>
         <w:rPr>
           <w:b/>
           <w:bCs/>
@@ -768,28 +1425,8 @@
           <w:sz w:val="32"/>
           <w:szCs w:val="32"/>
         </w:rPr>
-        <w:t>git stash list</w:t>
-      </w:r>
-    </w:p>
-    <w:p>
-      <w:pPr>
-        <w:jc w:val="both"/>
-        <w:rPr>
-          <w:sz w:val="32"/>
-          <w:szCs w:val="32"/>
-        </w:rPr>
-      </w:pPr>
-      <w:r>
-        <w:rPr>
-          <w:sz w:val="32"/>
-          <w:szCs w:val="32"/>
-        </w:rPr>
-        <w:t># Apply most recent stash:</w:t>
-      </w:r>
-    </w:p>
-    <w:p>
-      <w:pPr>
-        <w:jc w:val="both"/>
+      </w:pPr>
+      <w:r>
         <w:rPr>
           <w:b/>
           <w:bCs/>
@@ -797,7 +1434,9 @@
           <w:sz w:val="32"/>
           <w:szCs w:val="32"/>
         </w:rPr>
-      </w:pPr>
+        <w:t>d4e5f6g HEAD</w:t>
+      </w:r>
+      <w:proofErr w:type="gramStart"/>
       <w:r>
         <w:rPr>
           <w:b/>
@@ -806,7 +1445,40 @@
           <w:sz w:val="32"/>
           <w:szCs w:val="32"/>
         </w:rPr>
-        <w:t xml:space="preserve">git stash </w:t>
+        <w:t>@{</w:t>
+      </w:r>
+      <w:proofErr w:type="gramEnd"/>
+      <w:r>
+        <w:rPr>
+          <w:b/>
+          <w:bCs/>
+          <w:color w:val="D86DCB" w:themeColor="accent5" w:themeTint="99"/>
+          <w:sz w:val="32"/>
+          <w:szCs w:val="32"/>
+        </w:rPr>
+        <w:t>1}: commit: Add feature</w:t>
+      </w:r>
+    </w:p>
+    <w:p>
+      <w:pPr>
+        <w:jc w:val="both"/>
+        <w:rPr>
+          <w:b/>
+          <w:bCs/>
+          <w:color w:val="D86DCB" w:themeColor="accent5" w:themeTint="99"/>
+          <w:sz w:val="32"/>
+          <w:szCs w:val="32"/>
+        </w:rPr>
+      </w:pPr>
+      <w:r>
+        <w:rPr>
+          <w:b/>
+          <w:bCs/>
+          <w:color w:val="D86DCB" w:themeColor="accent5" w:themeTint="99"/>
+          <w:sz w:val="32"/>
+          <w:szCs w:val="32"/>
+        </w:rPr>
+        <w:t>h7i8j9k HEAD</w:t>
       </w:r>
       <w:proofErr w:type="gramStart"/>
       <w:r>
@@ -817,29 +1489,10 @@
           <w:sz w:val="32"/>
           <w:szCs w:val="32"/>
         </w:rPr>
-        <w:t>apply</w:t>
+        <w:t>@{</w:t>
       </w:r>
       <w:proofErr w:type="gramEnd"/>
-    </w:p>
-    <w:p>
-      <w:pPr>
-        <w:jc w:val="both"/>
-        <w:rPr>
-          <w:sz w:val="32"/>
-          <w:szCs w:val="32"/>
-        </w:rPr>
-      </w:pPr>
-      <w:r>
-        <w:rPr>
-          <w:sz w:val="32"/>
-          <w:szCs w:val="32"/>
-        </w:rPr>
-        <w:t># Apply &amp; remove:</w:t>
-      </w:r>
-    </w:p>
-    <w:p>
-      <w:pPr>
-        <w:jc w:val="both"/>
+      <w:r>
         <w:rPr>
           <w:b/>
           <w:bCs/>
@@ -847,8 +1500,35 @@
           <w:sz w:val="32"/>
           <w:szCs w:val="32"/>
         </w:rPr>
-      </w:pPr>
-      <w:r>
+        <w:t>2}: checkout: moving from main to feature</w:t>
+      </w:r>
+    </w:p>
+    <w:p>
+      <w:pPr>
+        <w:jc w:val="both"/>
+        <w:rPr>
+          <w:sz w:val="32"/>
+          <w:szCs w:val="32"/>
+        </w:rPr>
+      </w:pPr>
+      <w:r>
+        <w:rPr>
+          <w:sz w:val="32"/>
+          <w:szCs w:val="32"/>
+        </w:rPr>
+        <w:t xml:space="preserve"># </w:t>
+      </w:r>
+      <w:r>
+        <w:rPr>
+          <w:sz w:val="32"/>
+          <w:szCs w:val="32"/>
+        </w:rPr>
+        <w:t>Restore branch:</w:t>
+      </w:r>
+    </w:p>
+    <w:p>
+      <w:pPr>
+        <w:jc w:val="both"/>
         <w:rPr>
           <w:b/>
           <w:bCs/>
@@ -856,28 +1536,8 @@
           <w:sz w:val="32"/>
           <w:szCs w:val="32"/>
         </w:rPr>
-        <w:t>git stash pop</w:t>
-      </w:r>
-    </w:p>
-    <w:p>
-      <w:pPr>
-        <w:jc w:val="both"/>
-        <w:rPr>
-          <w:sz w:val="32"/>
-          <w:szCs w:val="32"/>
-        </w:rPr>
-      </w:pPr>
-      <w:r>
-        <w:rPr>
-          <w:sz w:val="32"/>
-          <w:szCs w:val="32"/>
-        </w:rPr>
-        <w:t># Drop a stash:</w:t>
-      </w:r>
-    </w:p>
-    <w:p>
-      <w:pPr>
-        <w:jc w:val="both"/>
+      </w:pPr>
+      <w:r>
         <w:rPr>
           <w:b/>
           <w:bCs/>
@@ -885,7 +1545,9 @@
           <w:sz w:val="32"/>
           <w:szCs w:val="32"/>
         </w:rPr>
-      </w:pPr>
+        <w:t xml:space="preserve">git checkout -b </w:t>
+      </w:r>
+      <w:proofErr w:type="spellStart"/>
       <w:r>
         <w:rPr>
           <w:b/>
@@ -894,9 +1556,9 @@
           <w:sz w:val="32"/>
           <w:szCs w:val="32"/>
         </w:rPr>
-        <w:t>git stash drop stash</w:t>
-      </w:r>
-      <w:proofErr w:type="gramStart"/>
+        <w:t>recovered_branch</w:t>
+      </w:r>
+      <w:proofErr w:type="spellEnd"/>
       <w:r>
         <w:rPr>
           <w:b/>
@@ -905,9 +1567,9 @@
           <w:sz w:val="32"/>
           <w:szCs w:val="32"/>
         </w:rPr>
-        <w:t>@{</w:t>
-      </w:r>
-      <w:proofErr w:type="gramEnd"/>
+        <w:t xml:space="preserve"> &lt;</w:t>
+      </w:r>
+      <w:proofErr w:type="spellStart"/>
       <w:r>
         <w:rPr>
           <w:b/>
@@ -916,403 +1578,17 @@
           <w:sz w:val="32"/>
           <w:szCs w:val="32"/>
         </w:rPr>
-        <w:t>0}</w:t>
-      </w:r>
-    </w:p>
-    <w:p>
-      <w:pPr>
-        <w:jc w:val="both"/>
-        <w:rPr>
-          <w:sz w:val="32"/>
-          <w:szCs w:val="32"/>
-        </w:rPr>
-      </w:pPr>
-      <w:r>
-        <w:rPr>
-          <w:sz w:val="32"/>
-          <w:szCs w:val="32"/>
-        </w:rPr>
-        <w:t># Example workflow:</w:t>
-      </w:r>
-    </w:p>
-    <w:p>
-      <w:pPr>
-        <w:jc w:val="both"/>
-        <w:rPr>
-          <w:sz w:val="32"/>
-          <w:szCs w:val="32"/>
-        </w:rPr>
-      </w:pPr>
-      <w:r>
-        <w:rPr>
-          <w:sz w:val="32"/>
-          <w:szCs w:val="32"/>
-        </w:rPr>
-        <w:t>Editing code → need to pull new changes → stash → pull → apply stash back.</w:t>
-      </w:r>
-    </w:p>
-    <w:p>
-      <w:pPr>
-        <w:jc w:val="both"/>
-        <w:rPr>
-          <w:sz w:val="32"/>
-          <w:szCs w:val="32"/>
-        </w:rPr>
-      </w:pPr>
-    </w:p>
-    <w:p>
-      <w:pPr>
-        <w:jc w:val="both"/>
-        <w:rPr>
-          <w:sz w:val="32"/>
-          <w:szCs w:val="32"/>
-        </w:rPr>
-      </w:pPr>
-      <w:r>
-        <w:rPr>
-          <w:sz w:val="32"/>
-          <w:szCs w:val="32"/>
-        </w:rPr>
-        <w:t xml:space="preserve">Recover Deleted Branches &amp; Commits (git </w:t>
-      </w:r>
-      <w:proofErr w:type="spellStart"/>
-      <w:r>
-        <w:rPr>
-          <w:sz w:val="32"/>
-          <w:szCs w:val="32"/>
-        </w:rPr>
-        <w:t>reflog</w:t>
+        <w:t>commit_hash</w:t>
       </w:r>
       <w:proofErr w:type="spellEnd"/>
       <w:r>
         <w:rPr>
-          <w:sz w:val="32"/>
-          <w:szCs w:val="32"/>
-        </w:rPr>
-        <w:t>):</w:t>
-      </w:r>
-    </w:p>
-    <w:p>
-      <w:pPr>
-        <w:jc w:val="both"/>
-        <w:rPr>
-          <w:sz w:val="32"/>
-          <w:szCs w:val="32"/>
-        </w:rPr>
-      </w:pPr>
-      <w:r>
-        <w:rPr>
-          <w:sz w:val="32"/>
-          <w:szCs w:val="32"/>
-        </w:rPr>
-        <w:t># Even if we delete commits or branches, Git usually remembers them in its log.</w:t>
-      </w:r>
-      <w:r>
-        <w:rPr>
-          <w:sz w:val="32"/>
-          <w:szCs w:val="32"/>
-        </w:rPr>
-        <w:t xml:space="preserve"> </w:t>
-      </w:r>
-      <w:r>
-        <w:rPr>
-          <w:sz w:val="32"/>
-          <w:szCs w:val="32"/>
-        </w:rPr>
-        <w:t xml:space="preserve">View </w:t>
-      </w:r>
-      <w:proofErr w:type="spellStart"/>
-      <w:r>
-        <w:rPr>
-          <w:sz w:val="32"/>
-          <w:szCs w:val="32"/>
-        </w:rPr>
-        <w:t>reflog</w:t>
-      </w:r>
-      <w:proofErr w:type="spellEnd"/>
-      <w:r>
-        <w:rPr>
-          <w:sz w:val="32"/>
-          <w:szCs w:val="32"/>
-        </w:rPr>
-        <w:t>:</w:t>
-      </w:r>
-    </w:p>
-    <w:p>
-      <w:pPr>
-        <w:jc w:val="both"/>
-        <w:rPr>
           <w:b/>
           <w:bCs/>
           <w:color w:val="D86DCB" w:themeColor="accent5" w:themeTint="99"/>
           <w:sz w:val="32"/>
           <w:szCs w:val="32"/>
         </w:rPr>
-      </w:pPr>
-      <w:r>
-        <w:rPr>
-          <w:b/>
-          <w:bCs/>
-          <w:color w:val="D86DCB" w:themeColor="accent5" w:themeTint="99"/>
-          <w:sz w:val="32"/>
-          <w:szCs w:val="32"/>
-        </w:rPr>
-        <w:t xml:space="preserve">git </w:t>
-      </w:r>
-      <w:proofErr w:type="spellStart"/>
-      <w:r>
-        <w:rPr>
-          <w:b/>
-          <w:bCs/>
-          <w:color w:val="D86DCB" w:themeColor="accent5" w:themeTint="99"/>
-          <w:sz w:val="32"/>
-          <w:szCs w:val="32"/>
-        </w:rPr>
-        <w:t>reflog</w:t>
-      </w:r>
-      <w:proofErr w:type="spellEnd"/>
-    </w:p>
-    <w:p>
-      <w:pPr>
-        <w:jc w:val="both"/>
-        <w:rPr>
-          <w:sz w:val="32"/>
-          <w:szCs w:val="32"/>
-        </w:rPr>
-      </w:pPr>
-      <w:r>
-        <w:rPr>
-          <w:sz w:val="32"/>
-          <w:szCs w:val="32"/>
-        </w:rPr>
-        <w:t xml:space="preserve"># </w:t>
-      </w:r>
-      <w:r>
-        <w:rPr>
-          <w:sz w:val="32"/>
-          <w:szCs w:val="32"/>
-        </w:rPr>
-        <w:t>Output example:</w:t>
-      </w:r>
-    </w:p>
-    <w:p>
-      <w:pPr>
-        <w:jc w:val="both"/>
-        <w:rPr>
-          <w:b/>
-          <w:bCs/>
-          <w:color w:val="D86DCB" w:themeColor="accent5" w:themeTint="99"/>
-          <w:sz w:val="32"/>
-          <w:szCs w:val="32"/>
-        </w:rPr>
-      </w:pPr>
-      <w:r>
-        <w:rPr>
-          <w:b/>
-          <w:bCs/>
-          <w:color w:val="D86DCB" w:themeColor="accent5" w:themeTint="99"/>
-          <w:sz w:val="32"/>
-          <w:szCs w:val="32"/>
-        </w:rPr>
-        <w:t>a1b2c3d HEAD</w:t>
-      </w:r>
-      <w:proofErr w:type="gramStart"/>
-      <w:r>
-        <w:rPr>
-          <w:b/>
-          <w:bCs/>
-          <w:color w:val="D86DCB" w:themeColor="accent5" w:themeTint="99"/>
-          <w:sz w:val="32"/>
-          <w:szCs w:val="32"/>
-        </w:rPr>
-        <w:t>@{</w:t>
-      </w:r>
-      <w:proofErr w:type="gramEnd"/>
-      <w:r>
-        <w:rPr>
-          <w:b/>
-          <w:bCs/>
-          <w:color w:val="D86DCB" w:themeColor="accent5" w:themeTint="99"/>
-          <w:sz w:val="32"/>
-          <w:szCs w:val="32"/>
-        </w:rPr>
-        <w:t>0}: commit: Fix bug</w:t>
-      </w:r>
-    </w:p>
-    <w:p>
-      <w:pPr>
-        <w:jc w:val="both"/>
-        <w:rPr>
-          <w:b/>
-          <w:bCs/>
-          <w:color w:val="D86DCB" w:themeColor="accent5" w:themeTint="99"/>
-          <w:sz w:val="32"/>
-          <w:szCs w:val="32"/>
-        </w:rPr>
-      </w:pPr>
-      <w:r>
-        <w:rPr>
-          <w:b/>
-          <w:bCs/>
-          <w:color w:val="D86DCB" w:themeColor="accent5" w:themeTint="99"/>
-          <w:sz w:val="32"/>
-          <w:szCs w:val="32"/>
-        </w:rPr>
-        <w:t>d4e5f6g HEAD</w:t>
-      </w:r>
-      <w:proofErr w:type="gramStart"/>
-      <w:r>
-        <w:rPr>
-          <w:b/>
-          <w:bCs/>
-          <w:color w:val="D86DCB" w:themeColor="accent5" w:themeTint="99"/>
-          <w:sz w:val="32"/>
-          <w:szCs w:val="32"/>
-        </w:rPr>
-        <w:t>@{</w:t>
-      </w:r>
-      <w:proofErr w:type="gramEnd"/>
-      <w:r>
-        <w:rPr>
-          <w:b/>
-          <w:bCs/>
-          <w:color w:val="D86DCB" w:themeColor="accent5" w:themeTint="99"/>
-          <w:sz w:val="32"/>
-          <w:szCs w:val="32"/>
-        </w:rPr>
-        <w:t>1}: commit: Add feature</w:t>
-      </w:r>
-    </w:p>
-    <w:p>
-      <w:pPr>
-        <w:jc w:val="both"/>
-        <w:rPr>
-          <w:b/>
-          <w:bCs/>
-          <w:color w:val="D86DCB" w:themeColor="accent5" w:themeTint="99"/>
-          <w:sz w:val="32"/>
-          <w:szCs w:val="32"/>
-        </w:rPr>
-      </w:pPr>
-      <w:r>
-        <w:rPr>
-          <w:b/>
-          <w:bCs/>
-          <w:color w:val="D86DCB" w:themeColor="accent5" w:themeTint="99"/>
-          <w:sz w:val="32"/>
-          <w:szCs w:val="32"/>
-        </w:rPr>
-        <w:t>h7i8j9k HEAD</w:t>
-      </w:r>
-      <w:proofErr w:type="gramStart"/>
-      <w:r>
-        <w:rPr>
-          <w:b/>
-          <w:bCs/>
-          <w:color w:val="D86DCB" w:themeColor="accent5" w:themeTint="99"/>
-          <w:sz w:val="32"/>
-          <w:szCs w:val="32"/>
-        </w:rPr>
-        <w:t>@{</w:t>
-      </w:r>
-      <w:proofErr w:type="gramEnd"/>
-      <w:r>
-        <w:rPr>
-          <w:b/>
-          <w:bCs/>
-          <w:color w:val="D86DCB" w:themeColor="accent5" w:themeTint="99"/>
-          <w:sz w:val="32"/>
-          <w:szCs w:val="32"/>
-        </w:rPr>
-        <w:t>2}: checkout: moving from main to feature</w:t>
-      </w:r>
-    </w:p>
-    <w:p>
-      <w:pPr>
-        <w:jc w:val="both"/>
-        <w:rPr>
-          <w:sz w:val="32"/>
-          <w:szCs w:val="32"/>
-        </w:rPr>
-      </w:pPr>
-      <w:r>
-        <w:rPr>
-          <w:sz w:val="32"/>
-          <w:szCs w:val="32"/>
-        </w:rPr>
-        <w:t xml:space="preserve"># </w:t>
-      </w:r>
-      <w:r>
-        <w:rPr>
-          <w:sz w:val="32"/>
-          <w:szCs w:val="32"/>
-        </w:rPr>
-        <w:t>Restore branch:</w:t>
-      </w:r>
-    </w:p>
-    <w:p>
-      <w:pPr>
-        <w:jc w:val="both"/>
-        <w:rPr>
-          <w:b/>
-          <w:bCs/>
-          <w:color w:val="D86DCB" w:themeColor="accent5" w:themeTint="99"/>
-          <w:sz w:val="32"/>
-          <w:szCs w:val="32"/>
-        </w:rPr>
-      </w:pPr>
-      <w:r>
-        <w:rPr>
-          <w:b/>
-          <w:bCs/>
-          <w:color w:val="D86DCB" w:themeColor="accent5" w:themeTint="99"/>
-          <w:sz w:val="32"/>
-          <w:szCs w:val="32"/>
-        </w:rPr>
-        <w:t xml:space="preserve">git checkout -b </w:t>
-      </w:r>
-      <w:proofErr w:type="spellStart"/>
-      <w:r>
-        <w:rPr>
-          <w:b/>
-          <w:bCs/>
-          <w:color w:val="D86DCB" w:themeColor="accent5" w:themeTint="99"/>
-          <w:sz w:val="32"/>
-          <w:szCs w:val="32"/>
-        </w:rPr>
-        <w:t>recovered_branch</w:t>
-      </w:r>
-      <w:proofErr w:type="spellEnd"/>
-      <w:r>
-        <w:rPr>
-          <w:b/>
-          <w:bCs/>
-          <w:color w:val="D86DCB" w:themeColor="accent5" w:themeTint="99"/>
-          <w:sz w:val="32"/>
-          <w:szCs w:val="32"/>
-        </w:rPr>
-        <w:t xml:space="preserve"> &lt;</w:t>
-      </w:r>
-      <w:proofErr w:type="spellStart"/>
-      <w:r>
-        <w:rPr>
-          <w:b/>
-          <w:bCs/>
-          <w:color w:val="D86DCB" w:themeColor="accent5" w:themeTint="99"/>
-          <w:sz w:val="32"/>
-          <w:szCs w:val="32"/>
-        </w:rPr>
-        <w:t>commit_hash</w:t>
-      </w:r>
-      <w:proofErr w:type="spellEnd"/>
-      <w:r>
-        <w:rPr>
-          <w:b/>
-          <w:bCs/>
-          <w:color w:val="D86DCB" w:themeColor="accent5" w:themeTint="99"/>
-          <w:sz w:val="32"/>
-          <w:szCs w:val="32"/>
-        </w:rPr>
         <w:t>&gt;</w:t>
       </w:r>
     </w:p>
@@ -1329,6 +1605,7 @@
           <w:sz w:val="32"/>
           <w:szCs w:val="32"/>
         </w:rPr>
+        <w:lastRenderedPageBreak/>
         <w:t xml:space="preserve">Super useful if </w:t>
       </w:r>
       <w:r>
@@ -1736,7 +2013,6 @@
                 <w:sz w:val="32"/>
                 <w:szCs w:val="32"/>
               </w:rPr>
-              <w:lastRenderedPageBreak/>
               <w:t>Undo staged changes (un-add)</w:t>
             </w:r>
           </w:p>
@@ -2123,6 +2399,7 @@
           <w:sz w:val="32"/>
           <w:szCs w:val="32"/>
         </w:rPr>
+        <w:lastRenderedPageBreak/>
         <w:t>Board view: visualize tasks as columns (Backlog → In Progress → Done)</w:t>
       </w:r>
     </w:p>
@@ -2198,7 +2475,6 @@
           <w:sz w:val="32"/>
           <w:szCs w:val="32"/>
         </w:rPr>
-        <w:lastRenderedPageBreak/>
         <w:drawing>
           <wp:inline distT="0" distB="0" distL="0" distR="0" wp14:anchorId="0C54EAAE" wp14:editId="21B93E8B">
             <wp:extent cx="5731510" cy="4105275"/>
@@ -2348,6 +2624,7 @@
           <w:sz w:val="32"/>
           <w:szCs w:val="32"/>
         </w:rPr>
+        <w:lastRenderedPageBreak/>
         <w:t># The killer feature, when we close a PR, the linked issue can automatically move to "Done" on our board. Zero manual updating.</w:t>
       </w:r>
     </w:p>
@@ -2405,7 +2682,6 @@
           <w:sz w:val="32"/>
           <w:szCs w:val="32"/>
         </w:rPr>
-        <w:lastRenderedPageBreak/>
         <w:t># Go to our GitHub profile or organization → click "Projects" tab → "New Project". We'll be asked to choose a template:</w:t>
       </w:r>
     </w:p>
@@ -2634,6 +2910,7 @@
           <w:sz w:val="32"/>
           <w:szCs w:val="32"/>
         </w:rPr>
+        <w:lastRenderedPageBreak/>
         <w:t># This is where Projects v2 becomes powerful.</w:t>
       </w:r>
       <w:r>
@@ -2786,7 +3063,6 @@
           <w:sz w:val="32"/>
           <w:szCs w:val="32"/>
         </w:rPr>
-        <w:lastRenderedPageBreak/>
         <w:t>Priority →</w:t>
       </w:r>
       <w:r>
@@ -3237,6 +3513,7 @@
           <w:sz w:val="32"/>
           <w:szCs w:val="32"/>
         </w:rPr>
+        <w:lastRenderedPageBreak/>
         <w:t>Then: Set status to "Backlog"</w:t>
       </w:r>
     </w:p>
@@ -3304,7 +3581,6 @@
           <w:sz w:val="32"/>
           <w:szCs w:val="32"/>
         </w:rPr>
-        <w:lastRenderedPageBreak/>
         <w:t># These are toggle-on automations like one click to enable. No code needed.</w:t>
       </w:r>
     </w:p>
@@ -3635,6 +3911,7 @@
           <w:sz w:val="32"/>
           <w:szCs w:val="32"/>
         </w:rPr>
+        <w:lastRenderedPageBreak/>
         <w:t>fixes #1</w:t>
       </w:r>
     </w:p>
@@ -3715,286 +3992,318 @@
           <w:sz w:val="32"/>
           <w:szCs w:val="32"/>
         </w:rPr>
+        <w:t>resolved #1</w:t>
+      </w:r>
+    </w:p>
+    <w:p>
+      <w:pPr>
+        <w:jc w:val="both"/>
+        <w:rPr>
+          <w:sz w:val="32"/>
+          <w:szCs w:val="32"/>
+        </w:rPr>
+      </w:pPr>
+      <w:r>
+        <w:rPr>
+          <w:sz w:val="32"/>
+          <w:szCs w:val="32"/>
+        </w:rPr>
+        <w:t># Don’t do this. It’s wrong and only closes #1 (issue)</w:t>
+      </w:r>
+    </w:p>
+    <w:p>
+      <w:pPr>
+        <w:jc w:val="both"/>
+        <w:rPr>
+          <w:b/>
+          <w:bCs/>
+          <w:sz w:val="32"/>
+          <w:szCs w:val="32"/>
+        </w:rPr>
+      </w:pPr>
+      <w:r>
+        <w:rPr>
+          <w:b/>
+          <w:bCs/>
+          <w:sz w:val="32"/>
+          <w:szCs w:val="32"/>
+        </w:rPr>
+        <w:t>Closes #1, #2, #3</w:t>
+      </w:r>
+    </w:p>
+    <w:p>
+      <w:pPr>
+        <w:jc w:val="both"/>
+        <w:rPr>
+          <w:sz w:val="32"/>
+          <w:szCs w:val="32"/>
+        </w:rPr>
+      </w:pPr>
+      <w:r>
+        <w:rPr>
+          <w:sz w:val="32"/>
+          <w:szCs w:val="32"/>
+        </w:rPr>
+        <w:t># Right way, closes all three</w:t>
+      </w:r>
+    </w:p>
+    <w:p>
+      <w:pPr>
+        <w:jc w:val="both"/>
+        <w:rPr>
+          <w:b/>
+          <w:bCs/>
+          <w:sz w:val="32"/>
+          <w:szCs w:val="32"/>
+        </w:rPr>
+      </w:pPr>
+      <w:r>
+        <w:rPr>
+          <w:b/>
+          <w:bCs/>
+          <w:sz w:val="32"/>
+          <w:szCs w:val="32"/>
+        </w:rPr>
+        <w:t>Closes #1</w:t>
+      </w:r>
+    </w:p>
+    <w:p>
+      <w:pPr>
+        <w:jc w:val="both"/>
+        <w:rPr>
+          <w:b/>
+          <w:bCs/>
+          <w:sz w:val="32"/>
+          <w:szCs w:val="32"/>
+        </w:rPr>
+      </w:pPr>
+      <w:r>
+        <w:rPr>
+          <w:b/>
+          <w:bCs/>
+          <w:sz w:val="32"/>
+          <w:szCs w:val="32"/>
+        </w:rPr>
+        <w:t>Closes #2</w:t>
+      </w:r>
+    </w:p>
+    <w:p>
+      <w:pPr>
+        <w:jc w:val="both"/>
+        <w:rPr>
+          <w:b/>
+          <w:bCs/>
+          <w:sz w:val="32"/>
+          <w:szCs w:val="32"/>
+        </w:rPr>
+      </w:pPr>
+      <w:r>
+        <w:rPr>
+          <w:b/>
+          <w:bCs/>
+          <w:sz w:val="32"/>
+          <w:szCs w:val="32"/>
+        </w:rPr>
+        <w:t>Closes #3</w:t>
+      </w:r>
+    </w:p>
+    <w:p>
+      <w:pPr>
+        <w:jc w:val="both"/>
+        <w:rPr>
+          <w:sz w:val="32"/>
+          <w:szCs w:val="32"/>
+        </w:rPr>
+      </w:pPr>
+    </w:p>
+    <w:p>
+      <w:pPr>
+        <w:jc w:val="both"/>
+        <w:rPr>
+          <w:sz w:val="32"/>
+          <w:szCs w:val="32"/>
+        </w:rPr>
+      </w:pPr>
+      <w:r>
+        <w:rPr>
+          <w:sz w:val="32"/>
+          <w:szCs w:val="32"/>
+        </w:rPr>
+        <w:t>The Flow in our Board:</w:t>
+      </w:r>
+    </w:p>
+    <w:p>
+      <w:pPr>
+        <w:jc w:val="both"/>
+        <w:rPr>
+          <w:sz w:val="32"/>
+          <w:szCs w:val="32"/>
+        </w:rPr>
+      </w:pPr>
+      <w:r>
+        <w:rPr>
+          <w:sz w:val="32"/>
+          <w:szCs w:val="32"/>
+        </w:rPr>
+        <w:t># Issue</w:t>
+      </w:r>
+      <w:r>
+        <w:rPr>
+          <w:b/>
+          <w:bCs/>
+          <w:sz w:val="32"/>
+          <w:szCs w:val="32"/>
+        </w:rPr>
+        <w:t xml:space="preserve"> #42 </w:t>
+      </w:r>
+      <w:r>
+        <w:rPr>
+          <w:sz w:val="32"/>
+          <w:szCs w:val="32"/>
+        </w:rPr>
+        <w:t xml:space="preserve">starts in </w:t>
+      </w:r>
+      <w:r>
+        <w:rPr>
+          <w:b/>
+          <w:bCs/>
+          <w:sz w:val="32"/>
+          <w:szCs w:val="32"/>
+        </w:rPr>
+        <w:t>Backlog</w:t>
+      </w:r>
+    </w:p>
+    <w:p>
+      <w:pPr>
+        <w:jc w:val="both"/>
+        <w:rPr>
+          <w:b/>
+          <w:bCs/>
+          <w:sz w:val="32"/>
+          <w:szCs w:val="32"/>
+        </w:rPr>
+      </w:pPr>
+      <w:r>
+        <w:rPr>
+          <w:b/>
+          <w:bCs/>
+          <w:sz w:val="32"/>
+          <w:szCs w:val="32"/>
+        </w:rPr>
+        <w:t>→ We start working: manually drag to "In Progress" (or automation on PR open)</w:t>
+      </w:r>
+    </w:p>
+    <w:p>
+      <w:pPr>
+        <w:jc w:val="both"/>
+        <w:rPr>
+          <w:b/>
+          <w:bCs/>
+          <w:sz w:val="32"/>
+          <w:szCs w:val="32"/>
+        </w:rPr>
+      </w:pPr>
+      <w:r>
+        <w:rPr>
+          <w:b/>
+          <w:bCs/>
+          <w:sz w:val="32"/>
+          <w:szCs w:val="32"/>
+        </w:rPr>
+        <w:t>→ PR opened for review: moves to "In Review"</w:t>
+      </w:r>
+    </w:p>
+    <w:p>
+      <w:pPr>
+        <w:jc w:val="both"/>
+        <w:rPr>
+          <w:b/>
+          <w:bCs/>
+          <w:sz w:val="32"/>
+          <w:szCs w:val="32"/>
+        </w:rPr>
+      </w:pPr>
+      <w:r>
+        <w:rPr>
+          <w:b/>
+          <w:bCs/>
+          <w:sz w:val="32"/>
+          <w:szCs w:val="32"/>
+        </w:rPr>
+        <w:t>→ PR merged: automatically → "Done", issue closed</w:t>
+      </w:r>
+    </w:p>
+    <w:p>
+      <w:pPr>
+        <w:jc w:val="both"/>
+        <w:rPr>
+          <w:sz w:val="32"/>
+          <w:szCs w:val="32"/>
+        </w:rPr>
+      </w:pPr>
+    </w:p>
+    <w:p>
+      <w:pPr>
+        <w:jc w:val="both"/>
+        <w:rPr>
+          <w:sz w:val="32"/>
+          <w:szCs w:val="32"/>
+        </w:rPr>
+      </w:pPr>
+      <w:r>
+        <w:rPr>
+          <w:sz w:val="32"/>
+          <w:szCs w:val="32"/>
+        </w:rPr>
+        <w:t>Common Mistakes:</w:t>
+      </w:r>
+    </w:p>
+    <w:p>
+      <w:pPr>
+        <w:jc w:val="both"/>
+        <w:rPr>
+          <w:sz w:val="32"/>
+          <w:szCs w:val="32"/>
+        </w:rPr>
+      </w:pPr>
+      <w:r>
+        <w:rPr>
+          <w:sz w:val="32"/>
+          <w:szCs w:val="32"/>
+        </w:rPr>
+        <w:t xml:space="preserve"># </w:t>
+      </w:r>
+      <w:r>
+        <w:rPr>
+          <w:b/>
+          <w:bCs/>
+          <w:sz w:val="32"/>
+          <w:szCs w:val="32"/>
+        </w:rPr>
+        <w:t>Mistake-1</w:t>
+      </w:r>
+      <w:r>
+        <w:rPr>
+          <w:sz w:val="32"/>
+          <w:szCs w:val="32"/>
+        </w:rPr>
+        <w:t>, Treating it like Trello (manually managing everything). Projects shine when we link issues and PRs. If we're creating "draft notes" instead of real issues, we lose all the automation power.</w:t>
+      </w:r>
+    </w:p>
+    <w:p>
+      <w:pPr>
+        <w:jc w:val="both"/>
+        <w:rPr>
+          <w:sz w:val="32"/>
+          <w:szCs w:val="32"/>
+        </w:rPr>
+      </w:pPr>
+      <w:r>
+        <w:rPr>
+          <w:sz w:val="32"/>
+          <w:szCs w:val="32"/>
+        </w:rPr>
         <w:lastRenderedPageBreak/>
-        <w:t>resolved #1</w:t>
-      </w:r>
-    </w:p>
-    <w:p>
-      <w:pPr>
-        <w:jc w:val="both"/>
-        <w:rPr>
-          <w:sz w:val="32"/>
-          <w:szCs w:val="32"/>
-        </w:rPr>
-      </w:pPr>
-      <w:r>
-        <w:rPr>
-          <w:sz w:val="32"/>
-          <w:szCs w:val="32"/>
-        </w:rPr>
-        <w:t># Don’t do this. It’s wrong and only closes #1 (issue)</w:t>
-      </w:r>
-    </w:p>
-    <w:p>
-      <w:pPr>
-        <w:jc w:val="both"/>
-        <w:rPr>
-          <w:b/>
-          <w:bCs/>
-          <w:sz w:val="32"/>
-          <w:szCs w:val="32"/>
-        </w:rPr>
-      </w:pPr>
-      <w:r>
-        <w:rPr>
-          <w:b/>
-          <w:bCs/>
-          <w:sz w:val="32"/>
-          <w:szCs w:val="32"/>
-        </w:rPr>
-        <w:t>Closes #1, #2, #3</w:t>
-      </w:r>
-    </w:p>
-    <w:p>
-      <w:pPr>
-        <w:jc w:val="both"/>
-        <w:rPr>
-          <w:sz w:val="32"/>
-          <w:szCs w:val="32"/>
-        </w:rPr>
-      </w:pPr>
-      <w:r>
-        <w:rPr>
-          <w:sz w:val="32"/>
-          <w:szCs w:val="32"/>
-        </w:rPr>
-        <w:t># Right way, closes all three</w:t>
-      </w:r>
-    </w:p>
-    <w:p>
-      <w:pPr>
-        <w:jc w:val="both"/>
-        <w:rPr>
-          <w:b/>
-          <w:bCs/>
-          <w:sz w:val="32"/>
-          <w:szCs w:val="32"/>
-        </w:rPr>
-      </w:pPr>
-      <w:r>
-        <w:rPr>
-          <w:b/>
-          <w:bCs/>
-          <w:sz w:val="32"/>
-          <w:szCs w:val="32"/>
-        </w:rPr>
-        <w:t>Closes #1</w:t>
-      </w:r>
-    </w:p>
-    <w:p>
-      <w:pPr>
-        <w:jc w:val="both"/>
-        <w:rPr>
-          <w:b/>
-          <w:bCs/>
-          <w:sz w:val="32"/>
-          <w:szCs w:val="32"/>
-        </w:rPr>
-      </w:pPr>
-      <w:r>
-        <w:rPr>
-          <w:b/>
-          <w:bCs/>
-          <w:sz w:val="32"/>
-          <w:szCs w:val="32"/>
-        </w:rPr>
-        <w:t>Closes #2</w:t>
-      </w:r>
-    </w:p>
-    <w:p>
-      <w:pPr>
-        <w:jc w:val="both"/>
-        <w:rPr>
-          <w:b/>
-          <w:bCs/>
-          <w:sz w:val="32"/>
-          <w:szCs w:val="32"/>
-        </w:rPr>
-      </w:pPr>
-      <w:r>
-        <w:rPr>
-          <w:b/>
-          <w:bCs/>
-          <w:sz w:val="32"/>
-          <w:szCs w:val="32"/>
-        </w:rPr>
-        <w:t>Closes #3</w:t>
-      </w:r>
-    </w:p>
-    <w:p>
-      <w:pPr>
-        <w:jc w:val="both"/>
-        <w:rPr>
-          <w:sz w:val="32"/>
-          <w:szCs w:val="32"/>
-        </w:rPr>
-      </w:pPr>
-    </w:p>
-    <w:p>
-      <w:pPr>
-        <w:jc w:val="both"/>
-        <w:rPr>
-          <w:sz w:val="32"/>
-          <w:szCs w:val="32"/>
-        </w:rPr>
-      </w:pPr>
-      <w:r>
-        <w:rPr>
-          <w:sz w:val="32"/>
-          <w:szCs w:val="32"/>
-        </w:rPr>
-        <w:t>The Flow in our Board:</w:t>
-      </w:r>
-    </w:p>
-    <w:p>
-      <w:pPr>
-        <w:jc w:val="both"/>
-        <w:rPr>
-          <w:sz w:val="32"/>
-          <w:szCs w:val="32"/>
-        </w:rPr>
-      </w:pPr>
-      <w:r>
-        <w:rPr>
-          <w:sz w:val="32"/>
-          <w:szCs w:val="32"/>
-        </w:rPr>
-        <w:t># Issue</w:t>
-      </w:r>
-      <w:r>
-        <w:rPr>
-          <w:b/>
-          <w:bCs/>
-          <w:sz w:val="32"/>
-          <w:szCs w:val="32"/>
-        </w:rPr>
-        <w:t xml:space="preserve"> #42 </w:t>
-      </w:r>
-      <w:r>
-        <w:rPr>
-          <w:sz w:val="32"/>
-          <w:szCs w:val="32"/>
-        </w:rPr>
-        <w:t xml:space="preserve">starts in </w:t>
-      </w:r>
-      <w:r>
-        <w:rPr>
-          <w:b/>
-          <w:bCs/>
-          <w:sz w:val="32"/>
-          <w:szCs w:val="32"/>
-        </w:rPr>
-        <w:t>Backlog</w:t>
-      </w:r>
-    </w:p>
-    <w:p>
-      <w:pPr>
-        <w:jc w:val="both"/>
-        <w:rPr>
-          <w:b/>
-          <w:bCs/>
-          <w:sz w:val="32"/>
-          <w:szCs w:val="32"/>
-        </w:rPr>
-      </w:pPr>
-      <w:r>
-        <w:rPr>
-          <w:b/>
-          <w:bCs/>
-          <w:sz w:val="32"/>
-          <w:szCs w:val="32"/>
-        </w:rPr>
-        <w:t>→ We start working: manually drag to "In Progress" (or automation on PR open)</w:t>
-      </w:r>
-    </w:p>
-    <w:p>
-      <w:pPr>
-        <w:jc w:val="both"/>
-        <w:rPr>
-          <w:b/>
-          <w:bCs/>
-          <w:sz w:val="32"/>
-          <w:szCs w:val="32"/>
-        </w:rPr>
-      </w:pPr>
-      <w:r>
-        <w:rPr>
-          <w:b/>
-          <w:bCs/>
-          <w:sz w:val="32"/>
-          <w:szCs w:val="32"/>
-        </w:rPr>
-        <w:t>→ PR opened for review: moves to "In Review"</w:t>
-      </w:r>
-    </w:p>
-    <w:p>
-      <w:pPr>
-        <w:jc w:val="both"/>
-        <w:rPr>
-          <w:b/>
-          <w:bCs/>
-          <w:sz w:val="32"/>
-          <w:szCs w:val="32"/>
-        </w:rPr>
-      </w:pPr>
-      <w:r>
-        <w:rPr>
-          <w:b/>
-          <w:bCs/>
-          <w:sz w:val="32"/>
-          <w:szCs w:val="32"/>
-        </w:rPr>
-        <w:t>→ PR merged: automatically → "Done", issue closed</w:t>
-      </w:r>
-    </w:p>
-    <w:p>
-      <w:pPr>
-        <w:jc w:val="both"/>
-        <w:rPr>
-          <w:sz w:val="32"/>
-          <w:szCs w:val="32"/>
-        </w:rPr>
-      </w:pPr>
-    </w:p>
-    <w:p>
-      <w:pPr>
-        <w:jc w:val="both"/>
-        <w:rPr>
-          <w:sz w:val="32"/>
-          <w:szCs w:val="32"/>
-        </w:rPr>
-      </w:pPr>
-      <w:r>
-        <w:rPr>
-          <w:sz w:val="32"/>
-          <w:szCs w:val="32"/>
-        </w:rPr>
-        <w:t>Common Mistakes:</w:t>
-      </w:r>
-    </w:p>
-    <w:p>
-      <w:pPr>
-        <w:jc w:val="both"/>
-        <w:rPr>
-          <w:sz w:val="32"/>
-          <w:szCs w:val="32"/>
-        </w:rPr>
-      </w:pPr>
-      <w:r>
-        <w:rPr>
-          <w:sz w:val="32"/>
-          <w:szCs w:val="32"/>
-        </w:rPr>
         <w:t xml:space="preserve"># </w:t>
       </w:r>
       <w:r>
@@ -4004,14 +4313,30 @@
           <w:sz w:val="32"/>
           <w:szCs w:val="32"/>
         </w:rPr>
-        <w:t>Mistake-1</w:t>
-      </w:r>
-      <w:r>
-        <w:rPr>
-          <w:sz w:val="32"/>
-          <w:szCs w:val="32"/>
-        </w:rPr>
-        <w:t>, Treating it like Trello (manually managing everything). Projects shine when we link issues and PRs. If we're creating "draft notes" instead of real issues, we lose all the automation power.</w:t>
+        <w:t>Mistake-2,</w:t>
+      </w:r>
+      <w:r>
+        <w:rPr>
+          <w:sz w:val="32"/>
+          <w:szCs w:val="32"/>
+        </w:rPr>
+        <w:t xml:space="preserve"> Not using the "</w:t>
+      </w:r>
+      <w:r>
+        <w:rPr>
+          <w:b/>
+          <w:bCs/>
+          <w:sz w:val="32"/>
+          <w:szCs w:val="32"/>
+        </w:rPr>
+        <w:t>Closes #N</w:t>
+      </w:r>
+      <w:r>
+        <w:rPr>
+          <w:sz w:val="32"/>
+          <w:szCs w:val="32"/>
+        </w:rPr>
+        <w:t>" keyword in PRs. Most beginners write PRs without linking them to issues. This breaks the automation chain completely.</w:t>
       </w:r>
     </w:p>
     <w:p>
@@ -4036,54 +4361,6 @@
           <w:sz w:val="32"/>
           <w:szCs w:val="32"/>
         </w:rPr>
-        <w:t>Mistake-2,</w:t>
-      </w:r>
-      <w:r>
-        <w:rPr>
-          <w:sz w:val="32"/>
-          <w:szCs w:val="32"/>
-        </w:rPr>
-        <w:t xml:space="preserve"> Not using the "</w:t>
-      </w:r>
-      <w:r>
-        <w:rPr>
-          <w:b/>
-          <w:bCs/>
-          <w:sz w:val="32"/>
-          <w:szCs w:val="32"/>
-        </w:rPr>
-        <w:t>Closes #N</w:t>
-      </w:r>
-      <w:r>
-        <w:rPr>
-          <w:sz w:val="32"/>
-          <w:szCs w:val="32"/>
-        </w:rPr>
-        <w:t>" keyword in PRs. Most beginners write PRs without linking them to issues. This breaks the automation chain completely.</w:t>
-      </w:r>
-    </w:p>
-    <w:p>
-      <w:pPr>
-        <w:jc w:val="both"/>
-        <w:rPr>
-          <w:sz w:val="32"/>
-          <w:szCs w:val="32"/>
-        </w:rPr>
-      </w:pPr>
-      <w:r>
-        <w:rPr>
-          <w:sz w:val="32"/>
-          <w:szCs w:val="32"/>
-        </w:rPr>
-        <w:t xml:space="preserve"># </w:t>
-      </w:r>
-      <w:r>
-        <w:rPr>
-          <w:b/>
-          <w:bCs/>
-          <w:sz w:val="32"/>
-          <w:szCs w:val="32"/>
-        </w:rPr>
         <w:t>Mistake-3</w:t>
       </w:r>
       <w:r>
@@ -4091,15 +4368,7 @@
           <w:sz w:val="32"/>
           <w:szCs w:val="32"/>
         </w:rPr>
-        <w:t xml:space="preserve">, One giant project for everything. Teams with 5+ repos often put ALL work in one board with no filtering. Use views (saved </w:t>
-      </w:r>
-      <w:r>
-        <w:rPr>
-          <w:sz w:val="32"/>
-          <w:szCs w:val="32"/>
-        </w:rPr>
-        <w:lastRenderedPageBreak/>
-        <w:t>filters) inside our project to show only "Flutter issues" or "this sprint's work."</w:t>
+        <w:t>, One giant project for everything. Teams with 5+ repos often put ALL work in one board with no filtering. Use views (saved filters) inside our project to show only "Flutter issues" or "this sprint's work."</w:t>
       </w:r>
     </w:p>
     <w:p>
@@ -4373,6 +4642,7 @@
           <w:sz w:val="32"/>
           <w:szCs w:val="32"/>
         </w:rPr>
+        <w:lastRenderedPageBreak/>
         <w:t xml:space="preserve">Milestones vs Projects, Milestones are for version-based releases (v1.0, v2.0). Projects are for ongoing workflow management. Senior </w:t>
       </w:r>
       <w:proofErr w:type="spellStart"/>
@@ -4445,7 +4715,6 @@
           <w:sz w:val="32"/>
           <w:szCs w:val="32"/>
         </w:rPr>
-        <w:lastRenderedPageBreak/>
         <w:t xml:space="preserve"># Go to repo then </w:t>
       </w:r>
       <w:r>
@@ -4768,6 +5037,7 @@
           <w:sz w:val="32"/>
           <w:szCs w:val="32"/>
         </w:rPr>
+        <w:lastRenderedPageBreak/>
         <w:t xml:space="preserve"># When someone clones our public repository, they also get the </w:t>
       </w:r>
       <w:r>
@@ -4900,7 +5170,6 @@
           <w:sz w:val="32"/>
           <w:szCs w:val="32"/>
         </w:rPr>
-        <w:lastRenderedPageBreak/>
         <w:t xml:space="preserve"># It does not contain our GitHub password, OAuth tokens or SSH private keys. So, when they try to </w:t>
       </w:r>
       <w:r>
@@ -5265,6 +5534,7 @@
           <w:sz w:val="28"/>
           <w:szCs w:val="28"/>
         </w:rPr>
+        <w:lastRenderedPageBreak/>
         <w:t>GitHub Repository</w:t>
       </w:r>
     </w:p>
@@ -5414,7 +5684,6 @@
           <w:sz w:val="28"/>
           <w:szCs w:val="28"/>
         </w:rPr>
-        <w:lastRenderedPageBreak/>
         <w:t xml:space="preserve">        └── Stranger clones it</w:t>
       </w:r>
     </w:p>
@@ -8228,6 +8497,7 @@
   <w:style w:type="character" w:default="1" w:styleId="DefaultParagraphFont">
     <w:name w:val="Default Paragraph Font"/>
     <w:uiPriority w:val="1"/>
+    <w:semiHidden/>
     <w:unhideWhenUsed/>
   </w:style>
   <w:style w:type="table" w:default="1" w:styleId="TableNormal">

</xml_diff>

<commit_message>
Added GitHub branch rules
</commit_message>
<xml_diff>
--- a/git2_and_github_commands_part_two_undoing_and_advanced.docx
+++ b/git2_and_github_commands_part_two_undoing_and_advanced.docx
@@ -24,11 +24,375 @@
     </w:p>
     <w:p>
       <w:pPr>
-        <w:rPr>
-          <w:sz w:val="32"/>
-          <w:szCs w:val="32"/>
-        </w:rPr>
-      </w:pPr>
+        <w:pStyle w:val="ListParagraph"/>
+        <w:numPr>
+          <w:ilvl w:val="0"/>
+          <w:numId w:val="16"/>
+        </w:numPr>
+        <w:rPr>
+          <w:sz w:val="32"/>
+          <w:szCs w:val="32"/>
+        </w:rPr>
+      </w:pPr>
+      <w:r>
+        <w:rPr>
+          <w:sz w:val="32"/>
+          <w:szCs w:val="32"/>
+        </w:rPr>
+        <w:t>Undoing and Fixing Mistakes……………………………………………2</w:t>
+      </w:r>
+    </w:p>
+    <w:p>
+      <w:pPr>
+        <w:pStyle w:val="ListParagraph"/>
+        <w:numPr>
+          <w:ilvl w:val="0"/>
+          <w:numId w:val="16"/>
+        </w:numPr>
+        <w:rPr>
+          <w:sz w:val="32"/>
+          <w:szCs w:val="32"/>
+        </w:rPr>
+      </w:pPr>
+      <w:r>
+        <w:rPr>
+          <w:b/>
+          <w:bCs/>
+          <w:sz w:val="32"/>
+          <w:szCs w:val="32"/>
+        </w:rPr>
+        <w:t>git reset</w:t>
+      </w:r>
+      <w:r>
+        <w:rPr>
+          <w:sz w:val="32"/>
+          <w:szCs w:val="32"/>
+        </w:rPr>
+        <w:t>……………………………………………………………………</w:t>
+      </w:r>
+      <w:proofErr w:type="gramStart"/>
+      <w:r>
+        <w:rPr>
+          <w:sz w:val="32"/>
+          <w:szCs w:val="32"/>
+        </w:rPr>
+        <w:t>…..</w:t>
+      </w:r>
+      <w:proofErr w:type="gramEnd"/>
+      <w:r>
+        <w:rPr>
+          <w:sz w:val="32"/>
+          <w:szCs w:val="32"/>
+        </w:rPr>
+        <w:t>2</w:t>
+      </w:r>
+    </w:p>
+    <w:p>
+      <w:pPr>
+        <w:pStyle w:val="ListParagraph"/>
+        <w:numPr>
+          <w:ilvl w:val="0"/>
+          <w:numId w:val="16"/>
+        </w:numPr>
+        <w:rPr>
+          <w:sz w:val="32"/>
+          <w:szCs w:val="32"/>
+        </w:rPr>
+      </w:pPr>
+      <w:r>
+        <w:rPr>
+          <w:b/>
+          <w:bCs/>
+          <w:sz w:val="32"/>
+          <w:szCs w:val="32"/>
+        </w:rPr>
+        <w:t>git revert</w:t>
+      </w:r>
+      <w:r>
+        <w:rPr>
+          <w:sz w:val="32"/>
+          <w:szCs w:val="32"/>
+        </w:rPr>
+        <w:t>……………………………………………………………………….3</w:t>
+      </w:r>
+    </w:p>
+    <w:p>
+      <w:pPr>
+        <w:pStyle w:val="ListParagraph"/>
+        <w:numPr>
+          <w:ilvl w:val="0"/>
+          <w:numId w:val="16"/>
+        </w:numPr>
+        <w:rPr>
+          <w:sz w:val="32"/>
+          <w:szCs w:val="32"/>
+        </w:rPr>
+      </w:pPr>
+      <w:r>
+        <w:rPr>
+          <w:b/>
+          <w:bCs/>
+          <w:sz w:val="32"/>
+          <w:szCs w:val="32"/>
+        </w:rPr>
+        <w:t>git restore</w:t>
+      </w:r>
+      <w:r>
+        <w:rPr>
+          <w:sz w:val="32"/>
+          <w:szCs w:val="32"/>
+        </w:rPr>
+        <w:t xml:space="preserve"> (New </w:t>
+      </w:r>
+      <w:proofErr w:type="gramStart"/>
+      <w:r>
+        <w:rPr>
+          <w:sz w:val="32"/>
+          <w:szCs w:val="32"/>
+        </w:rPr>
+        <w:t>Command)…</w:t>
+      </w:r>
+      <w:proofErr w:type="gramEnd"/>
+      <w:r>
+        <w:rPr>
+          <w:sz w:val="32"/>
+          <w:szCs w:val="32"/>
+        </w:rPr>
+        <w:t>…………..……………………………..3</w:t>
+      </w:r>
+    </w:p>
+    <w:p>
+      <w:pPr>
+        <w:pStyle w:val="ListParagraph"/>
+        <w:numPr>
+          <w:ilvl w:val="0"/>
+          <w:numId w:val="16"/>
+        </w:numPr>
+        <w:rPr>
+          <w:sz w:val="32"/>
+          <w:szCs w:val="32"/>
+        </w:rPr>
+      </w:pPr>
+      <w:r>
+        <w:rPr>
+          <w:b/>
+          <w:bCs/>
+          <w:sz w:val="32"/>
+          <w:szCs w:val="32"/>
+        </w:rPr>
+        <w:t>git stash</w:t>
+      </w:r>
+      <w:r>
+        <w:rPr>
+          <w:sz w:val="32"/>
+          <w:szCs w:val="32"/>
+        </w:rPr>
+        <w:t>……………………………………………………………………</w:t>
+      </w:r>
+      <w:proofErr w:type="gramStart"/>
+      <w:r>
+        <w:rPr>
+          <w:sz w:val="32"/>
+          <w:szCs w:val="32"/>
+        </w:rPr>
+        <w:t>…..</w:t>
+      </w:r>
+      <w:proofErr w:type="gramEnd"/>
+      <w:r>
+        <w:rPr>
+          <w:sz w:val="32"/>
+          <w:szCs w:val="32"/>
+        </w:rPr>
+        <w:t>4</w:t>
+      </w:r>
+    </w:p>
+    <w:p>
+      <w:pPr>
+        <w:pStyle w:val="ListParagraph"/>
+        <w:numPr>
+          <w:ilvl w:val="0"/>
+          <w:numId w:val="16"/>
+        </w:numPr>
+        <w:rPr>
+          <w:sz w:val="32"/>
+          <w:szCs w:val="32"/>
+        </w:rPr>
+      </w:pPr>
+      <w:r>
+        <w:rPr>
+          <w:b/>
+          <w:bCs/>
+          <w:sz w:val="32"/>
+          <w:szCs w:val="32"/>
+        </w:rPr>
+        <w:t xml:space="preserve">git </w:t>
+      </w:r>
+      <w:proofErr w:type="spellStart"/>
+      <w:r>
+        <w:rPr>
+          <w:b/>
+          <w:bCs/>
+          <w:sz w:val="32"/>
+          <w:szCs w:val="32"/>
+        </w:rPr>
+        <w:t>reflog</w:t>
+      </w:r>
+      <w:proofErr w:type="spellEnd"/>
+      <w:r>
+        <w:rPr>
+          <w:sz w:val="32"/>
+          <w:szCs w:val="32"/>
+        </w:rPr>
+        <w:t>……………………………………………………………………….4</w:t>
+      </w:r>
+    </w:p>
+    <w:p>
+      <w:pPr>
+        <w:pStyle w:val="ListParagraph"/>
+        <w:numPr>
+          <w:ilvl w:val="0"/>
+          <w:numId w:val="16"/>
+        </w:numPr>
+        <w:rPr>
+          <w:sz w:val="32"/>
+          <w:szCs w:val="32"/>
+        </w:rPr>
+      </w:pPr>
+      <w:r>
+        <w:rPr>
+          <w:b/>
+          <w:bCs/>
+          <w:sz w:val="32"/>
+          <w:szCs w:val="32"/>
+        </w:rPr>
+        <w:t>GitHub</w:t>
+      </w:r>
+      <w:r>
+        <w:rPr>
+          <w:sz w:val="32"/>
+          <w:szCs w:val="32"/>
+        </w:rPr>
+        <w:t xml:space="preserve"> Project……………………………………………………………….6</w:t>
+      </w:r>
+    </w:p>
+    <w:p>
+      <w:pPr>
+        <w:pStyle w:val="ListParagraph"/>
+        <w:numPr>
+          <w:ilvl w:val="0"/>
+          <w:numId w:val="16"/>
+        </w:numPr>
+        <w:rPr>
+          <w:sz w:val="32"/>
+          <w:szCs w:val="32"/>
+        </w:rPr>
+      </w:pPr>
+      <w:r>
+        <w:rPr>
+          <w:b/>
+          <w:bCs/>
+          <w:sz w:val="32"/>
+          <w:szCs w:val="32"/>
+        </w:rPr>
+        <w:t>GitHub</w:t>
+      </w:r>
+      <w:r>
+        <w:rPr>
+          <w:sz w:val="32"/>
+          <w:szCs w:val="32"/>
+        </w:rPr>
+        <w:t xml:space="preserve"> Security Alerts………………………………………………</w:t>
+      </w:r>
+      <w:proofErr w:type="gramStart"/>
+      <w:r>
+        <w:rPr>
+          <w:sz w:val="32"/>
+          <w:szCs w:val="32"/>
+        </w:rPr>
+        <w:t>…..</w:t>
+      </w:r>
+      <w:proofErr w:type="gramEnd"/>
+      <w:r>
+        <w:rPr>
+          <w:sz w:val="32"/>
+          <w:szCs w:val="32"/>
+        </w:rPr>
+        <w:t>12</w:t>
+      </w:r>
+    </w:p>
+    <w:p>
+      <w:pPr>
+        <w:pStyle w:val="ListParagraph"/>
+        <w:numPr>
+          <w:ilvl w:val="0"/>
+          <w:numId w:val="16"/>
+        </w:numPr>
+        <w:rPr>
+          <w:sz w:val="32"/>
+          <w:szCs w:val="32"/>
+        </w:rPr>
+      </w:pPr>
+      <w:r>
+        <w:rPr>
+          <w:b/>
+          <w:bCs/>
+          <w:sz w:val="32"/>
+          <w:szCs w:val="32"/>
+        </w:rPr>
+        <w:t xml:space="preserve">Git </w:t>
+      </w:r>
+      <w:r>
+        <w:rPr>
+          <w:sz w:val="32"/>
+          <w:szCs w:val="32"/>
+        </w:rPr>
+        <w:t xml:space="preserve">Security </w:t>
+      </w:r>
+      <w:proofErr w:type="gramStart"/>
+      <w:r>
+        <w:rPr>
+          <w:sz w:val="32"/>
+          <w:szCs w:val="32"/>
+        </w:rPr>
+        <w:t>Concept..</w:t>
+      </w:r>
+      <w:proofErr w:type="gramEnd"/>
+      <w:r>
+        <w:rPr>
+          <w:sz w:val="32"/>
+          <w:szCs w:val="32"/>
+        </w:rPr>
+        <w:t>……………………………………………………13</w:t>
+      </w:r>
+    </w:p>
+    <w:p>
+      <w:pPr>
+        <w:pStyle w:val="ListParagraph"/>
+        <w:numPr>
+          <w:ilvl w:val="0"/>
+          <w:numId w:val="16"/>
+        </w:numPr>
+        <w:rPr>
+          <w:sz w:val="32"/>
+          <w:szCs w:val="32"/>
+        </w:rPr>
+      </w:pPr>
+      <w:r>
+        <w:rPr>
+          <w:b/>
+          <w:bCs/>
+          <w:sz w:val="32"/>
+          <w:szCs w:val="32"/>
+        </w:rPr>
+        <w:t xml:space="preserve">GitHub </w:t>
+      </w:r>
+      <w:r>
+        <w:rPr>
+          <w:sz w:val="32"/>
+          <w:szCs w:val="32"/>
+        </w:rPr>
+        <w:t>Rules……………………………………………………………</w:t>
+      </w:r>
       <w:r>
         <w:rPr>
           <w:sz w:val="32"/>
@@ -148,6 +512,26 @@
         <w:rPr>
           <w:b/>
           <w:bCs/>
+          <w:sz w:val="32"/>
+          <w:szCs w:val="32"/>
+        </w:rPr>
+      </w:pPr>
+      <w:r>
+        <w:rPr>
+          <w:b/>
+          <w:bCs/>
+          <w:sz w:val="32"/>
+          <w:szCs w:val="32"/>
+        </w:rPr>
+        <w:t>git reset:</w:t>
+      </w:r>
+    </w:p>
+    <w:p>
+      <w:pPr>
+        <w:jc w:val="both"/>
+        <w:rPr>
+          <w:b/>
+          <w:bCs/>
           <w:color w:val="D86DCB" w:themeColor="accent5" w:themeTint="99"/>
           <w:sz w:val="32"/>
           <w:szCs w:val="32"/>
@@ -488,10 +872,29 @@
       </w:pPr>
       <w:r>
         <w:rPr>
-          <w:sz w:val="32"/>
-          <w:szCs w:val="32"/>
-        </w:rPr>
-        <w:lastRenderedPageBreak/>
+          <w:b/>
+          <w:bCs/>
+          <w:sz w:val="32"/>
+          <w:szCs w:val="32"/>
+        </w:rPr>
+        <w:t>git revert:</w:t>
+      </w:r>
+    </w:p>
+    <w:p>
+      <w:pPr>
+        <w:jc w:val="both"/>
+        <w:rPr>
+          <w:b/>
+          <w:bCs/>
+          <w:sz w:val="32"/>
+          <w:szCs w:val="32"/>
+        </w:rPr>
+      </w:pPr>
+      <w:r>
+        <w:rPr>
+          <w:sz w:val="32"/>
+          <w:szCs w:val="32"/>
+        </w:rPr>
         <w:t xml:space="preserve"># </w:t>
       </w:r>
       <w:r>
@@ -771,12 +1174,16 @@
       <w:pPr>
         <w:jc w:val="both"/>
         <w:rPr>
-          <w:sz w:val="32"/>
-          <w:szCs w:val="32"/>
-        </w:rPr>
-      </w:pPr>
-      <w:r>
-        <w:rPr>
+          <w:b/>
+          <w:bCs/>
+          <w:sz w:val="32"/>
+          <w:szCs w:val="32"/>
+        </w:rPr>
+      </w:pPr>
+      <w:r>
+        <w:rPr>
+          <w:b/>
+          <w:bCs/>
           <w:sz w:val="32"/>
           <w:szCs w:val="32"/>
         </w:rPr>
@@ -930,12 +1337,16 @@
       <w:pPr>
         <w:jc w:val="both"/>
         <w:rPr>
-          <w:sz w:val="32"/>
-          <w:szCs w:val="32"/>
-        </w:rPr>
-      </w:pPr>
-      <w:r>
-        <w:rPr>
+          <w:b/>
+          <w:bCs/>
+          <w:sz w:val="32"/>
+          <w:szCs w:val="32"/>
+        </w:rPr>
+      </w:pPr>
+      <w:r>
+        <w:rPr>
+          <w:b/>
+          <w:bCs/>
           <w:sz w:val="32"/>
           <w:szCs w:val="32"/>
         </w:rPr>
@@ -955,6 +1366,7 @@
           <w:sz w:val="32"/>
           <w:szCs w:val="32"/>
         </w:rPr>
+        <w:lastRenderedPageBreak/>
         <w:t># Temporarily save work without committing (e.g., switching branches quickly). Save changes:</w:t>
       </w:r>
     </w:p>
@@ -993,36 +1405,554 @@
           <w:sz w:val="32"/>
           <w:szCs w:val="32"/>
         </w:rPr>
+        <w:t># List stashes</w:t>
+      </w:r>
+      <w:r>
+        <w:rPr>
+          <w:sz w:val="32"/>
+          <w:szCs w:val="32"/>
+        </w:rPr>
+        <w:t>. U</w:t>
+      </w:r>
+      <w:r>
+        <w:rPr>
+          <w:sz w:val="32"/>
+          <w:szCs w:val="32"/>
+        </w:rPr>
+        <w:t>sed to view stashes</w:t>
+      </w:r>
+      <w:r>
+        <w:rPr>
+          <w:sz w:val="32"/>
+          <w:szCs w:val="32"/>
+        </w:rPr>
+        <w:t>. See all stashes stored in the box</w:t>
+      </w:r>
+      <w:r>
+        <w:rPr>
+          <w:sz w:val="32"/>
+          <w:szCs w:val="32"/>
+        </w:rPr>
+        <w:t>:</w:t>
+      </w:r>
+    </w:p>
+    <w:p>
+      <w:pPr>
+        <w:jc w:val="both"/>
+        <w:rPr>
+          <w:b/>
+          <w:bCs/>
+          <w:color w:val="D86DCB" w:themeColor="accent5" w:themeTint="99"/>
+          <w:sz w:val="32"/>
+          <w:szCs w:val="32"/>
+        </w:rPr>
+      </w:pPr>
+      <w:r>
+        <w:rPr>
+          <w:b/>
+          <w:bCs/>
+          <w:color w:val="D86DCB" w:themeColor="accent5" w:themeTint="99"/>
+          <w:sz w:val="32"/>
+          <w:szCs w:val="32"/>
+        </w:rPr>
+        <w:t>git stash list</w:t>
+      </w:r>
+    </w:p>
+    <w:p>
+      <w:pPr>
+        <w:jc w:val="both"/>
+        <w:rPr>
+          <w:sz w:val="32"/>
+          <w:szCs w:val="32"/>
+        </w:rPr>
+      </w:pPr>
+      <w:r>
+        <w:rPr>
+          <w:sz w:val="32"/>
+          <w:szCs w:val="32"/>
+        </w:rPr>
+        <w:t># Apply most recent stash:</w:t>
+      </w:r>
+    </w:p>
+    <w:p>
+      <w:pPr>
+        <w:jc w:val="both"/>
+        <w:rPr>
+          <w:b/>
+          <w:bCs/>
+          <w:color w:val="D86DCB" w:themeColor="accent5" w:themeTint="99"/>
+          <w:sz w:val="32"/>
+          <w:szCs w:val="32"/>
+        </w:rPr>
+      </w:pPr>
+      <w:r>
+        <w:rPr>
+          <w:b/>
+          <w:bCs/>
+          <w:color w:val="D86DCB" w:themeColor="accent5" w:themeTint="99"/>
+          <w:sz w:val="32"/>
+          <w:szCs w:val="32"/>
+        </w:rPr>
+        <w:t xml:space="preserve">git stash </w:t>
+      </w:r>
+      <w:proofErr w:type="gramStart"/>
+      <w:r>
+        <w:rPr>
+          <w:b/>
+          <w:bCs/>
+          <w:color w:val="D86DCB" w:themeColor="accent5" w:themeTint="99"/>
+          <w:sz w:val="32"/>
+          <w:szCs w:val="32"/>
+        </w:rPr>
+        <w:t>apply</w:t>
+      </w:r>
+      <w:proofErr w:type="gramEnd"/>
+    </w:p>
+    <w:p>
+      <w:pPr>
+        <w:jc w:val="both"/>
+        <w:rPr>
+          <w:sz w:val="32"/>
+          <w:szCs w:val="32"/>
+        </w:rPr>
+      </w:pPr>
+      <w:r>
+        <w:rPr>
+          <w:sz w:val="32"/>
+          <w:szCs w:val="32"/>
+        </w:rPr>
+        <w:t># Apply &amp; remove:</w:t>
+      </w:r>
+    </w:p>
+    <w:p>
+      <w:pPr>
+        <w:jc w:val="both"/>
+        <w:rPr>
+          <w:b/>
+          <w:bCs/>
+          <w:color w:val="D86DCB" w:themeColor="accent5" w:themeTint="99"/>
+          <w:sz w:val="32"/>
+          <w:szCs w:val="32"/>
+        </w:rPr>
+      </w:pPr>
+      <w:r>
+        <w:rPr>
+          <w:b/>
+          <w:bCs/>
+          <w:color w:val="D86DCB" w:themeColor="accent5" w:themeTint="99"/>
+          <w:sz w:val="32"/>
+          <w:szCs w:val="32"/>
+        </w:rPr>
+        <w:t>git stash pop</w:t>
+      </w:r>
+    </w:p>
+    <w:p>
+      <w:pPr>
+        <w:jc w:val="both"/>
+        <w:rPr>
+          <w:sz w:val="32"/>
+          <w:szCs w:val="32"/>
+        </w:rPr>
+      </w:pPr>
+      <w:r>
+        <w:rPr>
+          <w:sz w:val="32"/>
+          <w:szCs w:val="32"/>
+        </w:rPr>
+        <w:t># Drop a stash:</w:t>
+      </w:r>
+    </w:p>
+    <w:p>
+      <w:pPr>
+        <w:jc w:val="both"/>
+        <w:rPr>
+          <w:b/>
+          <w:bCs/>
+          <w:color w:val="D86DCB" w:themeColor="accent5" w:themeTint="99"/>
+          <w:sz w:val="32"/>
+          <w:szCs w:val="32"/>
+        </w:rPr>
+      </w:pPr>
+      <w:r>
+        <w:rPr>
+          <w:b/>
+          <w:bCs/>
+          <w:color w:val="D86DCB" w:themeColor="accent5" w:themeTint="99"/>
+          <w:sz w:val="32"/>
+          <w:szCs w:val="32"/>
+        </w:rPr>
+        <w:t>git stash drop stash</w:t>
+      </w:r>
+      <w:proofErr w:type="gramStart"/>
+      <w:r>
+        <w:rPr>
+          <w:b/>
+          <w:bCs/>
+          <w:color w:val="D86DCB" w:themeColor="accent5" w:themeTint="99"/>
+          <w:sz w:val="32"/>
+          <w:szCs w:val="32"/>
+        </w:rPr>
+        <w:t>@{</w:t>
+      </w:r>
+      <w:proofErr w:type="gramEnd"/>
+      <w:r>
+        <w:rPr>
+          <w:b/>
+          <w:bCs/>
+          <w:color w:val="D86DCB" w:themeColor="accent5" w:themeTint="99"/>
+          <w:sz w:val="32"/>
+          <w:szCs w:val="32"/>
+        </w:rPr>
+        <w:t>0}</w:t>
+      </w:r>
+    </w:p>
+    <w:p>
+      <w:pPr>
+        <w:jc w:val="both"/>
+        <w:rPr>
+          <w:sz w:val="32"/>
+          <w:szCs w:val="32"/>
+        </w:rPr>
+      </w:pPr>
+      <w:r>
+        <w:rPr>
+          <w:sz w:val="32"/>
+          <w:szCs w:val="32"/>
+        </w:rPr>
+        <w:t># Example workflow:</w:t>
+      </w:r>
+    </w:p>
+    <w:p>
+      <w:pPr>
+        <w:jc w:val="both"/>
+        <w:rPr>
+          <w:sz w:val="32"/>
+          <w:szCs w:val="32"/>
+        </w:rPr>
+      </w:pPr>
+      <w:r>
+        <w:rPr>
+          <w:sz w:val="32"/>
+          <w:szCs w:val="32"/>
+        </w:rPr>
+        <w:t>Editing code → need to pull new changes → stash → pull → apply stash back.</w:t>
+      </w:r>
+    </w:p>
+    <w:p>
+      <w:pPr>
+        <w:jc w:val="both"/>
+        <w:rPr>
+          <w:sz w:val="32"/>
+          <w:szCs w:val="32"/>
+        </w:rPr>
+      </w:pPr>
+    </w:p>
+    <w:p>
+      <w:pPr>
+        <w:jc w:val="both"/>
+        <w:rPr>
+          <w:b/>
+          <w:bCs/>
+          <w:sz w:val="32"/>
+          <w:szCs w:val="32"/>
+        </w:rPr>
+      </w:pPr>
+      <w:r>
+        <w:rPr>
+          <w:b/>
+          <w:bCs/>
+          <w:sz w:val="32"/>
+          <w:szCs w:val="32"/>
+        </w:rPr>
+        <w:t xml:space="preserve">git </w:t>
+      </w:r>
+      <w:proofErr w:type="spellStart"/>
+      <w:r>
+        <w:rPr>
+          <w:b/>
+          <w:bCs/>
+          <w:sz w:val="32"/>
+          <w:szCs w:val="32"/>
+        </w:rPr>
+        <w:t>reflog</w:t>
+      </w:r>
+      <w:proofErr w:type="spellEnd"/>
+      <w:r>
+        <w:rPr>
+          <w:b/>
+          <w:bCs/>
+          <w:sz w:val="32"/>
+          <w:szCs w:val="32"/>
+        </w:rPr>
+        <w:t xml:space="preserve"> (</w:t>
+      </w:r>
+      <w:r>
+        <w:rPr>
+          <w:b/>
+          <w:bCs/>
+          <w:sz w:val="32"/>
+          <w:szCs w:val="32"/>
+        </w:rPr>
+        <w:t>Recover Deleted Branches &amp; Commits):</w:t>
+      </w:r>
+    </w:p>
+    <w:p>
+      <w:pPr>
+        <w:jc w:val="both"/>
+        <w:rPr>
+          <w:sz w:val="32"/>
+          <w:szCs w:val="32"/>
+        </w:rPr>
+      </w:pPr>
+      <w:r>
+        <w:rPr>
+          <w:sz w:val="32"/>
+          <w:szCs w:val="32"/>
+        </w:rPr>
+        <w:t># Even if we delete commits or branches, Git usually remembers them in its log.</w:t>
+      </w:r>
+      <w:r>
+        <w:rPr>
+          <w:sz w:val="32"/>
+          <w:szCs w:val="32"/>
+        </w:rPr>
+        <w:t xml:space="preserve"> </w:t>
+      </w:r>
+      <w:r>
+        <w:rPr>
+          <w:sz w:val="32"/>
+          <w:szCs w:val="32"/>
+        </w:rPr>
+        <w:t xml:space="preserve">View </w:t>
+      </w:r>
+      <w:proofErr w:type="spellStart"/>
+      <w:r>
+        <w:rPr>
+          <w:sz w:val="32"/>
+          <w:szCs w:val="32"/>
+        </w:rPr>
+        <w:t>reflog</w:t>
+      </w:r>
+      <w:proofErr w:type="spellEnd"/>
+      <w:r>
+        <w:rPr>
+          <w:sz w:val="32"/>
+          <w:szCs w:val="32"/>
+        </w:rPr>
+        <w:t>:</w:t>
+      </w:r>
+    </w:p>
+    <w:p>
+      <w:pPr>
+        <w:jc w:val="both"/>
+        <w:rPr>
+          <w:b/>
+          <w:bCs/>
+          <w:color w:val="D86DCB" w:themeColor="accent5" w:themeTint="99"/>
+          <w:sz w:val="32"/>
+          <w:szCs w:val="32"/>
+        </w:rPr>
+      </w:pPr>
+      <w:r>
+        <w:rPr>
+          <w:b/>
+          <w:bCs/>
+          <w:color w:val="D86DCB" w:themeColor="accent5" w:themeTint="99"/>
+          <w:sz w:val="32"/>
+          <w:szCs w:val="32"/>
+        </w:rPr>
+        <w:t xml:space="preserve">git </w:t>
+      </w:r>
+      <w:proofErr w:type="spellStart"/>
+      <w:r>
+        <w:rPr>
+          <w:b/>
+          <w:bCs/>
+          <w:color w:val="D86DCB" w:themeColor="accent5" w:themeTint="99"/>
+          <w:sz w:val="32"/>
+          <w:szCs w:val="32"/>
+        </w:rPr>
+        <w:t>reflog</w:t>
+      </w:r>
+      <w:proofErr w:type="spellEnd"/>
+    </w:p>
+    <w:p>
+      <w:pPr>
+        <w:jc w:val="both"/>
+        <w:rPr>
+          <w:sz w:val="32"/>
+          <w:szCs w:val="32"/>
+        </w:rPr>
+      </w:pPr>
+      <w:r>
+        <w:rPr>
+          <w:sz w:val="32"/>
+          <w:szCs w:val="32"/>
+        </w:rPr>
+        <w:t xml:space="preserve"># </w:t>
+      </w:r>
+      <w:r>
+        <w:rPr>
+          <w:sz w:val="32"/>
+          <w:szCs w:val="32"/>
+        </w:rPr>
+        <w:t>Output example:</w:t>
+      </w:r>
+    </w:p>
+    <w:p>
+      <w:pPr>
+        <w:jc w:val="both"/>
+        <w:rPr>
+          <w:b/>
+          <w:bCs/>
+          <w:color w:val="D86DCB" w:themeColor="accent5" w:themeTint="99"/>
+          <w:sz w:val="32"/>
+          <w:szCs w:val="32"/>
+        </w:rPr>
+      </w:pPr>
+      <w:r>
+        <w:rPr>
+          <w:b/>
+          <w:bCs/>
+          <w:color w:val="D86DCB" w:themeColor="accent5" w:themeTint="99"/>
+          <w:sz w:val="32"/>
+          <w:szCs w:val="32"/>
+        </w:rPr>
+        <w:t>a1b2c3d HEAD</w:t>
+      </w:r>
+      <w:proofErr w:type="gramStart"/>
+      <w:r>
+        <w:rPr>
+          <w:b/>
+          <w:bCs/>
+          <w:color w:val="D86DCB" w:themeColor="accent5" w:themeTint="99"/>
+          <w:sz w:val="32"/>
+          <w:szCs w:val="32"/>
+        </w:rPr>
+        <w:t>@{</w:t>
+      </w:r>
+      <w:proofErr w:type="gramEnd"/>
+      <w:r>
+        <w:rPr>
+          <w:b/>
+          <w:bCs/>
+          <w:color w:val="D86DCB" w:themeColor="accent5" w:themeTint="99"/>
+          <w:sz w:val="32"/>
+          <w:szCs w:val="32"/>
+        </w:rPr>
+        <w:t>0}: commit: Fix bug</w:t>
+      </w:r>
+    </w:p>
+    <w:p>
+      <w:pPr>
+        <w:jc w:val="both"/>
+        <w:rPr>
+          <w:b/>
+          <w:bCs/>
+          <w:color w:val="D86DCB" w:themeColor="accent5" w:themeTint="99"/>
+          <w:sz w:val="32"/>
+          <w:szCs w:val="32"/>
+        </w:rPr>
+      </w:pPr>
+      <w:r>
+        <w:rPr>
+          <w:b/>
+          <w:bCs/>
+          <w:color w:val="D86DCB" w:themeColor="accent5" w:themeTint="99"/>
+          <w:sz w:val="32"/>
+          <w:szCs w:val="32"/>
+        </w:rPr>
+        <w:t>d4e5f6g HEAD</w:t>
+      </w:r>
+      <w:proofErr w:type="gramStart"/>
+      <w:r>
+        <w:rPr>
+          <w:b/>
+          <w:bCs/>
+          <w:color w:val="D86DCB" w:themeColor="accent5" w:themeTint="99"/>
+          <w:sz w:val="32"/>
+          <w:szCs w:val="32"/>
+        </w:rPr>
+        <w:t>@{</w:t>
+      </w:r>
+      <w:proofErr w:type="gramEnd"/>
+      <w:r>
+        <w:rPr>
+          <w:b/>
+          <w:bCs/>
+          <w:color w:val="D86DCB" w:themeColor="accent5" w:themeTint="99"/>
+          <w:sz w:val="32"/>
+          <w:szCs w:val="32"/>
+        </w:rPr>
+        <w:t>1}: commit: Add feature</w:t>
+      </w:r>
+    </w:p>
+    <w:p>
+      <w:pPr>
+        <w:jc w:val="both"/>
+        <w:rPr>
+          <w:b/>
+          <w:bCs/>
+          <w:color w:val="D86DCB" w:themeColor="accent5" w:themeTint="99"/>
+          <w:sz w:val="32"/>
+          <w:szCs w:val="32"/>
+        </w:rPr>
+      </w:pPr>
+      <w:r>
+        <w:rPr>
+          <w:b/>
+          <w:bCs/>
+          <w:color w:val="D86DCB" w:themeColor="accent5" w:themeTint="99"/>
+          <w:sz w:val="32"/>
+          <w:szCs w:val="32"/>
+        </w:rPr>
+        <w:t>h7i8j9k HEAD</w:t>
+      </w:r>
+      <w:proofErr w:type="gramStart"/>
+      <w:r>
+        <w:rPr>
+          <w:b/>
+          <w:bCs/>
+          <w:color w:val="D86DCB" w:themeColor="accent5" w:themeTint="99"/>
+          <w:sz w:val="32"/>
+          <w:szCs w:val="32"/>
+        </w:rPr>
+        <w:t>@{</w:t>
+      </w:r>
+      <w:proofErr w:type="gramEnd"/>
+      <w:r>
+        <w:rPr>
+          <w:b/>
+          <w:bCs/>
+          <w:color w:val="D86DCB" w:themeColor="accent5" w:themeTint="99"/>
+          <w:sz w:val="32"/>
+          <w:szCs w:val="32"/>
+        </w:rPr>
+        <w:t>2}: checkout: moving from main to feature</w:t>
+      </w:r>
+    </w:p>
+    <w:p>
+      <w:pPr>
+        <w:jc w:val="both"/>
+        <w:rPr>
+          <w:sz w:val="32"/>
+          <w:szCs w:val="32"/>
+        </w:rPr>
+      </w:pPr>
+      <w:r>
+        <w:rPr>
+          <w:sz w:val="32"/>
+          <w:szCs w:val="32"/>
+        </w:rPr>
         <w:lastRenderedPageBreak/>
-        <w:t># List stashes</w:t>
-      </w:r>
-      <w:r>
-        <w:rPr>
-          <w:sz w:val="32"/>
-          <w:szCs w:val="32"/>
-        </w:rPr>
-        <w:t>. U</w:t>
-      </w:r>
-      <w:r>
-        <w:rPr>
-          <w:sz w:val="32"/>
-          <w:szCs w:val="32"/>
-        </w:rPr>
-        <w:t>sed to view stashes</w:t>
-      </w:r>
-      <w:r>
-        <w:rPr>
-          <w:sz w:val="32"/>
-          <w:szCs w:val="32"/>
-        </w:rPr>
-        <w:t>. See all stashes stored in the box</w:t>
-      </w:r>
-      <w:r>
-        <w:rPr>
-          <w:sz w:val="32"/>
-          <w:szCs w:val="32"/>
-        </w:rPr>
-        <w:t>:</w:t>
+        <w:t xml:space="preserve"># </w:t>
+      </w:r>
+      <w:r>
+        <w:rPr>
+          <w:sz w:val="32"/>
+          <w:szCs w:val="32"/>
+        </w:rPr>
+        <w:t>Restore branch:</w:t>
       </w:r>
     </w:p>
     <w:p>
@@ -1044,28 +1974,10 @@
           <w:sz w:val="32"/>
           <w:szCs w:val="32"/>
         </w:rPr>
-        <w:t>git stash list</w:t>
-      </w:r>
-    </w:p>
-    <w:p>
-      <w:pPr>
-        <w:jc w:val="both"/>
-        <w:rPr>
-          <w:sz w:val="32"/>
-          <w:szCs w:val="32"/>
-        </w:rPr>
-      </w:pPr>
-      <w:r>
-        <w:rPr>
-          <w:sz w:val="32"/>
-          <w:szCs w:val="32"/>
-        </w:rPr>
-        <w:t># Apply most recent stash:</w:t>
-      </w:r>
-    </w:p>
-    <w:p>
-      <w:pPr>
-        <w:jc w:val="both"/>
+        <w:t xml:space="preserve">git checkout -b </w:t>
+      </w:r>
+      <w:proofErr w:type="spellStart"/>
+      <w:r>
         <w:rPr>
           <w:b/>
           <w:bCs/>
@@ -1073,7 +1985,9 @@
           <w:sz w:val="32"/>
           <w:szCs w:val="32"/>
         </w:rPr>
-      </w:pPr>
+        <w:t>recovered_branch</w:t>
+      </w:r>
+      <w:proofErr w:type="spellEnd"/>
       <w:r>
         <w:rPr>
           <w:b/>
@@ -1082,9 +1996,9 @@
           <w:sz w:val="32"/>
           <w:szCs w:val="32"/>
         </w:rPr>
-        <w:t xml:space="preserve">git stash </w:t>
-      </w:r>
-      <w:proofErr w:type="gramStart"/>
+        <w:t xml:space="preserve"> &lt;</w:t>
+      </w:r>
+      <w:proofErr w:type="spellStart"/>
       <w:r>
         <w:rPr>
           <w:b/>
@@ -1093,29 +2007,10 @@
           <w:sz w:val="32"/>
           <w:szCs w:val="32"/>
         </w:rPr>
-        <w:t>apply</w:t>
-      </w:r>
-      <w:proofErr w:type="gramEnd"/>
-    </w:p>
-    <w:p>
-      <w:pPr>
-        <w:jc w:val="both"/>
-        <w:rPr>
-          <w:sz w:val="32"/>
-          <w:szCs w:val="32"/>
-        </w:rPr>
-      </w:pPr>
-      <w:r>
-        <w:rPr>
-          <w:sz w:val="32"/>
-          <w:szCs w:val="32"/>
-        </w:rPr>
-        <w:t># Apply &amp; remove:</w:t>
-      </w:r>
-    </w:p>
-    <w:p>
-      <w:pPr>
-        <w:jc w:val="both"/>
+        <w:t>commit_hash</w:t>
+      </w:r>
+      <w:proofErr w:type="spellEnd"/>
+      <w:r>
         <w:rPr>
           <w:b/>
           <w:bCs/>
@@ -1123,472 +2018,6 @@
           <w:sz w:val="32"/>
           <w:szCs w:val="32"/>
         </w:rPr>
-      </w:pPr>
-      <w:r>
-        <w:rPr>
-          <w:b/>
-          <w:bCs/>
-          <w:color w:val="D86DCB" w:themeColor="accent5" w:themeTint="99"/>
-          <w:sz w:val="32"/>
-          <w:szCs w:val="32"/>
-        </w:rPr>
-        <w:t>git stash pop</w:t>
-      </w:r>
-    </w:p>
-    <w:p>
-      <w:pPr>
-        <w:jc w:val="both"/>
-        <w:rPr>
-          <w:sz w:val="32"/>
-          <w:szCs w:val="32"/>
-        </w:rPr>
-      </w:pPr>
-      <w:r>
-        <w:rPr>
-          <w:sz w:val="32"/>
-          <w:szCs w:val="32"/>
-        </w:rPr>
-        <w:t># Drop a stash:</w:t>
-      </w:r>
-    </w:p>
-    <w:p>
-      <w:pPr>
-        <w:jc w:val="both"/>
-        <w:rPr>
-          <w:b/>
-          <w:bCs/>
-          <w:color w:val="D86DCB" w:themeColor="accent5" w:themeTint="99"/>
-          <w:sz w:val="32"/>
-          <w:szCs w:val="32"/>
-        </w:rPr>
-      </w:pPr>
-      <w:r>
-        <w:rPr>
-          <w:b/>
-          <w:bCs/>
-          <w:color w:val="D86DCB" w:themeColor="accent5" w:themeTint="99"/>
-          <w:sz w:val="32"/>
-          <w:szCs w:val="32"/>
-        </w:rPr>
-        <w:t>git stash drop stash</w:t>
-      </w:r>
-      <w:proofErr w:type="gramStart"/>
-      <w:r>
-        <w:rPr>
-          <w:b/>
-          <w:bCs/>
-          <w:color w:val="D86DCB" w:themeColor="accent5" w:themeTint="99"/>
-          <w:sz w:val="32"/>
-          <w:szCs w:val="32"/>
-        </w:rPr>
-        <w:t>@{</w:t>
-      </w:r>
-      <w:proofErr w:type="gramEnd"/>
-      <w:r>
-        <w:rPr>
-          <w:b/>
-          <w:bCs/>
-          <w:color w:val="D86DCB" w:themeColor="accent5" w:themeTint="99"/>
-          <w:sz w:val="32"/>
-          <w:szCs w:val="32"/>
-        </w:rPr>
-        <w:t>0}</w:t>
-      </w:r>
-    </w:p>
-    <w:p>
-      <w:pPr>
-        <w:jc w:val="both"/>
-        <w:rPr>
-          <w:sz w:val="32"/>
-          <w:szCs w:val="32"/>
-        </w:rPr>
-      </w:pPr>
-      <w:r>
-        <w:rPr>
-          <w:sz w:val="32"/>
-          <w:szCs w:val="32"/>
-        </w:rPr>
-        <w:t># Example workflow:</w:t>
-      </w:r>
-    </w:p>
-    <w:p>
-      <w:pPr>
-        <w:jc w:val="both"/>
-        <w:rPr>
-          <w:sz w:val="32"/>
-          <w:szCs w:val="32"/>
-        </w:rPr>
-      </w:pPr>
-      <w:r>
-        <w:rPr>
-          <w:sz w:val="32"/>
-          <w:szCs w:val="32"/>
-        </w:rPr>
-        <w:t>Editing code → need to pull new changes → stash → pull → apply stash back.</w:t>
-      </w:r>
-    </w:p>
-    <w:p>
-      <w:pPr>
-        <w:jc w:val="both"/>
-        <w:rPr>
-          <w:sz w:val="32"/>
-          <w:szCs w:val="32"/>
-        </w:rPr>
-      </w:pPr>
-    </w:p>
-    <w:p>
-      <w:pPr>
-        <w:jc w:val="both"/>
-        <w:rPr>
-          <w:sz w:val="32"/>
-          <w:szCs w:val="32"/>
-        </w:rPr>
-      </w:pPr>
-      <w:r>
-        <w:rPr>
-          <w:sz w:val="32"/>
-          <w:szCs w:val="32"/>
-        </w:rPr>
-        <w:t xml:space="preserve">Recover Deleted Branches &amp; Commits (git </w:t>
-      </w:r>
-      <w:proofErr w:type="spellStart"/>
-      <w:r>
-        <w:rPr>
-          <w:sz w:val="32"/>
-          <w:szCs w:val="32"/>
-        </w:rPr>
-        <w:t>reflog</w:t>
-      </w:r>
-      <w:proofErr w:type="spellEnd"/>
-      <w:r>
-        <w:rPr>
-          <w:sz w:val="32"/>
-          <w:szCs w:val="32"/>
-        </w:rPr>
-        <w:t>):</w:t>
-      </w:r>
-    </w:p>
-    <w:p>
-      <w:pPr>
-        <w:jc w:val="both"/>
-        <w:rPr>
-          <w:sz w:val="32"/>
-          <w:szCs w:val="32"/>
-        </w:rPr>
-      </w:pPr>
-      <w:r>
-        <w:rPr>
-          <w:sz w:val="32"/>
-          <w:szCs w:val="32"/>
-        </w:rPr>
-        <w:t># Even if we delete commits or branches, Git usually remembers them in its log.</w:t>
-      </w:r>
-      <w:r>
-        <w:rPr>
-          <w:sz w:val="32"/>
-          <w:szCs w:val="32"/>
-        </w:rPr>
-        <w:t xml:space="preserve"> </w:t>
-      </w:r>
-      <w:r>
-        <w:rPr>
-          <w:sz w:val="32"/>
-          <w:szCs w:val="32"/>
-        </w:rPr>
-        <w:t xml:space="preserve">View </w:t>
-      </w:r>
-      <w:proofErr w:type="spellStart"/>
-      <w:r>
-        <w:rPr>
-          <w:sz w:val="32"/>
-          <w:szCs w:val="32"/>
-        </w:rPr>
-        <w:t>reflog</w:t>
-      </w:r>
-      <w:proofErr w:type="spellEnd"/>
-      <w:r>
-        <w:rPr>
-          <w:sz w:val="32"/>
-          <w:szCs w:val="32"/>
-        </w:rPr>
-        <w:t>:</w:t>
-      </w:r>
-    </w:p>
-    <w:p>
-      <w:pPr>
-        <w:jc w:val="both"/>
-        <w:rPr>
-          <w:b/>
-          <w:bCs/>
-          <w:color w:val="D86DCB" w:themeColor="accent5" w:themeTint="99"/>
-          <w:sz w:val="32"/>
-          <w:szCs w:val="32"/>
-        </w:rPr>
-      </w:pPr>
-      <w:r>
-        <w:rPr>
-          <w:b/>
-          <w:bCs/>
-          <w:color w:val="D86DCB" w:themeColor="accent5" w:themeTint="99"/>
-          <w:sz w:val="32"/>
-          <w:szCs w:val="32"/>
-        </w:rPr>
-        <w:t xml:space="preserve">git </w:t>
-      </w:r>
-      <w:proofErr w:type="spellStart"/>
-      <w:r>
-        <w:rPr>
-          <w:b/>
-          <w:bCs/>
-          <w:color w:val="D86DCB" w:themeColor="accent5" w:themeTint="99"/>
-          <w:sz w:val="32"/>
-          <w:szCs w:val="32"/>
-        </w:rPr>
-        <w:t>reflog</w:t>
-      </w:r>
-      <w:proofErr w:type="spellEnd"/>
-    </w:p>
-    <w:p>
-      <w:pPr>
-        <w:jc w:val="both"/>
-        <w:rPr>
-          <w:sz w:val="32"/>
-          <w:szCs w:val="32"/>
-        </w:rPr>
-      </w:pPr>
-      <w:r>
-        <w:rPr>
-          <w:sz w:val="32"/>
-          <w:szCs w:val="32"/>
-        </w:rPr>
-        <w:t xml:space="preserve"># </w:t>
-      </w:r>
-      <w:r>
-        <w:rPr>
-          <w:sz w:val="32"/>
-          <w:szCs w:val="32"/>
-        </w:rPr>
-        <w:t>Output example:</w:t>
-      </w:r>
-    </w:p>
-    <w:p>
-      <w:pPr>
-        <w:jc w:val="both"/>
-        <w:rPr>
-          <w:b/>
-          <w:bCs/>
-          <w:color w:val="D86DCB" w:themeColor="accent5" w:themeTint="99"/>
-          <w:sz w:val="32"/>
-          <w:szCs w:val="32"/>
-        </w:rPr>
-      </w:pPr>
-      <w:r>
-        <w:rPr>
-          <w:b/>
-          <w:bCs/>
-          <w:color w:val="D86DCB" w:themeColor="accent5" w:themeTint="99"/>
-          <w:sz w:val="32"/>
-          <w:szCs w:val="32"/>
-        </w:rPr>
-        <w:t>a1b2c3d HEAD</w:t>
-      </w:r>
-      <w:proofErr w:type="gramStart"/>
-      <w:r>
-        <w:rPr>
-          <w:b/>
-          <w:bCs/>
-          <w:color w:val="D86DCB" w:themeColor="accent5" w:themeTint="99"/>
-          <w:sz w:val="32"/>
-          <w:szCs w:val="32"/>
-        </w:rPr>
-        <w:t>@{</w:t>
-      </w:r>
-      <w:proofErr w:type="gramEnd"/>
-      <w:r>
-        <w:rPr>
-          <w:b/>
-          <w:bCs/>
-          <w:color w:val="D86DCB" w:themeColor="accent5" w:themeTint="99"/>
-          <w:sz w:val="32"/>
-          <w:szCs w:val="32"/>
-        </w:rPr>
-        <w:t>0}: commit: Fix bug</w:t>
-      </w:r>
-    </w:p>
-    <w:p>
-      <w:pPr>
-        <w:jc w:val="both"/>
-        <w:rPr>
-          <w:b/>
-          <w:bCs/>
-          <w:color w:val="D86DCB" w:themeColor="accent5" w:themeTint="99"/>
-          <w:sz w:val="32"/>
-          <w:szCs w:val="32"/>
-        </w:rPr>
-      </w:pPr>
-      <w:r>
-        <w:rPr>
-          <w:b/>
-          <w:bCs/>
-          <w:color w:val="D86DCB" w:themeColor="accent5" w:themeTint="99"/>
-          <w:sz w:val="32"/>
-          <w:szCs w:val="32"/>
-        </w:rPr>
-        <w:t>d4e5f6g HEAD</w:t>
-      </w:r>
-      <w:proofErr w:type="gramStart"/>
-      <w:r>
-        <w:rPr>
-          <w:b/>
-          <w:bCs/>
-          <w:color w:val="D86DCB" w:themeColor="accent5" w:themeTint="99"/>
-          <w:sz w:val="32"/>
-          <w:szCs w:val="32"/>
-        </w:rPr>
-        <w:t>@{</w:t>
-      </w:r>
-      <w:proofErr w:type="gramEnd"/>
-      <w:r>
-        <w:rPr>
-          <w:b/>
-          <w:bCs/>
-          <w:color w:val="D86DCB" w:themeColor="accent5" w:themeTint="99"/>
-          <w:sz w:val="32"/>
-          <w:szCs w:val="32"/>
-        </w:rPr>
-        <w:t>1}: commit: Add feature</w:t>
-      </w:r>
-    </w:p>
-    <w:p>
-      <w:pPr>
-        <w:jc w:val="both"/>
-        <w:rPr>
-          <w:b/>
-          <w:bCs/>
-          <w:color w:val="D86DCB" w:themeColor="accent5" w:themeTint="99"/>
-          <w:sz w:val="32"/>
-          <w:szCs w:val="32"/>
-        </w:rPr>
-      </w:pPr>
-      <w:r>
-        <w:rPr>
-          <w:b/>
-          <w:bCs/>
-          <w:color w:val="D86DCB" w:themeColor="accent5" w:themeTint="99"/>
-          <w:sz w:val="32"/>
-          <w:szCs w:val="32"/>
-        </w:rPr>
-        <w:t>h7i8j9k HEAD</w:t>
-      </w:r>
-      <w:proofErr w:type="gramStart"/>
-      <w:r>
-        <w:rPr>
-          <w:b/>
-          <w:bCs/>
-          <w:color w:val="D86DCB" w:themeColor="accent5" w:themeTint="99"/>
-          <w:sz w:val="32"/>
-          <w:szCs w:val="32"/>
-        </w:rPr>
-        <w:t>@{</w:t>
-      </w:r>
-      <w:proofErr w:type="gramEnd"/>
-      <w:r>
-        <w:rPr>
-          <w:b/>
-          <w:bCs/>
-          <w:color w:val="D86DCB" w:themeColor="accent5" w:themeTint="99"/>
-          <w:sz w:val="32"/>
-          <w:szCs w:val="32"/>
-        </w:rPr>
-        <w:t>2}: checkout: moving from main to feature</w:t>
-      </w:r>
-    </w:p>
-    <w:p>
-      <w:pPr>
-        <w:jc w:val="both"/>
-        <w:rPr>
-          <w:sz w:val="32"/>
-          <w:szCs w:val="32"/>
-        </w:rPr>
-      </w:pPr>
-      <w:r>
-        <w:rPr>
-          <w:sz w:val="32"/>
-          <w:szCs w:val="32"/>
-        </w:rPr>
-        <w:t xml:space="preserve"># </w:t>
-      </w:r>
-      <w:r>
-        <w:rPr>
-          <w:sz w:val="32"/>
-          <w:szCs w:val="32"/>
-        </w:rPr>
-        <w:t>Restore branch:</w:t>
-      </w:r>
-    </w:p>
-    <w:p>
-      <w:pPr>
-        <w:jc w:val="both"/>
-        <w:rPr>
-          <w:b/>
-          <w:bCs/>
-          <w:color w:val="D86DCB" w:themeColor="accent5" w:themeTint="99"/>
-          <w:sz w:val="32"/>
-          <w:szCs w:val="32"/>
-        </w:rPr>
-      </w:pPr>
-      <w:r>
-        <w:rPr>
-          <w:b/>
-          <w:bCs/>
-          <w:color w:val="D86DCB" w:themeColor="accent5" w:themeTint="99"/>
-          <w:sz w:val="32"/>
-          <w:szCs w:val="32"/>
-        </w:rPr>
-        <w:t xml:space="preserve">git checkout -b </w:t>
-      </w:r>
-      <w:proofErr w:type="spellStart"/>
-      <w:r>
-        <w:rPr>
-          <w:b/>
-          <w:bCs/>
-          <w:color w:val="D86DCB" w:themeColor="accent5" w:themeTint="99"/>
-          <w:sz w:val="32"/>
-          <w:szCs w:val="32"/>
-        </w:rPr>
-        <w:t>recovered_branch</w:t>
-      </w:r>
-      <w:proofErr w:type="spellEnd"/>
-      <w:r>
-        <w:rPr>
-          <w:b/>
-          <w:bCs/>
-          <w:color w:val="D86DCB" w:themeColor="accent5" w:themeTint="99"/>
-          <w:sz w:val="32"/>
-          <w:szCs w:val="32"/>
-        </w:rPr>
-        <w:t xml:space="preserve"> &lt;</w:t>
-      </w:r>
-      <w:proofErr w:type="spellStart"/>
-      <w:r>
-        <w:rPr>
-          <w:b/>
-          <w:bCs/>
-          <w:color w:val="D86DCB" w:themeColor="accent5" w:themeTint="99"/>
-          <w:sz w:val="32"/>
-          <w:szCs w:val="32"/>
-        </w:rPr>
-        <w:t>commit_hash</w:t>
-      </w:r>
-      <w:proofErr w:type="spellEnd"/>
-      <w:r>
-        <w:rPr>
-          <w:b/>
-          <w:bCs/>
-          <w:color w:val="D86DCB" w:themeColor="accent5" w:themeTint="99"/>
-          <w:sz w:val="32"/>
-          <w:szCs w:val="32"/>
-        </w:rPr>
         <w:t>&gt;</w:t>
       </w:r>
     </w:p>
@@ -1605,7 +2034,6 @@
           <w:sz w:val="32"/>
           <w:szCs w:val="32"/>
         </w:rPr>
-        <w:lastRenderedPageBreak/>
         <w:t xml:space="preserve">Super useful if </w:t>
       </w:r>
       <w:r>
@@ -2253,19 +2681,63 @@
       <w:pPr>
         <w:jc w:val="both"/>
         <w:rPr>
-          <w:b/>
-          <w:bCs/>
-          <w:sz w:val="32"/>
-          <w:szCs w:val="32"/>
-        </w:rPr>
-      </w:pPr>
-      <w:r>
-        <w:rPr>
-          <w:b/>
-          <w:bCs/>
-          <w:sz w:val="32"/>
-          <w:szCs w:val="32"/>
-        </w:rPr>
+          <w:sz w:val="32"/>
+          <w:szCs w:val="32"/>
+        </w:rPr>
+      </w:pPr>
+    </w:p>
+    <w:p>
+      <w:pPr>
+        <w:jc w:val="center"/>
+        <w:rPr>
+          <w:sz w:val="32"/>
+          <w:szCs w:val="32"/>
+        </w:rPr>
+      </w:pPr>
+      <w:r>
+        <w:rPr>
+          <w:sz w:val="32"/>
+          <w:szCs w:val="32"/>
+        </w:rPr>
+        <w:t>Break</w:t>
+      </w:r>
+    </w:p>
+    <w:p>
+      <w:pPr>
+        <w:jc w:val="both"/>
+        <w:rPr>
+          <w:sz w:val="32"/>
+          <w:szCs w:val="32"/>
+        </w:rPr>
+      </w:pPr>
+    </w:p>
+    <w:p>
+      <w:pPr>
+        <w:jc w:val="both"/>
+        <w:rPr>
+          <w:sz w:val="32"/>
+          <w:szCs w:val="32"/>
+        </w:rPr>
+      </w:pPr>
+    </w:p>
+    <w:p>
+      <w:pPr>
+        <w:jc w:val="both"/>
+        <w:rPr>
+          <w:b/>
+          <w:bCs/>
+          <w:sz w:val="32"/>
+          <w:szCs w:val="32"/>
+        </w:rPr>
+      </w:pPr>
+      <w:r>
+        <w:rPr>
+          <w:b/>
+          <w:bCs/>
+          <w:sz w:val="32"/>
+          <w:szCs w:val="32"/>
+        </w:rPr>
+        <w:lastRenderedPageBreak/>
         <w:t>GitHub Project:</w:t>
       </w:r>
     </w:p>
@@ -2399,7 +2871,6 @@
           <w:sz w:val="32"/>
           <w:szCs w:val="32"/>
         </w:rPr>
-        <w:lastRenderedPageBreak/>
         <w:t>Board view: visualize tasks as columns (Backlog → In Progress → Done)</w:t>
       </w:r>
     </w:p>
@@ -2491,7 +2962,7 @@
                     <pic:cNvPicPr/>
                   </pic:nvPicPr>
                   <pic:blipFill>
-                    <a:blip r:embed="rId5"/>
+                    <a:blip r:embed="rId7"/>
                     <a:stretch>
                       <a:fillRect/>
                     </a:stretch>
@@ -2624,7 +3095,6 @@
           <w:sz w:val="32"/>
           <w:szCs w:val="32"/>
         </w:rPr>
-        <w:lastRenderedPageBreak/>
         <w:t># The killer feature, when we close a PR, the linked issue can automatically move to "Done" on our board. Zero manual updating.</w:t>
       </w:r>
     </w:p>
@@ -2827,6 +3297,7 @@
           <w:sz w:val="32"/>
           <w:szCs w:val="32"/>
         </w:rPr>
+        <w:lastRenderedPageBreak/>
         <w:t># There are two ways:</w:t>
       </w:r>
     </w:p>
@@ -2910,7 +3381,6 @@
           <w:sz w:val="32"/>
           <w:szCs w:val="32"/>
         </w:rPr>
-        <w:lastRenderedPageBreak/>
         <w:t># This is where Projects v2 becomes powerful.</w:t>
       </w:r>
       <w:r>
@@ -3391,6 +3861,7 @@
           <w:sz w:val="32"/>
           <w:szCs w:val="32"/>
         </w:rPr>
+        <w:lastRenderedPageBreak/>
         <w:t>When: Issue closed</w:t>
       </w:r>
     </w:p>
@@ -3513,7 +3984,6 @@
           <w:sz w:val="32"/>
           <w:szCs w:val="32"/>
         </w:rPr>
-        <w:lastRenderedPageBreak/>
         <w:t>Then: Set status to "Backlog"</w:t>
       </w:r>
     </w:p>
@@ -3763,6 +4233,7 @@
           <w:sz w:val="32"/>
           <w:szCs w:val="32"/>
         </w:rPr>
+        <w:lastRenderedPageBreak/>
         <w:t xml:space="preserve"># That Closes </w:t>
       </w:r>
       <w:r>
@@ -3911,285 +4382,285 @@
           <w:sz w:val="32"/>
           <w:szCs w:val="32"/>
         </w:rPr>
+        <w:t>fixes #1</w:t>
+      </w:r>
+    </w:p>
+    <w:p>
+      <w:pPr>
+        <w:jc w:val="both"/>
+        <w:rPr>
+          <w:b/>
+          <w:bCs/>
+          <w:sz w:val="32"/>
+          <w:szCs w:val="32"/>
+        </w:rPr>
+      </w:pPr>
+      <w:r>
+        <w:rPr>
+          <w:b/>
+          <w:bCs/>
+          <w:sz w:val="32"/>
+          <w:szCs w:val="32"/>
+        </w:rPr>
+        <w:t>fixed #1</w:t>
+      </w:r>
+    </w:p>
+    <w:p>
+      <w:pPr>
+        <w:jc w:val="both"/>
+        <w:rPr>
+          <w:b/>
+          <w:bCs/>
+          <w:sz w:val="32"/>
+          <w:szCs w:val="32"/>
+        </w:rPr>
+      </w:pPr>
+      <w:r>
+        <w:rPr>
+          <w:b/>
+          <w:bCs/>
+          <w:sz w:val="32"/>
+          <w:szCs w:val="32"/>
+        </w:rPr>
+        <w:t>resolve #1</w:t>
+      </w:r>
+    </w:p>
+    <w:p>
+      <w:pPr>
+        <w:jc w:val="both"/>
+        <w:rPr>
+          <w:b/>
+          <w:bCs/>
+          <w:sz w:val="32"/>
+          <w:szCs w:val="32"/>
+        </w:rPr>
+      </w:pPr>
+      <w:r>
+        <w:rPr>
+          <w:b/>
+          <w:bCs/>
+          <w:sz w:val="32"/>
+          <w:szCs w:val="32"/>
+        </w:rPr>
+        <w:t>resolves #1</w:t>
+      </w:r>
+    </w:p>
+    <w:p>
+      <w:pPr>
+        <w:jc w:val="both"/>
+        <w:rPr>
+          <w:b/>
+          <w:bCs/>
+          <w:sz w:val="32"/>
+          <w:szCs w:val="32"/>
+        </w:rPr>
+      </w:pPr>
+      <w:r>
+        <w:rPr>
+          <w:b/>
+          <w:bCs/>
+          <w:sz w:val="32"/>
+          <w:szCs w:val="32"/>
+        </w:rPr>
+        <w:t>resolved #1</w:t>
+      </w:r>
+    </w:p>
+    <w:p>
+      <w:pPr>
+        <w:jc w:val="both"/>
+        <w:rPr>
+          <w:sz w:val="32"/>
+          <w:szCs w:val="32"/>
+        </w:rPr>
+      </w:pPr>
+      <w:r>
+        <w:rPr>
+          <w:sz w:val="32"/>
+          <w:szCs w:val="32"/>
+        </w:rPr>
+        <w:t># Don’t do this. It’s wrong and only closes #1 (issue)</w:t>
+      </w:r>
+    </w:p>
+    <w:p>
+      <w:pPr>
+        <w:jc w:val="both"/>
+        <w:rPr>
+          <w:b/>
+          <w:bCs/>
+          <w:sz w:val="32"/>
+          <w:szCs w:val="32"/>
+        </w:rPr>
+      </w:pPr>
+      <w:r>
+        <w:rPr>
+          <w:b/>
+          <w:bCs/>
+          <w:sz w:val="32"/>
+          <w:szCs w:val="32"/>
+        </w:rPr>
+        <w:t>Closes #1, #2, #3</w:t>
+      </w:r>
+    </w:p>
+    <w:p>
+      <w:pPr>
+        <w:jc w:val="both"/>
+        <w:rPr>
+          <w:sz w:val="32"/>
+          <w:szCs w:val="32"/>
+        </w:rPr>
+      </w:pPr>
+      <w:r>
+        <w:rPr>
+          <w:sz w:val="32"/>
+          <w:szCs w:val="32"/>
+        </w:rPr>
+        <w:t># Right way, closes all three</w:t>
+      </w:r>
+    </w:p>
+    <w:p>
+      <w:pPr>
+        <w:jc w:val="both"/>
+        <w:rPr>
+          <w:b/>
+          <w:bCs/>
+          <w:sz w:val="32"/>
+          <w:szCs w:val="32"/>
+        </w:rPr>
+      </w:pPr>
+      <w:r>
+        <w:rPr>
+          <w:b/>
+          <w:bCs/>
+          <w:sz w:val="32"/>
+          <w:szCs w:val="32"/>
+        </w:rPr>
+        <w:t>Closes #1</w:t>
+      </w:r>
+    </w:p>
+    <w:p>
+      <w:pPr>
+        <w:jc w:val="both"/>
+        <w:rPr>
+          <w:b/>
+          <w:bCs/>
+          <w:sz w:val="32"/>
+          <w:szCs w:val="32"/>
+        </w:rPr>
+      </w:pPr>
+      <w:r>
+        <w:rPr>
+          <w:b/>
+          <w:bCs/>
+          <w:sz w:val="32"/>
+          <w:szCs w:val="32"/>
+        </w:rPr>
+        <w:t>Closes #2</w:t>
+      </w:r>
+    </w:p>
+    <w:p>
+      <w:pPr>
+        <w:jc w:val="both"/>
+        <w:rPr>
+          <w:b/>
+          <w:bCs/>
+          <w:sz w:val="32"/>
+          <w:szCs w:val="32"/>
+        </w:rPr>
+      </w:pPr>
+      <w:r>
+        <w:rPr>
+          <w:b/>
+          <w:bCs/>
+          <w:sz w:val="32"/>
+          <w:szCs w:val="32"/>
+        </w:rPr>
+        <w:t>Closes #3</w:t>
+      </w:r>
+    </w:p>
+    <w:p>
+      <w:pPr>
+        <w:jc w:val="both"/>
+        <w:rPr>
+          <w:sz w:val="32"/>
+          <w:szCs w:val="32"/>
+        </w:rPr>
+      </w:pPr>
+    </w:p>
+    <w:p>
+      <w:pPr>
+        <w:jc w:val="both"/>
+        <w:rPr>
+          <w:sz w:val="32"/>
+          <w:szCs w:val="32"/>
+        </w:rPr>
+      </w:pPr>
+      <w:r>
+        <w:rPr>
+          <w:sz w:val="32"/>
+          <w:szCs w:val="32"/>
+        </w:rPr>
+        <w:t>The Flow in our Board:</w:t>
+      </w:r>
+    </w:p>
+    <w:p>
+      <w:pPr>
+        <w:jc w:val="both"/>
+        <w:rPr>
+          <w:sz w:val="32"/>
+          <w:szCs w:val="32"/>
+        </w:rPr>
+      </w:pPr>
+      <w:r>
+        <w:rPr>
+          <w:sz w:val="32"/>
+          <w:szCs w:val="32"/>
+        </w:rPr>
+        <w:t># Issue</w:t>
+      </w:r>
+      <w:r>
+        <w:rPr>
+          <w:b/>
+          <w:bCs/>
+          <w:sz w:val="32"/>
+          <w:szCs w:val="32"/>
+        </w:rPr>
+        <w:t xml:space="preserve"> #42 </w:t>
+      </w:r>
+      <w:r>
+        <w:rPr>
+          <w:sz w:val="32"/>
+          <w:szCs w:val="32"/>
+        </w:rPr>
+        <w:t xml:space="preserve">starts in </w:t>
+      </w:r>
+      <w:r>
+        <w:rPr>
+          <w:b/>
+          <w:bCs/>
+          <w:sz w:val="32"/>
+          <w:szCs w:val="32"/>
+        </w:rPr>
+        <w:t>Backlog</w:t>
+      </w:r>
+    </w:p>
+    <w:p>
+      <w:pPr>
+        <w:jc w:val="both"/>
+        <w:rPr>
+          <w:b/>
+          <w:bCs/>
+          <w:sz w:val="32"/>
+          <w:szCs w:val="32"/>
+        </w:rPr>
+      </w:pPr>
+      <w:r>
+        <w:rPr>
+          <w:b/>
+          <w:bCs/>
+          <w:sz w:val="32"/>
+          <w:szCs w:val="32"/>
+        </w:rPr>
         <w:lastRenderedPageBreak/>
-        <w:t>fixes #1</w:t>
-      </w:r>
-    </w:p>
-    <w:p>
-      <w:pPr>
-        <w:jc w:val="both"/>
-        <w:rPr>
-          <w:b/>
-          <w:bCs/>
-          <w:sz w:val="32"/>
-          <w:szCs w:val="32"/>
-        </w:rPr>
-      </w:pPr>
-      <w:r>
-        <w:rPr>
-          <w:b/>
-          <w:bCs/>
-          <w:sz w:val="32"/>
-          <w:szCs w:val="32"/>
-        </w:rPr>
-        <w:t>fixed #1</w:t>
-      </w:r>
-    </w:p>
-    <w:p>
-      <w:pPr>
-        <w:jc w:val="both"/>
-        <w:rPr>
-          <w:b/>
-          <w:bCs/>
-          <w:sz w:val="32"/>
-          <w:szCs w:val="32"/>
-        </w:rPr>
-      </w:pPr>
-      <w:r>
-        <w:rPr>
-          <w:b/>
-          <w:bCs/>
-          <w:sz w:val="32"/>
-          <w:szCs w:val="32"/>
-        </w:rPr>
-        <w:t>resolve #1</w:t>
-      </w:r>
-    </w:p>
-    <w:p>
-      <w:pPr>
-        <w:jc w:val="both"/>
-        <w:rPr>
-          <w:b/>
-          <w:bCs/>
-          <w:sz w:val="32"/>
-          <w:szCs w:val="32"/>
-        </w:rPr>
-      </w:pPr>
-      <w:r>
-        <w:rPr>
-          <w:b/>
-          <w:bCs/>
-          <w:sz w:val="32"/>
-          <w:szCs w:val="32"/>
-        </w:rPr>
-        <w:t>resolves #1</w:t>
-      </w:r>
-    </w:p>
-    <w:p>
-      <w:pPr>
-        <w:jc w:val="both"/>
-        <w:rPr>
-          <w:b/>
-          <w:bCs/>
-          <w:sz w:val="32"/>
-          <w:szCs w:val="32"/>
-        </w:rPr>
-      </w:pPr>
-      <w:r>
-        <w:rPr>
-          <w:b/>
-          <w:bCs/>
-          <w:sz w:val="32"/>
-          <w:szCs w:val="32"/>
-        </w:rPr>
-        <w:t>resolved #1</w:t>
-      </w:r>
-    </w:p>
-    <w:p>
-      <w:pPr>
-        <w:jc w:val="both"/>
-        <w:rPr>
-          <w:sz w:val="32"/>
-          <w:szCs w:val="32"/>
-        </w:rPr>
-      </w:pPr>
-      <w:r>
-        <w:rPr>
-          <w:sz w:val="32"/>
-          <w:szCs w:val="32"/>
-        </w:rPr>
-        <w:t># Don’t do this. It’s wrong and only closes #1 (issue)</w:t>
-      </w:r>
-    </w:p>
-    <w:p>
-      <w:pPr>
-        <w:jc w:val="both"/>
-        <w:rPr>
-          <w:b/>
-          <w:bCs/>
-          <w:sz w:val="32"/>
-          <w:szCs w:val="32"/>
-        </w:rPr>
-      </w:pPr>
-      <w:r>
-        <w:rPr>
-          <w:b/>
-          <w:bCs/>
-          <w:sz w:val="32"/>
-          <w:szCs w:val="32"/>
-        </w:rPr>
-        <w:t>Closes #1, #2, #3</w:t>
-      </w:r>
-    </w:p>
-    <w:p>
-      <w:pPr>
-        <w:jc w:val="both"/>
-        <w:rPr>
-          <w:sz w:val="32"/>
-          <w:szCs w:val="32"/>
-        </w:rPr>
-      </w:pPr>
-      <w:r>
-        <w:rPr>
-          <w:sz w:val="32"/>
-          <w:szCs w:val="32"/>
-        </w:rPr>
-        <w:t># Right way, closes all three</w:t>
-      </w:r>
-    </w:p>
-    <w:p>
-      <w:pPr>
-        <w:jc w:val="both"/>
-        <w:rPr>
-          <w:b/>
-          <w:bCs/>
-          <w:sz w:val="32"/>
-          <w:szCs w:val="32"/>
-        </w:rPr>
-      </w:pPr>
-      <w:r>
-        <w:rPr>
-          <w:b/>
-          <w:bCs/>
-          <w:sz w:val="32"/>
-          <w:szCs w:val="32"/>
-        </w:rPr>
-        <w:t>Closes #1</w:t>
-      </w:r>
-    </w:p>
-    <w:p>
-      <w:pPr>
-        <w:jc w:val="both"/>
-        <w:rPr>
-          <w:b/>
-          <w:bCs/>
-          <w:sz w:val="32"/>
-          <w:szCs w:val="32"/>
-        </w:rPr>
-      </w:pPr>
-      <w:r>
-        <w:rPr>
-          <w:b/>
-          <w:bCs/>
-          <w:sz w:val="32"/>
-          <w:szCs w:val="32"/>
-        </w:rPr>
-        <w:t>Closes #2</w:t>
-      </w:r>
-    </w:p>
-    <w:p>
-      <w:pPr>
-        <w:jc w:val="both"/>
-        <w:rPr>
-          <w:b/>
-          <w:bCs/>
-          <w:sz w:val="32"/>
-          <w:szCs w:val="32"/>
-        </w:rPr>
-      </w:pPr>
-      <w:r>
-        <w:rPr>
-          <w:b/>
-          <w:bCs/>
-          <w:sz w:val="32"/>
-          <w:szCs w:val="32"/>
-        </w:rPr>
-        <w:t>Closes #3</w:t>
-      </w:r>
-    </w:p>
-    <w:p>
-      <w:pPr>
-        <w:jc w:val="both"/>
-        <w:rPr>
-          <w:sz w:val="32"/>
-          <w:szCs w:val="32"/>
-        </w:rPr>
-      </w:pPr>
-    </w:p>
-    <w:p>
-      <w:pPr>
-        <w:jc w:val="both"/>
-        <w:rPr>
-          <w:sz w:val="32"/>
-          <w:szCs w:val="32"/>
-        </w:rPr>
-      </w:pPr>
-      <w:r>
-        <w:rPr>
-          <w:sz w:val="32"/>
-          <w:szCs w:val="32"/>
-        </w:rPr>
-        <w:t>The Flow in our Board:</w:t>
-      </w:r>
-    </w:p>
-    <w:p>
-      <w:pPr>
-        <w:jc w:val="both"/>
-        <w:rPr>
-          <w:sz w:val="32"/>
-          <w:szCs w:val="32"/>
-        </w:rPr>
-      </w:pPr>
-      <w:r>
-        <w:rPr>
-          <w:sz w:val="32"/>
-          <w:szCs w:val="32"/>
-        </w:rPr>
-        <w:t># Issue</w:t>
-      </w:r>
-      <w:r>
-        <w:rPr>
-          <w:b/>
-          <w:bCs/>
-          <w:sz w:val="32"/>
-          <w:szCs w:val="32"/>
-        </w:rPr>
-        <w:t xml:space="preserve"> #42 </w:t>
-      </w:r>
-      <w:r>
-        <w:rPr>
-          <w:sz w:val="32"/>
-          <w:szCs w:val="32"/>
-        </w:rPr>
-        <w:t xml:space="preserve">starts in </w:t>
-      </w:r>
-      <w:r>
-        <w:rPr>
-          <w:b/>
-          <w:bCs/>
-          <w:sz w:val="32"/>
-          <w:szCs w:val="32"/>
-        </w:rPr>
-        <w:t>Backlog</w:t>
-      </w:r>
-    </w:p>
-    <w:p>
-      <w:pPr>
-        <w:jc w:val="both"/>
-        <w:rPr>
-          <w:b/>
-          <w:bCs/>
-          <w:sz w:val="32"/>
-          <w:szCs w:val="32"/>
-        </w:rPr>
-      </w:pPr>
-      <w:r>
-        <w:rPr>
-          <w:b/>
-          <w:bCs/>
-          <w:sz w:val="32"/>
-          <w:szCs w:val="32"/>
-        </w:rPr>
         <w:t>→ We start working: manually drag to "In Progress" (or automation on PR open)</w:t>
       </w:r>
     </w:p>
@@ -4303,7 +4774,6 @@
           <w:sz w:val="32"/>
           <w:szCs w:val="32"/>
         </w:rPr>
-        <w:lastRenderedPageBreak/>
         <w:t xml:space="preserve"># </w:t>
       </w:r>
       <w:r>
@@ -4526,6 +4996,7 @@
           <w:sz w:val="32"/>
           <w:szCs w:val="32"/>
         </w:rPr>
+        <w:lastRenderedPageBreak/>
         <w:t>Sprint planning uses the Iteration field, GitHub auto-creates 2-week iterations and we drag issues into the current sprint</w:t>
       </w:r>
     </w:p>
@@ -4642,24 +5113,48 @@
           <w:sz w:val="32"/>
           <w:szCs w:val="32"/>
         </w:rPr>
-        <w:lastRenderedPageBreak/>
-        <w:t xml:space="preserve">Milestones vs Projects, Milestones are for version-based releases (v1.0, v2.0). Projects are for ongoing workflow management. Senior </w:t>
-      </w:r>
-      <w:proofErr w:type="spellStart"/>
-      <w:r>
-        <w:rPr>
-          <w:sz w:val="32"/>
-          <w:szCs w:val="32"/>
-        </w:rPr>
-        <w:t>devs</w:t>
-      </w:r>
-      <w:proofErr w:type="spellEnd"/>
-      <w:r>
-        <w:rPr>
-          <w:sz w:val="32"/>
-          <w:szCs w:val="32"/>
-        </w:rPr>
-        <w:t xml:space="preserve"> use both together</w:t>
+        <w:t>Milestones vs Projects, Milestones are for version-based releases (v1.0, v2.0). Projects are for ongoing workflow management. Senior dev</w:t>
+      </w:r>
+      <w:r>
+        <w:rPr>
+          <w:sz w:val="32"/>
+          <w:szCs w:val="32"/>
+        </w:rPr>
+        <w:t>’</w:t>
+      </w:r>
+      <w:r>
+        <w:rPr>
+          <w:sz w:val="32"/>
+          <w:szCs w:val="32"/>
+        </w:rPr>
+        <w:t>s use both together</w:t>
+      </w:r>
+    </w:p>
+    <w:p>
+      <w:pPr>
+        <w:jc w:val="both"/>
+        <w:rPr>
+          <w:b/>
+          <w:bCs/>
+          <w:sz w:val="32"/>
+          <w:szCs w:val="32"/>
+        </w:rPr>
+      </w:pPr>
+    </w:p>
+    <w:p>
+      <w:pPr>
+        <w:jc w:val="center"/>
+        <w:rPr>
+          <w:sz w:val="32"/>
+          <w:szCs w:val="32"/>
+        </w:rPr>
+      </w:pPr>
+      <w:r>
+        <w:rPr>
+          <w:sz w:val="32"/>
+          <w:szCs w:val="32"/>
+        </w:rPr>
+        <w:t>Break</w:t>
       </w:r>
     </w:p>
     <w:p>
@@ -4874,6 +5369,7 @@
           <w:sz w:val="32"/>
           <w:szCs w:val="32"/>
         </w:rPr>
+        <w:lastRenderedPageBreak/>
         <w:t xml:space="preserve"># Go to repo and then </w:t>
       </w:r>
       <w:r>
@@ -5037,7 +5533,6 @@
           <w:sz w:val="32"/>
           <w:szCs w:val="32"/>
         </w:rPr>
-        <w:lastRenderedPageBreak/>
         <w:t xml:space="preserve"># When someone clones our public repository, they also get the </w:t>
       </w:r>
       <w:r>
@@ -5062,7 +5557,16 @@
           <w:sz w:val="32"/>
           <w:szCs w:val="32"/>
         </w:rPr>
-        <w:t>The .git</w:t>
+        <w:t xml:space="preserve">The </w:t>
+      </w:r>
+      <w:r>
+        <w:rPr>
+          <w:b/>
+          <w:bCs/>
+          <w:sz w:val="32"/>
+          <w:szCs w:val="32"/>
+        </w:rPr>
+        <w:t>.git</w:t>
       </w:r>
       <w:proofErr w:type="gramEnd"/>
       <w:r>
@@ -5292,6 +5796,7 @@
           <w:sz w:val="32"/>
           <w:szCs w:val="32"/>
         </w:rPr>
+        <w:lastRenderedPageBreak/>
         <w:t xml:space="preserve"># If we lose our local repository we can just clone it again and Git will recreate the </w:t>
       </w:r>
       <w:proofErr w:type="gramStart"/>
@@ -5534,7 +6039,6 @@
           <w:sz w:val="28"/>
           <w:szCs w:val="28"/>
         </w:rPr>
-        <w:lastRenderedPageBreak/>
         <w:t>GitHub Repository</w:t>
       </w:r>
     </w:p>
@@ -5899,6 +6403,7 @@
           <w:sz w:val="32"/>
           <w:szCs w:val="32"/>
         </w:rPr>
+        <w:lastRenderedPageBreak/>
         <w:t xml:space="preserve"># If we use </w:t>
       </w:r>
       <w:r>
@@ -6024,6 +6529,1483 @@
     </w:p>
     <w:p>
       <w:pPr>
+        <w:jc w:val="center"/>
+        <w:rPr>
+          <w:sz w:val="32"/>
+          <w:szCs w:val="32"/>
+        </w:rPr>
+      </w:pPr>
+      <w:r>
+        <w:rPr>
+          <w:sz w:val="32"/>
+          <w:szCs w:val="32"/>
+        </w:rPr>
+        <w:t>Break</w:t>
+      </w:r>
+    </w:p>
+    <w:p>
+      <w:pPr>
+        <w:jc w:val="both"/>
+        <w:rPr>
+          <w:sz w:val="32"/>
+          <w:szCs w:val="32"/>
+        </w:rPr>
+      </w:pPr>
+    </w:p>
+    <w:p>
+      <w:pPr>
+        <w:jc w:val="both"/>
+        <w:rPr>
+          <w:b/>
+          <w:bCs/>
+          <w:sz w:val="32"/>
+          <w:szCs w:val="32"/>
+        </w:rPr>
+      </w:pPr>
+      <w:r>
+        <w:rPr>
+          <w:b/>
+          <w:bCs/>
+          <w:sz w:val="32"/>
+          <w:szCs w:val="32"/>
+        </w:rPr>
+        <w:t>GitHub Rules:</w:t>
+      </w:r>
+    </w:p>
+    <w:p>
+      <w:pPr>
+        <w:jc w:val="both"/>
+        <w:rPr>
+          <w:sz w:val="32"/>
+          <w:szCs w:val="32"/>
+        </w:rPr>
+      </w:pPr>
+      <w:r>
+        <w:rPr>
+          <w:sz w:val="32"/>
+          <w:szCs w:val="32"/>
+        </w:rPr>
+        <w:t xml:space="preserve"># </w:t>
+      </w:r>
+      <w:r>
+        <w:rPr>
+          <w:b/>
+          <w:bCs/>
+          <w:sz w:val="32"/>
+          <w:szCs w:val="32"/>
+        </w:rPr>
+        <w:t>GitHub</w:t>
+      </w:r>
+      <w:r>
+        <w:rPr>
+          <w:sz w:val="32"/>
+          <w:szCs w:val="32"/>
+        </w:rPr>
+        <w:t xml:space="preserve"> branch protection rules are </w:t>
+      </w:r>
+      <w:r>
+        <w:rPr>
+          <w:sz w:val="32"/>
+          <w:szCs w:val="32"/>
+        </w:rPr>
+        <w:t>R</w:t>
+      </w:r>
+      <w:r>
+        <w:rPr>
+          <w:sz w:val="32"/>
+          <w:szCs w:val="32"/>
+        </w:rPr>
+        <w:t>epository settings that prevent direct</w:t>
+      </w:r>
+      <w:r>
+        <w:rPr>
+          <w:sz w:val="32"/>
+          <w:szCs w:val="32"/>
+        </w:rPr>
+        <w:t xml:space="preserve"> or forced code</w:t>
+      </w:r>
+      <w:r>
+        <w:rPr>
+          <w:sz w:val="32"/>
+          <w:szCs w:val="32"/>
+        </w:rPr>
+        <w:t xml:space="preserve"> pushes</w:t>
+      </w:r>
+      <w:r>
+        <w:rPr>
+          <w:sz w:val="32"/>
+          <w:szCs w:val="32"/>
+        </w:rPr>
+        <w:t xml:space="preserve"> (</w:t>
+      </w:r>
+      <w:r>
+        <w:rPr>
+          <w:b/>
+          <w:bCs/>
+          <w:sz w:val="32"/>
+          <w:szCs w:val="32"/>
+        </w:rPr>
+        <w:t>git push --force</w:t>
+      </w:r>
+      <w:r>
+        <w:rPr>
+          <w:sz w:val="32"/>
+          <w:szCs w:val="32"/>
+        </w:rPr>
+        <w:t>)</w:t>
+      </w:r>
+      <w:r>
+        <w:rPr>
+          <w:sz w:val="32"/>
+          <w:szCs w:val="32"/>
+        </w:rPr>
+        <w:t xml:space="preserve"> to critical branches like </w:t>
+      </w:r>
+      <w:r>
+        <w:rPr>
+          <w:b/>
+          <w:bCs/>
+          <w:sz w:val="32"/>
+          <w:szCs w:val="32"/>
+        </w:rPr>
+        <w:t>main</w:t>
+      </w:r>
+    </w:p>
+    <w:p>
+      <w:pPr>
+        <w:jc w:val="both"/>
+        <w:rPr>
+          <w:sz w:val="32"/>
+          <w:szCs w:val="32"/>
+        </w:rPr>
+      </w:pPr>
+      <w:r>
+        <w:rPr>
+          <w:sz w:val="32"/>
+          <w:szCs w:val="32"/>
+        </w:rPr>
+        <w:t># E</w:t>
+      </w:r>
+      <w:r>
+        <w:rPr>
+          <w:sz w:val="32"/>
+          <w:szCs w:val="32"/>
+        </w:rPr>
+        <w:t>nsuring all code changes are submitted via pull requests (PRs) and reviewed before merging</w:t>
+      </w:r>
+      <w:r>
+        <w:rPr>
+          <w:sz w:val="32"/>
+          <w:szCs w:val="32"/>
+        </w:rPr>
+        <w:t xml:space="preserve"> with </w:t>
+      </w:r>
+      <w:r>
+        <w:rPr>
+          <w:b/>
+          <w:bCs/>
+          <w:sz w:val="32"/>
+          <w:szCs w:val="32"/>
+        </w:rPr>
+        <w:t>main</w:t>
+      </w:r>
+      <w:r>
+        <w:rPr>
+          <w:sz w:val="32"/>
+          <w:szCs w:val="32"/>
+        </w:rPr>
+        <w:t>.</w:t>
+      </w:r>
+      <w:r>
+        <w:rPr>
+          <w:sz w:val="32"/>
+          <w:szCs w:val="32"/>
+        </w:rPr>
+        <w:t xml:space="preserve"> So, no one can edit or update </w:t>
+      </w:r>
+      <w:r>
+        <w:rPr>
+          <w:b/>
+          <w:bCs/>
+          <w:sz w:val="32"/>
+          <w:szCs w:val="32"/>
+        </w:rPr>
+        <w:t>main</w:t>
+      </w:r>
+      <w:r>
+        <w:rPr>
+          <w:sz w:val="32"/>
+          <w:szCs w:val="32"/>
+        </w:rPr>
+        <w:t xml:space="preserve"> directly unless added in </w:t>
+      </w:r>
+      <w:r>
+        <w:rPr>
+          <w:b/>
+          <w:bCs/>
+          <w:sz w:val="32"/>
+          <w:szCs w:val="32"/>
+        </w:rPr>
+        <w:t>Bypass List</w:t>
+      </w:r>
+    </w:p>
+    <w:p>
+      <w:pPr>
+        <w:jc w:val="both"/>
+        <w:rPr>
+          <w:sz w:val="32"/>
+          <w:szCs w:val="32"/>
+        </w:rPr>
+      </w:pPr>
+    </w:p>
+    <w:p>
+      <w:pPr>
+        <w:jc w:val="both"/>
+        <w:rPr>
+          <w:sz w:val="32"/>
+          <w:szCs w:val="32"/>
+        </w:rPr>
+      </w:pPr>
+      <w:r>
+        <w:rPr>
+          <w:sz w:val="32"/>
+          <w:szCs w:val="32"/>
+        </w:rPr>
+        <w:t>Setup:</w:t>
+      </w:r>
+    </w:p>
+    <w:p>
+      <w:pPr>
+        <w:jc w:val="both"/>
+        <w:rPr>
+          <w:sz w:val="32"/>
+          <w:szCs w:val="32"/>
+        </w:rPr>
+      </w:pPr>
+      <w:r>
+        <w:rPr>
+          <w:sz w:val="32"/>
+          <w:szCs w:val="32"/>
+        </w:rPr>
+        <w:t xml:space="preserve"># Go to Repository in </w:t>
+      </w:r>
+      <w:r>
+        <w:rPr>
+          <w:b/>
+          <w:bCs/>
+          <w:sz w:val="32"/>
+          <w:szCs w:val="32"/>
+        </w:rPr>
+        <w:t>GitHub</w:t>
+      </w:r>
+      <w:r>
+        <w:rPr>
+          <w:sz w:val="32"/>
+          <w:szCs w:val="32"/>
+        </w:rPr>
+        <w:t xml:space="preserve"> </w:t>
+      </w:r>
+      <w:r>
+        <w:rPr>
+          <w:sz w:val="32"/>
+          <w:szCs w:val="32"/>
+        </w:rPr>
+        <w:sym w:font="Wingdings" w:char="F0E0"/>
+      </w:r>
+      <w:r>
+        <w:rPr>
+          <w:sz w:val="32"/>
+          <w:szCs w:val="32"/>
+        </w:rPr>
+        <w:t xml:space="preserve"> Settings </w:t>
+      </w:r>
+      <w:r>
+        <w:rPr>
+          <w:sz w:val="32"/>
+          <w:szCs w:val="32"/>
+        </w:rPr>
+        <w:sym w:font="Wingdings" w:char="F0E0"/>
+      </w:r>
+      <w:r>
+        <w:rPr>
+          <w:sz w:val="32"/>
+          <w:szCs w:val="32"/>
+        </w:rPr>
+        <w:t xml:space="preserve"> Under Code &amp; Automation Section </w:t>
+      </w:r>
+      <w:r>
+        <w:rPr>
+          <w:sz w:val="32"/>
+          <w:szCs w:val="32"/>
+        </w:rPr>
+        <w:sym w:font="Wingdings" w:char="F0E0"/>
+      </w:r>
+      <w:r>
+        <w:rPr>
+          <w:sz w:val="32"/>
+          <w:szCs w:val="32"/>
+        </w:rPr>
+        <w:t xml:space="preserve"> Rules </w:t>
+      </w:r>
+      <w:r>
+        <w:rPr>
+          <w:sz w:val="32"/>
+          <w:szCs w:val="32"/>
+        </w:rPr>
+        <w:sym w:font="Wingdings" w:char="F0E0"/>
+      </w:r>
+      <w:r>
+        <w:rPr>
+          <w:sz w:val="32"/>
+          <w:szCs w:val="32"/>
+        </w:rPr>
+        <w:t xml:space="preserve"> Rulesets </w:t>
+      </w:r>
+      <w:r>
+        <w:rPr>
+          <w:sz w:val="32"/>
+          <w:szCs w:val="32"/>
+        </w:rPr>
+        <w:sym w:font="Wingdings" w:char="F0E0"/>
+      </w:r>
+      <w:r>
+        <w:rPr>
+          <w:sz w:val="32"/>
+          <w:szCs w:val="32"/>
+        </w:rPr>
+        <w:t xml:space="preserve"> New Ruleset</w:t>
+      </w:r>
+    </w:p>
+    <w:p>
+      <w:pPr>
+        <w:jc w:val="both"/>
+        <w:rPr>
+          <w:sz w:val="32"/>
+          <w:szCs w:val="32"/>
+        </w:rPr>
+      </w:pPr>
+      <w:r>
+        <w:rPr>
+          <w:sz w:val="32"/>
+          <w:szCs w:val="32"/>
+        </w:rPr>
+        <w:t xml:space="preserve"># Then set the name of the Ruleset. Select Enforcement Status to Active. Add branches in Target Branches (By default </w:t>
+      </w:r>
+      <w:r>
+        <w:rPr>
+          <w:b/>
+          <w:bCs/>
+          <w:sz w:val="32"/>
+          <w:szCs w:val="32"/>
+        </w:rPr>
+        <w:t>main</w:t>
+      </w:r>
+      <w:r>
+        <w:rPr>
+          <w:sz w:val="32"/>
+          <w:szCs w:val="32"/>
+        </w:rPr>
+        <w:t xml:space="preserve"> is added) to specify which branches these rules apply</w:t>
+      </w:r>
+    </w:p>
+    <w:p>
+      <w:pPr>
+        <w:jc w:val="both"/>
+        <w:rPr>
+          <w:sz w:val="32"/>
+          <w:szCs w:val="32"/>
+        </w:rPr>
+      </w:pPr>
+      <w:r>
+        <w:rPr>
+          <w:sz w:val="32"/>
+          <w:szCs w:val="32"/>
+        </w:rPr>
+        <w:t># Then select Branch Rules and hit save.</w:t>
+      </w:r>
+    </w:p>
+    <w:p>
+      <w:pPr>
+        <w:jc w:val="both"/>
+        <w:rPr>
+          <w:sz w:val="32"/>
+          <w:szCs w:val="32"/>
+        </w:rPr>
+      </w:pPr>
+    </w:p>
+    <w:p>
+      <w:pPr>
+        <w:jc w:val="both"/>
+        <w:rPr>
+          <w:sz w:val="32"/>
+          <w:szCs w:val="32"/>
+        </w:rPr>
+      </w:pPr>
+      <w:r>
+        <w:rPr>
+          <w:sz w:val="32"/>
+          <w:szCs w:val="32"/>
+        </w:rPr>
+        <w:t>Bypass List:</w:t>
+      </w:r>
+    </w:p>
+    <w:p>
+      <w:pPr>
+        <w:jc w:val="both"/>
+        <w:rPr>
+          <w:sz w:val="32"/>
+          <w:szCs w:val="32"/>
+        </w:rPr>
+      </w:pPr>
+      <w:r>
+        <w:rPr>
+          <w:sz w:val="32"/>
+          <w:szCs w:val="32"/>
+        </w:rPr>
+        <w:t xml:space="preserve"># Roles, teams, agents and users who are exempt from this Ruleset is specified here. So, these rules </w:t>
+      </w:r>
+      <w:r>
+        <w:rPr>
+          <w:sz w:val="32"/>
+          <w:szCs w:val="32"/>
+        </w:rPr>
+        <w:t>don’t</w:t>
+      </w:r>
+      <w:r>
+        <w:rPr>
+          <w:sz w:val="32"/>
+          <w:szCs w:val="32"/>
+        </w:rPr>
+        <w:t xml:space="preserve"> apply to them. We can add:</w:t>
+      </w:r>
+    </w:p>
+    <w:p>
+      <w:pPr>
+        <w:pStyle w:val="ListParagraph"/>
+        <w:numPr>
+          <w:ilvl w:val="0"/>
+          <w:numId w:val="17"/>
+        </w:numPr>
+        <w:jc w:val="both"/>
+        <w:rPr>
+          <w:sz w:val="32"/>
+          <w:szCs w:val="32"/>
+        </w:rPr>
+      </w:pPr>
+      <w:r>
+        <w:rPr>
+          <w:sz w:val="32"/>
+          <w:szCs w:val="32"/>
+        </w:rPr>
+        <w:t>Deploy Keys</w:t>
+      </w:r>
+    </w:p>
+    <w:p>
+      <w:pPr>
+        <w:pStyle w:val="ListParagraph"/>
+        <w:numPr>
+          <w:ilvl w:val="0"/>
+          <w:numId w:val="17"/>
+        </w:numPr>
+        <w:jc w:val="both"/>
+        <w:rPr>
+          <w:sz w:val="32"/>
+          <w:szCs w:val="32"/>
+        </w:rPr>
+      </w:pPr>
+      <w:r>
+        <w:rPr>
+          <w:sz w:val="32"/>
+          <w:szCs w:val="32"/>
+        </w:rPr>
+        <w:t>Repository Admin (Select)</w:t>
+      </w:r>
+    </w:p>
+    <w:p>
+      <w:pPr>
+        <w:pStyle w:val="ListParagraph"/>
+        <w:numPr>
+          <w:ilvl w:val="0"/>
+          <w:numId w:val="17"/>
+        </w:numPr>
+        <w:jc w:val="both"/>
+        <w:rPr>
+          <w:sz w:val="32"/>
+          <w:szCs w:val="32"/>
+        </w:rPr>
+      </w:pPr>
+      <w:r>
+        <w:rPr>
+          <w:sz w:val="32"/>
+          <w:szCs w:val="32"/>
+        </w:rPr>
+        <w:t>Maintain</w:t>
+      </w:r>
+    </w:p>
+    <w:p>
+      <w:pPr>
+        <w:pStyle w:val="ListParagraph"/>
+        <w:numPr>
+          <w:ilvl w:val="0"/>
+          <w:numId w:val="17"/>
+        </w:numPr>
+        <w:jc w:val="both"/>
+        <w:rPr>
+          <w:sz w:val="32"/>
+          <w:szCs w:val="32"/>
+        </w:rPr>
+      </w:pPr>
+      <w:r>
+        <w:rPr>
+          <w:sz w:val="32"/>
+          <w:szCs w:val="32"/>
+        </w:rPr>
+        <w:t>Write</w:t>
+      </w:r>
+    </w:p>
+    <w:p>
+      <w:pPr>
+        <w:pStyle w:val="ListParagraph"/>
+        <w:numPr>
+          <w:ilvl w:val="0"/>
+          <w:numId w:val="17"/>
+        </w:numPr>
+        <w:jc w:val="both"/>
+        <w:rPr>
+          <w:sz w:val="32"/>
+          <w:szCs w:val="32"/>
+        </w:rPr>
+      </w:pPr>
+      <w:r>
+        <w:rPr>
+          <w:sz w:val="32"/>
+          <w:szCs w:val="32"/>
+        </w:rPr>
+        <w:t>Copilot code review</w:t>
+      </w:r>
+    </w:p>
+    <w:p>
+      <w:pPr>
+        <w:pStyle w:val="ListParagraph"/>
+        <w:numPr>
+          <w:ilvl w:val="0"/>
+          <w:numId w:val="17"/>
+        </w:numPr>
+        <w:jc w:val="both"/>
+        <w:rPr>
+          <w:sz w:val="32"/>
+          <w:szCs w:val="32"/>
+        </w:rPr>
+      </w:pPr>
+      <w:r>
+        <w:rPr>
+          <w:sz w:val="32"/>
+          <w:szCs w:val="32"/>
+        </w:rPr>
+        <w:t>Copilot cloud agent</w:t>
+      </w:r>
+    </w:p>
+    <w:p>
+      <w:pPr>
+        <w:jc w:val="both"/>
+        <w:rPr>
+          <w:sz w:val="32"/>
+          <w:szCs w:val="32"/>
+        </w:rPr>
+      </w:pPr>
+    </w:p>
+    <w:p>
+      <w:pPr>
+        <w:jc w:val="both"/>
+        <w:rPr>
+          <w:sz w:val="32"/>
+          <w:szCs w:val="32"/>
+        </w:rPr>
+      </w:pPr>
+      <w:r>
+        <w:rPr>
+          <w:sz w:val="32"/>
+          <w:szCs w:val="32"/>
+        </w:rPr>
+        <w:t>Branch Rules:</w:t>
+      </w:r>
+    </w:p>
+    <w:p>
+      <w:pPr>
+        <w:pStyle w:val="ListParagraph"/>
+        <w:numPr>
+          <w:ilvl w:val="0"/>
+          <w:numId w:val="18"/>
+        </w:numPr>
+        <w:jc w:val="both"/>
+        <w:rPr>
+          <w:sz w:val="32"/>
+          <w:szCs w:val="32"/>
+        </w:rPr>
+      </w:pPr>
+      <w:r>
+        <w:rPr>
+          <w:b/>
+          <w:bCs/>
+          <w:sz w:val="32"/>
+          <w:szCs w:val="32"/>
+        </w:rPr>
+        <w:t>Restrict creations</w:t>
+      </w:r>
+      <w:r>
+        <w:rPr>
+          <w:b/>
+          <w:bCs/>
+          <w:sz w:val="32"/>
+          <w:szCs w:val="32"/>
+        </w:rPr>
+        <w:t xml:space="preserve">: </w:t>
+      </w:r>
+      <w:r>
+        <w:rPr>
+          <w:sz w:val="32"/>
+          <w:szCs w:val="32"/>
+        </w:rPr>
+        <w:t>Prevents creating a branch with the protected name (</w:t>
+      </w:r>
+      <w:r>
+        <w:rPr>
+          <w:b/>
+          <w:bCs/>
+          <w:sz w:val="32"/>
+          <w:szCs w:val="32"/>
+        </w:rPr>
+        <w:t>main</w:t>
+      </w:r>
+      <w:r>
+        <w:rPr>
+          <w:sz w:val="32"/>
+          <w:szCs w:val="32"/>
+        </w:rPr>
+        <w:t>).</w:t>
+      </w:r>
+      <w:r>
+        <w:rPr>
+          <w:sz w:val="32"/>
+          <w:szCs w:val="32"/>
+        </w:rPr>
+        <w:t xml:space="preserve"> Not Recommended.</w:t>
+      </w:r>
+    </w:p>
+    <w:p>
+      <w:pPr>
+        <w:pStyle w:val="ListParagraph"/>
+        <w:numPr>
+          <w:ilvl w:val="0"/>
+          <w:numId w:val="18"/>
+        </w:numPr>
+        <w:jc w:val="both"/>
+        <w:rPr>
+          <w:sz w:val="32"/>
+          <w:szCs w:val="32"/>
+        </w:rPr>
+      </w:pPr>
+      <w:r>
+        <w:rPr>
+          <w:b/>
+          <w:bCs/>
+          <w:sz w:val="32"/>
+          <w:szCs w:val="32"/>
+        </w:rPr>
+        <w:t>Restrict updates</w:t>
+      </w:r>
+      <w:r>
+        <w:rPr>
+          <w:b/>
+          <w:bCs/>
+          <w:sz w:val="32"/>
+          <w:szCs w:val="32"/>
+        </w:rPr>
+        <w:t>:</w:t>
+      </w:r>
+      <w:r>
+        <w:rPr>
+          <w:sz w:val="32"/>
+          <w:szCs w:val="32"/>
+        </w:rPr>
+        <w:t xml:space="preserve"> </w:t>
+      </w:r>
+      <w:r>
+        <w:rPr>
+          <w:sz w:val="32"/>
+          <w:szCs w:val="32"/>
+        </w:rPr>
+        <w:t>Nobody can push directly to main unless they're on the bypass list.</w:t>
+      </w:r>
+      <w:r>
+        <w:rPr>
+          <w:sz w:val="32"/>
+          <w:szCs w:val="32"/>
+        </w:rPr>
+        <w:t xml:space="preserve"> Recommended o</w:t>
+      </w:r>
+      <w:r>
+        <w:rPr>
+          <w:sz w:val="32"/>
+          <w:szCs w:val="32"/>
+        </w:rPr>
+        <w:t xml:space="preserve">nly if </w:t>
+      </w:r>
+      <w:r>
+        <w:rPr>
+          <w:sz w:val="32"/>
+          <w:szCs w:val="32"/>
+        </w:rPr>
+        <w:t>we</w:t>
+      </w:r>
+      <w:r>
+        <w:rPr>
+          <w:sz w:val="32"/>
+          <w:szCs w:val="32"/>
+        </w:rPr>
+        <w:t xml:space="preserve"> always use Pull Requests</w:t>
+      </w:r>
+    </w:p>
+    <w:p>
+      <w:pPr>
+        <w:pStyle w:val="ListParagraph"/>
+        <w:numPr>
+          <w:ilvl w:val="0"/>
+          <w:numId w:val="18"/>
+        </w:numPr>
+        <w:jc w:val="both"/>
+        <w:rPr>
+          <w:sz w:val="32"/>
+          <w:szCs w:val="32"/>
+        </w:rPr>
+      </w:pPr>
+      <w:r>
+        <w:rPr>
+          <w:b/>
+          <w:bCs/>
+          <w:sz w:val="32"/>
+          <w:szCs w:val="32"/>
+        </w:rPr>
+        <w:t>Restrict deletions</w:t>
+      </w:r>
+      <w:r>
+        <w:rPr>
+          <w:b/>
+          <w:bCs/>
+          <w:sz w:val="32"/>
+          <w:szCs w:val="32"/>
+        </w:rPr>
+        <w:t>:</w:t>
+      </w:r>
+      <w:r>
+        <w:rPr>
+          <w:sz w:val="32"/>
+          <w:szCs w:val="32"/>
+        </w:rPr>
+        <w:t xml:space="preserve"> </w:t>
+      </w:r>
+      <w:r>
+        <w:rPr>
+          <w:sz w:val="32"/>
+          <w:szCs w:val="32"/>
+        </w:rPr>
+        <w:t xml:space="preserve">Prevents deleting the </w:t>
+      </w:r>
+      <w:r>
+        <w:rPr>
+          <w:b/>
+          <w:bCs/>
+          <w:sz w:val="32"/>
+          <w:szCs w:val="32"/>
+        </w:rPr>
+        <w:t>main</w:t>
+      </w:r>
+      <w:r>
+        <w:rPr>
+          <w:sz w:val="32"/>
+          <w:szCs w:val="32"/>
+        </w:rPr>
+        <w:t xml:space="preserve"> branch.</w:t>
+      </w:r>
+      <w:r>
+        <w:rPr>
+          <w:sz w:val="32"/>
+          <w:szCs w:val="32"/>
+        </w:rPr>
+        <w:t xml:space="preserve"> Recommended</w:t>
+      </w:r>
+    </w:p>
+    <w:p>
+      <w:pPr>
+        <w:pStyle w:val="ListParagraph"/>
+        <w:numPr>
+          <w:ilvl w:val="0"/>
+          <w:numId w:val="18"/>
+        </w:numPr>
+        <w:jc w:val="both"/>
+        <w:rPr>
+          <w:sz w:val="32"/>
+          <w:szCs w:val="32"/>
+        </w:rPr>
+      </w:pPr>
+      <w:r>
+        <w:rPr>
+          <w:b/>
+          <w:bCs/>
+          <w:sz w:val="32"/>
+          <w:szCs w:val="32"/>
+        </w:rPr>
+        <w:t>Require linear history</w:t>
+      </w:r>
+      <w:r>
+        <w:rPr>
+          <w:b/>
+          <w:bCs/>
+          <w:sz w:val="32"/>
+          <w:szCs w:val="32"/>
+        </w:rPr>
+        <w:t>:</w:t>
+      </w:r>
+      <w:r>
+        <w:rPr>
+          <w:sz w:val="32"/>
+          <w:szCs w:val="32"/>
+        </w:rPr>
+        <w:t xml:space="preserve"> </w:t>
+      </w:r>
+      <w:r>
+        <w:rPr>
+          <w:sz w:val="32"/>
+          <w:szCs w:val="32"/>
+        </w:rPr>
+        <w:t>Disallows merge commits. Only squash or rebase merges are allowed, keeping history clean.</w:t>
+      </w:r>
+    </w:p>
+    <w:p>
+      <w:pPr>
+        <w:pStyle w:val="ListParagraph"/>
+        <w:numPr>
+          <w:ilvl w:val="0"/>
+          <w:numId w:val="18"/>
+        </w:numPr>
+        <w:jc w:val="both"/>
+        <w:rPr>
+          <w:sz w:val="32"/>
+          <w:szCs w:val="32"/>
+        </w:rPr>
+      </w:pPr>
+      <w:r>
+        <w:rPr>
+          <w:b/>
+          <w:bCs/>
+          <w:sz w:val="32"/>
+          <w:szCs w:val="32"/>
+        </w:rPr>
+        <w:t>Require deployments to succeed</w:t>
+      </w:r>
+      <w:r>
+        <w:rPr>
+          <w:b/>
+          <w:bCs/>
+          <w:sz w:val="32"/>
+          <w:szCs w:val="32"/>
+        </w:rPr>
+        <w:t>:</w:t>
+      </w:r>
+      <w:r>
+        <w:rPr>
+          <w:sz w:val="32"/>
+          <w:szCs w:val="32"/>
+        </w:rPr>
+        <w:t xml:space="preserve"> </w:t>
+      </w:r>
+      <w:r>
+        <w:rPr>
+          <w:sz w:val="32"/>
+          <w:szCs w:val="32"/>
+        </w:rPr>
+        <w:t>Deployment (e.g., Firebase Hosting) must succeed before merging.</w:t>
+      </w:r>
+      <w:r>
+        <w:rPr>
+          <w:sz w:val="32"/>
+          <w:szCs w:val="32"/>
+        </w:rPr>
+        <w:t xml:space="preserve"> Recommended if we use PRs and CI</w:t>
+      </w:r>
+    </w:p>
+    <w:p>
+      <w:pPr>
+        <w:pStyle w:val="ListParagraph"/>
+        <w:numPr>
+          <w:ilvl w:val="0"/>
+          <w:numId w:val="18"/>
+        </w:numPr>
+        <w:jc w:val="both"/>
+        <w:rPr>
+          <w:sz w:val="32"/>
+          <w:szCs w:val="32"/>
+        </w:rPr>
+      </w:pPr>
+      <w:r>
+        <w:rPr>
+          <w:b/>
+          <w:bCs/>
+          <w:sz w:val="32"/>
+          <w:szCs w:val="32"/>
+        </w:rPr>
+        <w:t>R</w:t>
+      </w:r>
+      <w:r>
+        <w:rPr>
+          <w:b/>
+          <w:bCs/>
+          <w:sz w:val="32"/>
+          <w:szCs w:val="32"/>
+        </w:rPr>
+        <w:t>equire signed commits</w:t>
+      </w:r>
+      <w:r>
+        <w:rPr>
+          <w:b/>
+          <w:bCs/>
+          <w:sz w:val="32"/>
+          <w:szCs w:val="32"/>
+        </w:rPr>
+        <w:t xml:space="preserve">: </w:t>
+      </w:r>
+      <w:r>
+        <w:rPr>
+          <w:sz w:val="32"/>
+          <w:szCs w:val="32"/>
+        </w:rPr>
+        <w:t>Every commit must have a verified GPG/SSH signature.</w:t>
+      </w:r>
+      <w:r>
+        <w:rPr>
+          <w:sz w:val="32"/>
+          <w:szCs w:val="32"/>
+        </w:rPr>
+        <w:t xml:space="preserve"> </w:t>
+      </w:r>
+      <w:r>
+        <w:rPr>
+          <w:sz w:val="32"/>
+          <w:szCs w:val="32"/>
+        </w:rPr>
+        <w:t xml:space="preserve">Skip unless </w:t>
+      </w:r>
+      <w:r>
+        <w:rPr>
+          <w:sz w:val="32"/>
+          <w:szCs w:val="32"/>
+        </w:rPr>
+        <w:t>we</w:t>
+      </w:r>
+      <w:r>
+        <w:rPr>
+          <w:sz w:val="32"/>
+          <w:szCs w:val="32"/>
+        </w:rPr>
+        <w:t xml:space="preserve"> specifically want signed commits</w:t>
+      </w:r>
+    </w:p>
+    <w:p>
+      <w:pPr>
+        <w:pStyle w:val="ListParagraph"/>
+        <w:numPr>
+          <w:ilvl w:val="0"/>
+          <w:numId w:val="18"/>
+        </w:numPr>
+        <w:jc w:val="both"/>
+        <w:rPr>
+          <w:sz w:val="32"/>
+          <w:szCs w:val="32"/>
+        </w:rPr>
+      </w:pPr>
+      <w:r>
+        <w:rPr>
+          <w:b/>
+          <w:bCs/>
+          <w:sz w:val="32"/>
+          <w:szCs w:val="32"/>
+        </w:rPr>
+        <w:lastRenderedPageBreak/>
+        <w:t>Require a pull request:</w:t>
+      </w:r>
+      <w:r>
+        <w:rPr>
+          <w:sz w:val="32"/>
+          <w:szCs w:val="32"/>
+        </w:rPr>
+        <w:t xml:space="preserve"> No direct pushes. Every change must go through a Pull Request.</w:t>
+      </w:r>
+    </w:p>
+    <w:p>
+      <w:pPr>
+        <w:pStyle w:val="ListParagraph"/>
+        <w:numPr>
+          <w:ilvl w:val="0"/>
+          <w:numId w:val="18"/>
+        </w:numPr>
+        <w:jc w:val="both"/>
+        <w:rPr>
+          <w:sz w:val="32"/>
+          <w:szCs w:val="32"/>
+        </w:rPr>
+      </w:pPr>
+      <w:r>
+        <w:rPr>
+          <w:b/>
+          <w:bCs/>
+          <w:sz w:val="32"/>
+          <w:szCs w:val="32"/>
+        </w:rPr>
+        <w:t>Require status checks:</w:t>
+      </w:r>
+      <w:r>
+        <w:rPr>
+          <w:sz w:val="32"/>
+          <w:szCs w:val="32"/>
+        </w:rPr>
+        <w:t xml:space="preserve"> Ensures automated tests</w:t>
+      </w:r>
+      <w:r>
+        <w:rPr>
+          <w:sz w:val="32"/>
+          <w:szCs w:val="32"/>
+        </w:rPr>
+        <w:t xml:space="preserve"> and CI</w:t>
+      </w:r>
+      <w:r>
+        <w:rPr>
+          <w:sz w:val="32"/>
+          <w:szCs w:val="32"/>
+        </w:rPr>
+        <w:t xml:space="preserve"> </w:t>
+      </w:r>
+      <w:r>
+        <w:rPr>
+          <w:sz w:val="32"/>
+          <w:szCs w:val="32"/>
+        </w:rPr>
+        <w:t xml:space="preserve">(like </w:t>
+      </w:r>
+      <w:r>
+        <w:rPr>
+          <w:b/>
+          <w:bCs/>
+          <w:sz w:val="32"/>
+          <w:szCs w:val="32"/>
+        </w:rPr>
+        <w:t>flutter analyze</w:t>
+      </w:r>
+      <w:r>
+        <w:rPr>
+          <w:sz w:val="32"/>
+          <w:szCs w:val="32"/>
+        </w:rPr>
+        <w:t xml:space="preserve">, </w:t>
+      </w:r>
+      <w:r>
+        <w:rPr>
+          <w:b/>
+          <w:bCs/>
+          <w:sz w:val="32"/>
+          <w:szCs w:val="32"/>
+        </w:rPr>
+        <w:t>flutter test</w:t>
+      </w:r>
+      <w:r>
+        <w:rPr>
+          <w:sz w:val="32"/>
+          <w:szCs w:val="32"/>
+        </w:rPr>
+        <w:t>,</w:t>
+      </w:r>
+      <w:r>
+        <w:rPr>
+          <w:b/>
+          <w:bCs/>
+          <w:sz w:val="32"/>
+          <w:szCs w:val="32"/>
+        </w:rPr>
+        <w:t xml:space="preserve"> flutter</w:t>
+      </w:r>
+      <w:r>
+        <w:rPr>
+          <w:sz w:val="32"/>
+          <w:szCs w:val="32"/>
+        </w:rPr>
+        <w:t xml:space="preserve"> </w:t>
+      </w:r>
+      <w:r>
+        <w:rPr>
+          <w:b/>
+          <w:bCs/>
+          <w:sz w:val="32"/>
+          <w:szCs w:val="32"/>
+        </w:rPr>
+        <w:t>build</w:t>
+      </w:r>
+      <w:r>
+        <w:rPr>
+          <w:sz w:val="32"/>
+          <w:szCs w:val="32"/>
+        </w:rPr>
+        <w:t>)</w:t>
+      </w:r>
+      <w:r>
+        <w:rPr>
+          <w:sz w:val="32"/>
+          <w:szCs w:val="32"/>
+        </w:rPr>
+        <w:t xml:space="preserve"> pass before merging.</w:t>
+      </w:r>
+    </w:p>
+    <w:p>
+      <w:pPr>
+        <w:pStyle w:val="ListParagraph"/>
+        <w:numPr>
+          <w:ilvl w:val="0"/>
+          <w:numId w:val="18"/>
+        </w:numPr>
+        <w:jc w:val="both"/>
+        <w:rPr>
+          <w:sz w:val="32"/>
+          <w:szCs w:val="32"/>
+        </w:rPr>
+      </w:pPr>
+      <w:r>
+        <w:rPr>
+          <w:b/>
+          <w:bCs/>
+          <w:sz w:val="32"/>
+          <w:szCs w:val="32"/>
+        </w:rPr>
+        <w:t>Block force pushes</w:t>
+      </w:r>
+      <w:r>
+        <w:rPr>
+          <w:b/>
+          <w:bCs/>
+          <w:sz w:val="32"/>
+          <w:szCs w:val="32"/>
+        </w:rPr>
+        <w:t>:</w:t>
+      </w:r>
+      <w:r>
+        <w:rPr>
+          <w:sz w:val="32"/>
+          <w:szCs w:val="32"/>
+        </w:rPr>
+        <w:t xml:space="preserve"> </w:t>
+      </w:r>
+      <w:r>
+        <w:rPr>
+          <w:sz w:val="32"/>
+          <w:szCs w:val="32"/>
+        </w:rPr>
+        <w:t>Prevents git push --force to main.</w:t>
+      </w:r>
+      <w:r>
+        <w:rPr>
+          <w:sz w:val="32"/>
+          <w:szCs w:val="32"/>
+        </w:rPr>
+        <w:t xml:space="preserve"> </w:t>
+      </w:r>
+      <w:r>
+        <w:rPr>
+          <w:sz w:val="32"/>
+          <w:szCs w:val="32"/>
+        </w:rPr>
+        <w:t>Highly Recommended</w:t>
+      </w:r>
+    </w:p>
+    <w:p>
+      <w:pPr>
+        <w:pStyle w:val="ListParagraph"/>
+        <w:numPr>
+          <w:ilvl w:val="0"/>
+          <w:numId w:val="18"/>
+        </w:numPr>
+        <w:jc w:val="both"/>
+        <w:rPr>
+          <w:sz w:val="32"/>
+          <w:szCs w:val="32"/>
+        </w:rPr>
+      </w:pPr>
+      <w:r>
+        <w:rPr>
+          <w:b/>
+          <w:bCs/>
+          <w:sz w:val="32"/>
+          <w:szCs w:val="32"/>
+        </w:rPr>
+        <w:t>Require code scanning results</w:t>
+      </w:r>
+      <w:r>
+        <w:rPr>
+          <w:b/>
+          <w:bCs/>
+          <w:sz w:val="32"/>
+          <w:szCs w:val="32"/>
+        </w:rPr>
+        <w:t xml:space="preserve">: </w:t>
+      </w:r>
+      <w:r>
+        <w:rPr>
+          <w:sz w:val="32"/>
+          <w:szCs w:val="32"/>
+        </w:rPr>
+        <w:t xml:space="preserve">Security scanning (e.g., </w:t>
+      </w:r>
+      <w:proofErr w:type="spellStart"/>
+      <w:r>
+        <w:rPr>
+          <w:b/>
+          <w:bCs/>
+          <w:sz w:val="32"/>
+          <w:szCs w:val="32"/>
+        </w:rPr>
+        <w:t>CodeQL</w:t>
+      </w:r>
+      <w:proofErr w:type="spellEnd"/>
+      <w:r>
+        <w:rPr>
+          <w:sz w:val="32"/>
+          <w:szCs w:val="32"/>
+        </w:rPr>
+        <w:t>) must pas</w:t>
+      </w:r>
+      <w:r>
+        <w:rPr>
+          <w:sz w:val="32"/>
+          <w:szCs w:val="32"/>
+        </w:rPr>
+        <w:t xml:space="preserve">s. </w:t>
+      </w:r>
+      <w:r>
+        <w:rPr>
+          <w:sz w:val="32"/>
+          <w:szCs w:val="32"/>
+        </w:rPr>
+        <w:t xml:space="preserve">Enable later if </w:t>
+      </w:r>
+      <w:r>
+        <w:rPr>
+          <w:sz w:val="32"/>
+          <w:szCs w:val="32"/>
+        </w:rPr>
+        <w:t>we</w:t>
+      </w:r>
+      <w:r>
+        <w:rPr>
+          <w:sz w:val="32"/>
+          <w:szCs w:val="32"/>
+        </w:rPr>
+        <w:t xml:space="preserve"> add </w:t>
+      </w:r>
+      <w:proofErr w:type="spellStart"/>
+      <w:r>
+        <w:rPr>
+          <w:b/>
+          <w:bCs/>
+          <w:sz w:val="32"/>
+          <w:szCs w:val="32"/>
+        </w:rPr>
+        <w:t>CodeQL</w:t>
+      </w:r>
+      <w:proofErr w:type="spellEnd"/>
+    </w:p>
+    <w:p>
+      <w:pPr>
+        <w:pStyle w:val="ListParagraph"/>
+        <w:numPr>
+          <w:ilvl w:val="0"/>
+          <w:numId w:val="18"/>
+        </w:numPr>
+        <w:jc w:val="both"/>
+        <w:rPr>
+          <w:sz w:val="32"/>
+          <w:szCs w:val="32"/>
+        </w:rPr>
+      </w:pPr>
+      <w:r>
+        <w:rPr>
+          <w:b/>
+          <w:bCs/>
+          <w:sz w:val="32"/>
+          <w:szCs w:val="32"/>
+        </w:rPr>
+        <w:t>Require code quality results</w:t>
+      </w:r>
+      <w:r>
+        <w:rPr>
+          <w:b/>
+          <w:bCs/>
+          <w:sz w:val="32"/>
+          <w:szCs w:val="32"/>
+        </w:rPr>
+        <w:t>:</w:t>
+      </w:r>
+      <w:r>
+        <w:rPr>
+          <w:sz w:val="32"/>
+          <w:szCs w:val="32"/>
+        </w:rPr>
+        <w:t xml:space="preserve"> </w:t>
+      </w:r>
+      <w:r>
+        <w:rPr>
+          <w:sz w:val="32"/>
+          <w:szCs w:val="32"/>
+        </w:rPr>
+        <w:t>Blocks merges if code quality checks fail.</w:t>
+      </w:r>
+    </w:p>
+    <w:p>
+      <w:pPr>
+        <w:pStyle w:val="ListParagraph"/>
+        <w:numPr>
+          <w:ilvl w:val="0"/>
+          <w:numId w:val="18"/>
+        </w:numPr>
+        <w:jc w:val="both"/>
+        <w:rPr>
+          <w:sz w:val="32"/>
+          <w:szCs w:val="32"/>
+        </w:rPr>
+      </w:pPr>
+      <w:r>
+        <w:rPr>
+          <w:b/>
+          <w:bCs/>
+          <w:sz w:val="32"/>
+          <w:szCs w:val="32"/>
+        </w:rPr>
+        <w:t>Restrict code coverage</w:t>
+      </w:r>
+      <w:r>
+        <w:rPr>
+          <w:b/>
+          <w:bCs/>
+          <w:sz w:val="32"/>
+          <w:szCs w:val="32"/>
+        </w:rPr>
+        <w:t>:</w:t>
+      </w:r>
+      <w:r>
+        <w:rPr>
+          <w:sz w:val="32"/>
+          <w:szCs w:val="32"/>
+        </w:rPr>
+        <w:t xml:space="preserve"> </w:t>
+      </w:r>
+      <w:r>
+        <w:rPr>
+          <w:sz w:val="32"/>
+          <w:szCs w:val="32"/>
+        </w:rPr>
+        <w:t xml:space="preserve">Requires minimum test coverage before merging. Skip until </w:t>
+      </w:r>
+      <w:r>
+        <w:rPr>
+          <w:sz w:val="32"/>
+          <w:szCs w:val="32"/>
+        </w:rPr>
+        <w:t>we</w:t>
+      </w:r>
+      <w:r>
+        <w:rPr>
+          <w:sz w:val="32"/>
+          <w:szCs w:val="32"/>
+        </w:rPr>
+        <w:t xml:space="preserve"> have a solid test suite</w:t>
+      </w:r>
+    </w:p>
+    <w:p>
+      <w:pPr>
+        <w:pStyle w:val="ListParagraph"/>
+        <w:numPr>
+          <w:ilvl w:val="0"/>
+          <w:numId w:val="18"/>
+        </w:numPr>
+        <w:jc w:val="both"/>
+        <w:rPr>
+          <w:sz w:val="32"/>
+          <w:szCs w:val="32"/>
+        </w:rPr>
+      </w:pPr>
+      <w:r>
+        <w:rPr>
+          <w:b/>
+          <w:bCs/>
+          <w:sz w:val="32"/>
+          <w:szCs w:val="32"/>
+        </w:rPr>
+        <w:t>Automatically request Copilot code review</w:t>
+      </w:r>
+      <w:r>
+        <w:rPr>
+          <w:b/>
+          <w:bCs/>
+          <w:sz w:val="32"/>
+          <w:szCs w:val="32"/>
+        </w:rPr>
+        <w:t>:</w:t>
+      </w:r>
+      <w:r>
+        <w:rPr>
+          <w:sz w:val="32"/>
+          <w:szCs w:val="32"/>
+        </w:rPr>
+        <w:tab/>
+        <w:t xml:space="preserve">Copilot reviews every PR automatically. Only if </w:t>
+      </w:r>
+      <w:r>
+        <w:rPr>
+          <w:sz w:val="32"/>
+          <w:szCs w:val="32"/>
+        </w:rPr>
+        <w:t>we</w:t>
+      </w:r>
+      <w:r>
+        <w:rPr>
+          <w:sz w:val="32"/>
+          <w:szCs w:val="32"/>
+        </w:rPr>
+        <w:t xml:space="preserve"> use GitHub Copilot</w:t>
+      </w:r>
+    </w:p>
+    <w:p>
+      <w:pPr>
+        <w:jc w:val="both"/>
+        <w:rPr>
+          <w:sz w:val="32"/>
+          <w:szCs w:val="32"/>
+        </w:rPr>
+      </w:pPr>
+    </w:p>
+    <w:p>
+      <w:pPr>
+        <w:jc w:val="center"/>
+        <w:rPr>
+          <w:sz w:val="32"/>
+          <w:szCs w:val="32"/>
+        </w:rPr>
+      </w:pPr>
+      <w:r>
+        <w:rPr>
+          <w:sz w:val="32"/>
+          <w:szCs w:val="32"/>
+        </w:rPr>
+        <w:t>Break</w:t>
+      </w:r>
+    </w:p>
+    <w:p>
+      <w:pPr>
         <w:jc w:val="both"/>
         <w:rPr>
           <w:sz w:val="32"/>
@@ -6032,6 +8014,7 @@
       </w:pPr>
     </w:p>
     <w:sectPr>
+      <w:footerReference w:type="default" r:id="rId8"/>
       <w:pgSz w:w="11906" w:h="16838" w:code="9"/>
       <w:pgMar w:top="1440" w:right="1440" w:bottom="1440" w:left="1440" w:header="720" w:footer="720" w:gutter="0"/>
       <w:cols w:space="720"/>
@@ -6041,6 +8024,109 @@
 </w:document>
 </file>
 
+<file path=word/endnotes.xml><?xml version="1.0" encoding="utf-8"?>
+<w:endnotes xmlns:wpc="http://schemas.microsoft.com/office/word/2010/wordprocessingCanvas" xmlns:cx="http://schemas.microsoft.com/office/drawing/2014/chartex" xmlns:cx1="http://schemas.microsoft.com/office/drawing/2015/9/8/chartex" xmlns:cx2="http://schemas.microsoft.com/office/drawing/2015/10/21/chartex" xmlns:cx3="http://schemas.microsoft.com/office/drawing/2016/5/9/chartex" xmlns:cx4="http://schemas.microsoft.com/office/drawing/2016/5/10/chartex" xmlns:cx5="http://schemas.microsoft.com/office/drawing/2016/5/11/chartex" xmlns:cx6="http://schemas.microsoft.com/office/drawing/2016/5/12/chartex" xmlns:cx7="http://schemas.microsoft.com/office/drawing/2016/5/13/chartex" xmlns:cx8="http://schemas.microsoft.com/office/drawing/2016/5/14/chartex" xmlns:mc="http://schemas.openxmlformats.org/markup-compatibility/2006" xmlns:aink="http://schemas.microsoft.com/office/drawing/2016/ink" xmlns:am3d="http://schemas.microsoft.com/office/drawing/2017/model3d" xmlns:o="urn:schemas-microsoft-com:office:office" xmlns:oel="http://schemas.microsoft.com/office/2019/extlst" xmlns:r="http://schemas.openxmlformats.org/officeDocument/2006/relationships" xmlns:m="http://schemas.openxmlformats.org/officeDocument/2006/math" xmlns:v="urn:schemas-microsoft-com:vml" xmlns:wp14="http://schemas.microsoft.com/office/word/2010/wordprocessingDrawing" xmlns:wp="http://schemas.openxmlformats.org/drawingml/2006/wordprocessingDrawing" xmlns:w10="urn:schemas-microsoft-com:office:word" xmlns:w="http://schemas.openxmlformats.org/wordprocessingml/2006/main" xmlns:w14="http://schemas.microsoft.com/office/word/2010/wordml" xmlns:w15="http://schemas.microsoft.com/office/word/2012/wordml" xmlns:w16cex="http://schemas.microsoft.com/office/word/2018/wordml/cex" xmlns:w16cid="http://schemas.microsoft.com/office/word/2016/wordml/cid" xmlns:w16="http://schemas.microsoft.com/office/word/2018/wordml" xmlns:w16sdtdh="http://schemas.microsoft.com/office/word/2020/wordml/sdtdatahash" xmlns:w16se="http://schemas.microsoft.com/office/word/2015/wordml/symex" xmlns:wpg="http://schemas.microsoft.com/office/word/2010/wordprocessingGroup" xmlns:wpi="http://schemas.microsoft.com/office/word/2010/wordprocessingInk" xmlns:wne="http://schemas.microsoft.com/office/word/2006/wordml" xmlns:wps="http://schemas.microsoft.com/office/word/2010/wordprocessingShape" mc:Ignorable="w14 w15 w16se w16cid w16 w16cex w16sdtdh wp14">
+  <w:endnote w:type="separator" w:id="-1">
+    <w:p>
+      <w:pPr>
+        <w:spacing w:after="0" w:line="240" w:lineRule="auto"/>
+      </w:pPr>
+      <w:r>
+        <w:separator/>
+      </w:r>
+    </w:p>
+  </w:endnote>
+  <w:endnote w:type="continuationSeparator" w:id="0">
+    <w:p>
+      <w:pPr>
+        <w:spacing w:after="0" w:line="240" w:lineRule="auto"/>
+      </w:pPr>
+      <w:r>
+        <w:continuationSeparator/>
+      </w:r>
+    </w:p>
+  </w:endnote>
+</w:endnotes>
+</file>
+
+<file path=word/footer1.xml><?xml version="1.0" encoding="utf-8"?>
+<w:ftr xmlns:wpc="http://schemas.microsoft.com/office/word/2010/wordprocessingCanvas" xmlns:cx="http://schemas.microsoft.com/office/drawing/2014/chartex" xmlns:cx1="http://schemas.microsoft.com/office/drawing/2015/9/8/chartex" xmlns:cx2="http://schemas.microsoft.com/office/drawing/2015/10/21/chartex" xmlns:cx3="http://schemas.microsoft.com/office/drawing/2016/5/9/chartex" xmlns:cx4="http://schemas.microsoft.com/office/drawing/2016/5/10/chartex" xmlns:cx5="http://schemas.microsoft.com/office/drawing/2016/5/11/chartex" xmlns:cx6="http://schemas.microsoft.com/office/drawing/2016/5/12/chartex" xmlns:cx7="http://schemas.microsoft.com/office/drawing/2016/5/13/chartex" xmlns:cx8="http://schemas.microsoft.com/office/drawing/2016/5/14/chartex" xmlns:mc="http://schemas.openxmlformats.org/markup-compatibility/2006" xmlns:aink="http://schemas.microsoft.com/office/drawing/2016/ink" xmlns:am3d="http://schemas.microsoft.com/office/drawing/2017/model3d" xmlns:o="urn:schemas-microsoft-com:office:office" xmlns:oel="http://schemas.microsoft.com/office/2019/extlst" xmlns:r="http://schemas.openxmlformats.org/officeDocument/2006/relationships" xmlns:m="http://schemas.openxmlformats.org/officeDocument/2006/math" xmlns:v="urn:schemas-microsoft-com:vml" xmlns:wp14="http://schemas.microsoft.com/office/word/2010/wordprocessingDrawing" xmlns:wp="http://schemas.openxmlformats.org/drawingml/2006/wordprocessingDrawing" xmlns:w10="urn:schemas-microsoft-com:office:word" xmlns:w="http://schemas.openxmlformats.org/wordprocessingml/2006/main" xmlns:w14="http://schemas.microsoft.com/office/word/2010/wordml" xmlns:w15="http://schemas.microsoft.com/office/word/2012/wordml" xmlns:w16cex="http://schemas.microsoft.com/office/word/2018/wordml/cex" xmlns:w16cid="http://schemas.microsoft.com/office/word/2016/wordml/cid" xmlns:w16="http://schemas.microsoft.com/office/word/2018/wordml" xmlns:w16sdtdh="http://schemas.microsoft.com/office/word/2020/wordml/sdtdatahash" xmlns:w16se="http://schemas.microsoft.com/office/word/2015/wordml/symex" xmlns:wpg="http://schemas.microsoft.com/office/word/2010/wordprocessingGroup" xmlns:wpi="http://schemas.microsoft.com/office/word/2010/wordprocessingInk" xmlns:wne="http://schemas.microsoft.com/office/word/2006/wordml" xmlns:wps="http://schemas.microsoft.com/office/word/2010/wordprocessingShape" mc:Ignorable="w14 w15 w16se w16cid w16 w16cex w16sdtdh wp14">
+  <w:sdt>
+    <w:sdtPr>
+      <w:id w:val="-1484303040"/>
+      <w:docPartObj>
+        <w:docPartGallery w:val="Page Numbers (Bottom of Page)"/>
+        <w:docPartUnique/>
+      </w:docPartObj>
+    </w:sdtPr>
+    <w:sdtEndPr>
+      <w:rPr>
+        <w:noProof/>
+      </w:rPr>
+    </w:sdtEndPr>
+    <w:sdtContent>
+      <w:p>
+        <w:pPr>
+          <w:pStyle w:val="Footer"/>
+          <w:jc w:val="center"/>
+        </w:pPr>
+        <w:r>
+          <w:fldChar w:fldCharType="begin"/>
+        </w:r>
+        <w:r>
+          <w:instrText xml:space="preserve"> PAGE   \* MERGEFORMAT </w:instrText>
+        </w:r>
+        <w:r>
+          <w:fldChar w:fldCharType="separate"/>
+        </w:r>
+        <w:r>
+          <w:rPr>
+            <w:noProof/>
+          </w:rPr>
+          <w:t>2</w:t>
+        </w:r>
+        <w:r>
+          <w:rPr>
+            <w:noProof/>
+          </w:rPr>
+          <w:fldChar w:fldCharType="end"/>
+        </w:r>
+      </w:p>
+    </w:sdtContent>
+  </w:sdt>
+  <w:p>
+    <w:pPr>
+      <w:pStyle w:val="Footer"/>
+    </w:pPr>
+  </w:p>
+</w:ftr>
+</file>
+
+<file path=word/footnotes.xml><?xml version="1.0" encoding="utf-8"?>
+<w:footnotes xmlns:wpc="http://schemas.microsoft.com/office/word/2010/wordprocessingCanvas" xmlns:cx="http://schemas.microsoft.com/office/drawing/2014/chartex" xmlns:cx1="http://schemas.microsoft.com/office/drawing/2015/9/8/chartex" xmlns:cx2="http://schemas.microsoft.com/office/drawing/2015/10/21/chartex" xmlns:cx3="http://schemas.microsoft.com/office/drawing/2016/5/9/chartex" xmlns:cx4="http://schemas.microsoft.com/office/drawing/2016/5/10/chartex" xmlns:cx5="http://schemas.microsoft.com/office/drawing/2016/5/11/chartex" xmlns:cx6="http://schemas.microsoft.com/office/drawing/2016/5/12/chartex" xmlns:cx7="http://schemas.microsoft.com/office/drawing/2016/5/13/chartex" xmlns:cx8="http://schemas.microsoft.com/office/drawing/2016/5/14/chartex" xmlns:mc="http://schemas.openxmlformats.org/markup-compatibility/2006" xmlns:aink="http://schemas.microsoft.com/office/drawing/2016/ink" xmlns:am3d="http://schemas.microsoft.com/office/drawing/2017/model3d" xmlns:o="urn:schemas-microsoft-com:office:office" xmlns:oel="http://schemas.microsoft.com/office/2019/extlst" xmlns:r="http://schemas.openxmlformats.org/officeDocument/2006/relationships" xmlns:m="http://schemas.openxmlformats.org/officeDocument/2006/math" xmlns:v="urn:schemas-microsoft-com:vml" xmlns:wp14="http://schemas.microsoft.com/office/word/2010/wordprocessingDrawing" xmlns:wp="http://schemas.openxmlformats.org/drawingml/2006/wordprocessingDrawing" xmlns:w10="urn:schemas-microsoft-com:office:word" xmlns:w="http://schemas.openxmlformats.org/wordprocessingml/2006/main" xmlns:w14="http://schemas.microsoft.com/office/word/2010/wordml" xmlns:w15="http://schemas.microsoft.com/office/word/2012/wordml" xmlns:w16cex="http://schemas.microsoft.com/office/word/2018/wordml/cex" xmlns:w16cid="http://schemas.microsoft.com/office/word/2016/wordml/cid" xmlns:w16="http://schemas.microsoft.com/office/word/2018/wordml" xmlns:w16sdtdh="http://schemas.microsoft.com/office/word/2020/wordml/sdtdatahash" xmlns:w16se="http://schemas.microsoft.com/office/word/2015/wordml/symex" xmlns:wpg="http://schemas.microsoft.com/office/word/2010/wordprocessingGroup" xmlns:wpi="http://schemas.microsoft.com/office/word/2010/wordprocessingInk" xmlns:wne="http://schemas.microsoft.com/office/word/2006/wordml" xmlns:wps="http://schemas.microsoft.com/office/word/2010/wordprocessingShape" mc:Ignorable="w14 w15 w16se w16cid w16 w16cex w16sdtdh wp14">
+  <w:footnote w:type="separator" w:id="-1">
+    <w:p>
+      <w:pPr>
+        <w:spacing w:after="0" w:line="240" w:lineRule="auto"/>
+      </w:pPr>
+      <w:r>
+        <w:separator/>
+      </w:r>
+    </w:p>
+  </w:footnote>
+  <w:footnote w:type="continuationSeparator" w:id="0">
+    <w:p>
+      <w:pPr>
+        <w:spacing w:after="0" w:line="240" w:lineRule="auto"/>
+      </w:pPr>
+      <w:r>
+        <w:continuationSeparator/>
+      </w:r>
+    </w:p>
+  </w:footnote>
+</w:footnotes>
+</file>
+
 <file path=word/numbering.xml><?xml version="1.0" encoding="utf-8"?>
 <w:numbering xmlns:wpc="http://schemas.microsoft.com/office/word/2010/wordprocessingCanvas" xmlns:cx="http://schemas.microsoft.com/office/drawing/2014/chartex" xmlns:cx1="http://schemas.microsoft.com/office/drawing/2015/9/8/chartex" xmlns:cx2="http://schemas.microsoft.com/office/drawing/2015/10/21/chartex" xmlns:cx3="http://schemas.microsoft.com/office/drawing/2016/5/9/chartex" xmlns:cx4="http://schemas.microsoft.com/office/drawing/2016/5/10/chartex" xmlns:cx5="http://schemas.microsoft.com/office/drawing/2016/5/11/chartex" xmlns:cx6="http://schemas.microsoft.com/office/drawing/2016/5/12/chartex" xmlns:cx7="http://schemas.microsoft.com/office/drawing/2016/5/13/chartex" xmlns:cx8="http://schemas.microsoft.com/office/drawing/2016/5/14/chartex" xmlns:mc="http://schemas.openxmlformats.org/markup-compatibility/2006" xmlns:aink="http://schemas.microsoft.com/office/drawing/2016/ink" xmlns:am3d="http://schemas.microsoft.com/office/drawing/2017/model3d" xmlns:o="urn:schemas-microsoft-com:office:office" xmlns:oel="http://schemas.microsoft.com/office/2019/extlst" xmlns:r="http://schemas.openxmlformats.org/officeDocument/2006/relationships" xmlns:m="http://schemas.openxmlformats.org/officeDocument/2006/math" xmlns:v="urn:schemas-microsoft-com:vml" xmlns:wp14="http://schemas.microsoft.com/office/word/2010/wordprocessingDrawing" xmlns:wp="http://schemas.openxmlformats.org/drawingml/2006/wordprocessingDrawing" xmlns:w10="urn:schemas-microsoft-com:office:word" xmlns:w="http://schemas.openxmlformats.org/wordprocessingml/2006/main" xmlns:w14="http://schemas.microsoft.com/office/word/2010/wordml" xmlns:w15="http://schemas.microsoft.com/office/word/2012/wordml" xmlns:w16cex="http://schemas.microsoft.com/office/word/2018/wordml/cex" xmlns:w16cid="http://schemas.microsoft.com/office/word/2016/wordml/cid" xmlns:w16="http://schemas.microsoft.com/office/word/2018/wordml" xmlns:w16sdtdh="http://schemas.microsoft.com/office/word/2020/wordml/sdtdatahash" xmlns:w16se="http://schemas.microsoft.com/office/word/2015/wordml/symex" xmlns:wpg="http://schemas.microsoft.com/office/word/2010/wordprocessingGroup" xmlns:wpi="http://schemas.microsoft.com/office/word/2010/wordprocessingInk" xmlns:wne="http://schemas.microsoft.com/office/word/2006/wordml" xmlns:wps="http://schemas.microsoft.com/office/word/2010/wordprocessingShape" mc:Ignorable="w14 w15 w16se w16cid w16 w16cex w16sdtdh wp14">
   <w:abstractNum w:abstractNumId="0" w15:restartNumberingAfterBreak="0">
@@ -6532,6 +8618,119 @@
     </w:lvl>
   </w:abstractNum>
   <w:abstractNum w:abstractNumId="4" w15:restartNumberingAfterBreak="0">
+    <w:nsid w:val="084B5734"/>
+    <w:multiLevelType w:val="hybridMultilevel"/>
+    <w:tmpl w:val="825C6868"/>
+    <w:lvl w:ilvl="0" w:tplc="04090001">
+      <w:start w:val="1"/>
+      <w:numFmt w:val="bullet"/>
+      <w:lvlText w:val=""/>
+      <w:lvlJc w:val="left"/>
+      <w:pPr>
+        <w:ind w:left="360" w:hanging="360"/>
+      </w:pPr>
+      <w:rPr>
+        <w:rFonts w:ascii="Symbol" w:hAnsi="Symbol" w:hint="default"/>
+      </w:rPr>
+    </w:lvl>
+    <w:lvl w:ilvl="1" w:tplc="04090003" w:tentative="1">
+      <w:start w:val="1"/>
+      <w:numFmt w:val="bullet"/>
+      <w:lvlText w:val="o"/>
+      <w:lvlJc w:val="left"/>
+      <w:pPr>
+        <w:ind w:left="1080" w:hanging="360"/>
+      </w:pPr>
+      <w:rPr>
+        <w:rFonts w:ascii="Courier New" w:hAnsi="Courier New" w:cs="Courier New" w:hint="default"/>
+      </w:rPr>
+    </w:lvl>
+    <w:lvl w:ilvl="2" w:tplc="04090005" w:tentative="1">
+      <w:start w:val="1"/>
+      <w:numFmt w:val="bullet"/>
+      <w:lvlText w:val=""/>
+      <w:lvlJc w:val="left"/>
+      <w:pPr>
+        <w:ind w:left="1800" w:hanging="360"/>
+      </w:pPr>
+      <w:rPr>
+        <w:rFonts w:ascii="Wingdings" w:hAnsi="Wingdings" w:hint="default"/>
+      </w:rPr>
+    </w:lvl>
+    <w:lvl w:ilvl="3" w:tplc="04090001" w:tentative="1">
+      <w:start w:val="1"/>
+      <w:numFmt w:val="bullet"/>
+      <w:lvlText w:val=""/>
+      <w:lvlJc w:val="left"/>
+      <w:pPr>
+        <w:ind w:left="2520" w:hanging="360"/>
+      </w:pPr>
+      <w:rPr>
+        <w:rFonts w:ascii="Symbol" w:hAnsi="Symbol" w:hint="default"/>
+      </w:rPr>
+    </w:lvl>
+    <w:lvl w:ilvl="4" w:tplc="04090003" w:tentative="1">
+      <w:start w:val="1"/>
+      <w:numFmt w:val="bullet"/>
+      <w:lvlText w:val="o"/>
+      <w:lvlJc w:val="left"/>
+      <w:pPr>
+        <w:ind w:left="3240" w:hanging="360"/>
+      </w:pPr>
+      <w:rPr>
+        <w:rFonts w:ascii="Courier New" w:hAnsi="Courier New" w:cs="Courier New" w:hint="default"/>
+      </w:rPr>
+    </w:lvl>
+    <w:lvl w:ilvl="5" w:tplc="04090005" w:tentative="1">
+      <w:start w:val="1"/>
+      <w:numFmt w:val="bullet"/>
+      <w:lvlText w:val=""/>
+      <w:lvlJc w:val="left"/>
+      <w:pPr>
+        <w:ind w:left="3960" w:hanging="360"/>
+      </w:pPr>
+      <w:rPr>
+        <w:rFonts w:ascii="Wingdings" w:hAnsi="Wingdings" w:hint="default"/>
+      </w:rPr>
+    </w:lvl>
+    <w:lvl w:ilvl="6" w:tplc="04090001" w:tentative="1">
+      <w:start w:val="1"/>
+      <w:numFmt w:val="bullet"/>
+      <w:lvlText w:val=""/>
+      <w:lvlJc w:val="left"/>
+      <w:pPr>
+        <w:ind w:left="4680" w:hanging="360"/>
+      </w:pPr>
+      <w:rPr>
+        <w:rFonts w:ascii="Symbol" w:hAnsi="Symbol" w:hint="default"/>
+      </w:rPr>
+    </w:lvl>
+    <w:lvl w:ilvl="7" w:tplc="04090003" w:tentative="1">
+      <w:start w:val="1"/>
+      <w:numFmt w:val="bullet"/>
+      <w:lvlText w:val="o"/>
+      <w:lvlJc w:val="left"/>
+      <w:pPr>
+        <w:ind w:left="5400" w:hanging="360"/>
+      </w:pPr>
+      <w:rPr>
+        <w:rFonts w:ascii="Courier New" w:hAnsi="Courier New" w:cs="Courier New" w:hint="default"/>
+      </w:rPr>
+    </w:lvl>
+    <w:lvl w:ilvl="8" w:tplc="04090005" w:tentative="1">
+      <w:start w:val="1"/>
+      <w:numFmt w:val="bullet"/>
+      <w:lvlText w:val=""/>
+      <w:lvlJc w:val="left"/>
+      <w:pPr>
+        <w:ind w:left="6120" w:hanging="360"/>
+      </w:pPr>
+      <w:rPr>
+        <w:rFonts w:ascii="Wingdings" w:hAnsi="Wingdings" w:hint="default"/>
+      </w:rPr>
+    </w:lvl>
+  </w:abstractNum>
+  <w:abstractNum w:abstractNumId="5" w15:restartNumberingAfterBreak="0">
     <w:nsid w:val="233F505E"/>
     <w:multiLevelType w:val="hybridMultilevel"/>
     <w:tmpl w:val="FCC0DF30"/>
@@ -6644,7 +8843,211 @@
       </w:rPr>
     </w:lvl>
   </w:abstractNum>
-  <w:abstractNum w:abstractNumId="5" w15:restartNumberingAfterBreak="0">
+  <w:abstractNum w:abstractNumId="6" w15:restartNumberingAfterBreak="0">
+    <w:nsid w:val="2CB9767D"/>
+    <w:multiLevelType w:val="hybridMultilevel"/>
+    <w:tmpl w:val="AFB64B80"/>
+    <w:lvl w:ilvl="0" w:tplc="F9283C08">
+      <w:start w:val="1"/>
+      <w:numFmt w:val="decimal"/>
+      <w:lvlText w:val="%1."/>
+      <w:lvlJc w:val="left"/>
+      <w:pPr>
+        <w:ind w:left="360" w:hanging="360"/>
+      </w:pPr>
+      <w:rPr>
+        <w:rFonts w:hint="default"/>
+        <w:b/>
+        <w:bCs/>
+      </w:rPr>
+    </w:lvl>
+    <w:lvl w:ilvl="1" w:tplc="04090019" w:tentative="1">
+      <w:start w:val="1"/>
+      <w:numFmt w:val="lowerLetter"/>
+      <w:lvlText w:val="%2."/>
+      <w:lvlJc w:val="left"/>
+      <w:pPr>
+        <w:ind w:left="1080" w:hanging="360"/>
+      </w:pPr>
+    </w:lvl>
+    <w:lvl w:ilvl="2" w:tplc="0409001B" w:tentative="1">
+      <w:start w:val="1"/>
+      <w:numFmt w:val="lowerRoman"/>
+      <w:lvlText w:val="%3."/>
+      <w:lvlJc w:val="right"/>
+      <w:pPr>
+        <w:ind w:left="1800" w:hanging="180"/>
+      </w:pPr>
+    </w:lvl>
+    <w:lvl w:ilvl="3" w:tplc="0409000F" w:tentative="1">
+      <w:start w:val="1"/>
+      <w:numFmt w:val="decimal"/>
+      <w:lvlText w:val="%4."/>
+      <w:lvlJc w:val="left"/>
+      <w:pPr>
+        <w:ind w:left="2520" w:hanging="360"/>
+      </w:pPr>
+    </w:lvl>
+    <w:lvl w:ilvl="4" w:tplc="04090019" w:tentative="1">
+      <w:start w:val="1"/>
+      <w:numFmt w:val="lowerLetter"/>
+      <w:lvlText w:val="%5."/>
+      <w:lvlJc w:val="left"/>
+      <w:pPr>
+        <w:ind w:left="3240" w:hanging="360"/>
+      </w:pPr>
+    </w:lvl>
+    <w:lvl w:ilvl="5" w:tplc="0409001B" w:tentative="1">
+      <w:start w:val="1"/>
+      <w:numFmt w:val="lowerRoman"/>
+      <w:lvlText w:val="%6."/>
+      <w:lvlJc w:val="right"/>
+      <w:pPr>
+        <w:ind w:left="3960" w:hanging="180"/>
+      </w:pPr>
+    </w:lvl>
+    <w:lvl w:ilvl="6" w:tplc="0409000F" w:tentative="1">
+      <w:start w:val="1"/>
+      <w:numFmt w:val="decimal"/>
+      <w:lvlText w:val="%7."/>
+      <w:lvlJc w:val="left"/>
+      <w:pPr>
+        <w:ind w:left="4680" w:hanging="360"/>
+      </w:pPr>
+    </w:lvl>
+    <w:lvl w:ilvl="7" w:tplc="04090019" w:tentative="1">
+      <w:start w:val="1"/>
+      <w:numFmt w:val="lowerLetter"/>
+      <w:lvlText w:val="%8."/>
+      <w:lvlJc w:val="left"/>
+      <w:pPr>
+        <w:ind w:left="5400" w:hanging="360"/>
+      </w:pPr>
+    </w:lvl>
+    <w:lvl w:ilvl="8" w:tplc="0409001B" w:tentative="1">
+      <w:start w:val="1"/>
+      <w:numFmt w:val="lowerRoman"/>
+      <w:lvlText w:val="%9."/>
+      <w:lvlJc w:val="right"/>
+      <w:pPr>
+        <w:ind w:left="6120" w:hanging="180"/>
+      </w:pPr>
+    </w:lvl>
+  </w:abstractNum>
+  <w:abstractNum w:abstractNumId="7" w15:restartNumberingAfterBreak="0">
+    <w:nsid w:val="2DC06634"/>
+    <w:multiLevelType w:val="hybridMultilevel"/>
+    <w:tmpl w:val="2F6A645E"/>
+    <w:lvl w:ilvl="0" w:tplc="04090001">
+      <w:start w:val="1"/>
+      <w:numFmt w:val="bullet"/>
+      <w:lvlText w:val=""/>
+      <w:lvlJc w:val="left"/>
+      <w:pPr>
+        <w:ind w:left="360" w:hanging="360"/>
+      </w:pPr>
+      <w:rPr>
+        <w:rFonts w:ascii="Symbol" w:hAnsi="Symbol" w:hint="default"/>
+      </w:rPr>
+    </w:lvl>
+    <w:lvl w:ilvl="1" w:tplc="04090003" w:tentative="1">
+      <w:start w:val="1"/>
+      <w:numFmt w:val="bullet"/>
+      <w:lvlText w:val="o"/>
+      <w:lvlJc w:val="left"/>
+      <w:pPr>
+        <w:ind w:left="1080" w:hanging="360"/>
+      </w:pPr>
+      <w:rPr>
+        <w:rFonts w:ascii="Courier New" w:hAnsi="Courier New" w:cs="Courier New" w:hint="default"/>
+      </w:rPr>
+    </w:lvl>
+    <w:lvl w:ilvl="2" w:tplc="04090005" w:tentative="1">
+      <w:start w:val="1"/>
+      <w:numFmt w:val="bullet"/>
+      <w:lvlText w:val=""/>
+      <w:lvlJc w:val="left"/>
+      <w:pPr>
+        <w:ind w:left="1800" w:hanging="360"/>
+      </w:pPr>
+      <w:rPr>
+        <w:rFonts w:ascii="Wingdings" w:hAnsi="Wingdings" w:hint="default"/>
+      </w:rPr>
+    </w:lvl>
+    <w:lvl w:ilvl="3" w:tplc="04090001" w:tentative="1">
+      <w:start w:val="1"/>
+      <w:numFmt w:val="bullet"/>
+      <w:lvlText w:val=""/>
+      <w:lvlJc w:val="left"/>
+      <w:pPr>
+        <w:ind w:left="2520" w:hanging="360"/>
+      </w:pPr>
+      <w:rPr>
+        <w:rFonts w:ascii="Symbol" w:hAnsi="Symbol" w:hint="default"/>
+      </w:rPr>
+    </w:lvl>
+    <w:lvl w:ilvl="4" w:tplc="04090003" w:tentative="1">
+      <w:start w:val="1"/>
+      <w:numFmt w:val="bullet"/>
+      <w:lvlText w:val="o"/>
+      <w:lvlJc w:val="left"/>
+      <w:pPr>
+        <w:ind w:left="3240" w:hanging="360"/>
+      </w:pPr>
+      <w:rPr>
+        <w:rFonts w:ascii="Courier New" w:hAnsi="Courier New" w:cs="Courier New" w:hint="default"/>
+      </w:rPr>
+    </w:lvl>
+    <w:lvl w:ilvl="5" w:tplc="04090005" w:tentative="1">
+      <w:start w:val="1"/>
+      <w:numFmt w:val="bullet"/>
+      <w:lvlText w:val=""/>
+      <w:lvlJc w:val="left"/>
+      <w:pPr>
+        <w:ind w:left="3960" w:hanging="360"/>
+      </w:pPr>
+      <w:rPr>
+        <w:rFonts w:ascii="Wingdings" w:hAnsi="Wingdings" w:hint="default"/>
+      </w:rPr>
+    </w:lvl>
+    <w:lvl w:ilvl="6" w:tplc="04090001" w:tentative="1">
+      <w:start w:val="1"/>
+      <w:numFmt w:val="bullet"/>
+      <w:lvlText w:val=""/>
+      <w:lvlJc w:val="left"/>
+      <w:pPr>
+        <w:ind w:left="4680" w:hanging="360"/>
+      </w:pPr>
+      <w:rPr>
+        <w:rFonts w:ascii="Symbol" w:hAnsi="Symbol" w:hint="default"/>
+      </w:rPr>
+    </w:lvl>
+    <w:lvl w:ilvl="7" w:tplc="04090003" w:tentative="1">
+      <w:start w:val="1"/>
+      <w:numFmt w:val="bullet"/>
+      <w:lvlText w:val="o"/>
+      <w:lvlJc w:val="left"/>
+      <w:pPr>
+        <w:ind w:left="5400" w:hanging="360"/>
+      </w:pPr>
+      <w:rPr>
+        <w:rFonts w:ascii="Courier New" w:hAnsi="Courier New" w:cs="Courier New" w:hint="default"/>
+      </w:rPr>
+    </w:lvl>
+    <w:lvl w:ilvl="8" w:tplc="04090005" w:tentative="1">
+      <w:start w:val="1"/>
+      <w:numFmt w:val="bullet"/>
+      <w:lvlText w:val=""/>
+      <w:lvlJc w:val="left"/>
+      <w:pPr>
+        <w:ind w:left="6120" w:hanging="360"/>
+      </w:pPr>
+      <w:rPr>
+        <w:rFonts w:ascii="Wingdings" w:hAnsi="Wingdings" w:hint="default"/>
+      </w:rPr>
+    </w:lvl>
+  </w:abstractNum>
+  <w:abstractNum w:abstractNumId="8" w15:restartNumberingAfterBreak="0">
     <w:nsid w:val="40B92F70"/>
     <w:multiLevelType w:val="hybridMultilevel"/>
     <w:tmpl w:val="288CC70A"/>
@@ -6757,7 +9160,7 @@
       </w:rPr>
     </w:lvl>
   </w:abstractNum>
-  <w:abstractNum w:abstractNumId="6" w15:restartNumberingAfterBreak="0">
+  <w:abstractNum w:abstractNumId="9" w15:restartNumberingAfterBreak="0">
     <w:nsid w:val="45FA3DD7"/>
     <w:multiLevelType w:val="hybridMultilevel"/>
     <w:tmpl w:val="66403120"/>
@@ -6870,7 +9273,7 @@
       </w:rPr>
     </w:lvl>
   </w:abstractNum>
-  <w:abstractNum w:abstractNumId="7" w15:restartNumberingAfterBreak="0">
+  <w:abstractNum w:abstractNumId="10" w15:restartNumberingAfterBreak="0">
     <w:nsid w:val="50685EFB"/>
     <w:multiLevelType w:val="hybridMultilevel"/>
     <w:tmpl w:val="CDC81BAC"/>
@@ -6983,7 +9386,7 @@
       </w:rPr>
     </w:lvl>
   </w:abstractNum>
-  <w:abstractNum w:abstractNumId="8" w15:restartNumberingAfterBreak="0">
+  <w:abstractNum w:abstractNumId="11" w15:restartNumberingAfterBreak="0">
     <w:nsid w:val="50C723DD"/>
     <w:multiLevelType w:val="hybridMultilevel"/>
     <w:tmpl w:val="0ED20D7A"/>
@@ -7096,7 +9499,7 @@
       </w:rPr>
     </w:lvl>
   </w:abstractNum>
-  <w:abstractNum w:abstractNumId="9" w15:restartNumberingAfterBreak="0">
+  <w:abstractNum w:abstractNumId="12" w15:restartNumberingAfterBreak="0">
     <w:nsid w:val="57F227BD"/>
     <w:multiLevelType w:val="hybridMultilevel"/>
     <w:tmpl w:val="87821966"/>
@@ -7209,7 +9612,7 @@
       </w:rPr>
     </w:lvl>
   </w:abstractNum>
-  <w:abstractNum w:abstractNumId="10" w15:restartNumberingAfterBreak="0">
+  <w:abstractNum w:abstractNumId="13" w15:restartNumberingAfterBreak="0">
     <w:nsid w:val="5F2F5290"/>
     <w:multiLevelType w:val="multilevel"/>
     <w:tmpl w:val="5F48C196"/>
@@ -7358,7 +9761,7 @@
       </w:rPr>
     </w:lvl>
   </w:abstractNum>
-  <w:abstractNum w:abstractNumId="11" w15:restartNumberingAfterBreak="0">
+  <w:abstractNum w:abstractNumId="14" w15:restartNumberingAfterBreak="0">
     <w:nsid w:val="71E64614"/>
     <w:multiLevelType w:val="hybridMultilevel"/>
     <w:tmpl w:val="4CDAC4AE"/>
@@ -7471,7 +9874,7 @@
       </w:rPr>
     </w:lvl>
   </w:abstractNum>
-  <w:abstractNum w:abstractNumId="12" w15:restartNumberingAfterBreak="0">
+  <w:abstractNum w:abstractNumId="15" w15:restartNumberingAfterBreak="0">
     <w:nsid w:val="75395AC6"/>
     <w:multiLevelType w:val="hybridMultilevel"/>
     <w:tmpl w:val="6EBCA17A"/>
@@ -7584,7 +9987,7 @@
       </w:rPr>
     </w:lvl>
   </w:abstractNum>
-  <w:abstractNum w:abstractNumId="13" w15:restartNumberingAfterBreak="0">
+  <w:abstractNum w:abstractNumId="16" w15:restartNumberingAfterBreak="0">
     <w:nsid w:val="7A9D352E"/>
     <w:multiLevelType w:val="hybridMultilevel"/>
     <w:tmpl w:val="CDF831FE"/>
@@ -7697,7 +10100,7 @@
       </w:rPr>
     </w:lvl>
   </w:abstractNum>
-  <w:abstractNum w:abstractNumId="14" w15:restartNumberingAfterBreak="0">
+  <w:abstractNum w:abstractNumId="17" w15:restartNumberingAfterBreak="0">
     <w:nsid w:val="7CB62E1D"/>
     <w:multiLevelType w:val="multilevel"/>
     <w:tmpl w:val="78467252"/>
@@ -7850,46 +10253,55 @@
     <w:abstractNumId w:val="1"/>
   </w:num>
   <w:num w:numId="2" w16cid:durableId="304893228">
-    <w:abstractNumId w:val="10"/>
+    <w:abstractNumId w:val="13"/>
   </w:num>
   <w:num w:numId="3" w16cid:durableId="450636287">
+    <w:abstractNumId w:val="17"/>
+  </w:num>
+  <w:num w:numId="4" w16cid:durableId="1581791556">
+    <w:abstractNumId w:val="5"/>
+  </w:num>
+  <w:num w:numId="5" w16cid:durableId="1351684566">
+    <w:abstractNumId w:val="16"/>
+  </w:num>
+  <w:num w:numId="6" w16cid:durableId="1135946889">
+    <w:abstractNumId w:val="11"/>
+  </w:num>
+  <w:num w:numId="7" w16cid:durableId="733553197">
+    <w:abstractNumId w:val="8"/>
+  </w:num>
+  <w:num w:numId="8" w16cid:durableId="121273201">
     <w:abstractNumId w:val="14"/>
   </w:num>
-  <w:num w:numId="4" w16cid:durableId="1581791556">
-    <w:abstractNumId w:val="4"/>
-  </w:num>
-  <w:num w:numId="5" w16cid:durableId="1351684566">
-    <w:abstractNumId w:val="13"/>
-  </w:num>
-  <w:num w:numId="6" w16cid:durableId="1135946889">
-    <w:abstractNumId w:val="8"/>
-  </w:num>
-  <w:num w:numId="7" w16cid:durableId="733553197">
-    <w:abstractNumId w:val="5"/>
-  </w:num>
-  <w:num w:numId="8" w16cid:durableId="121273201">
-    <w:abstractNumId w:val="11"/>
-  </w:num>
   <w:num w:numId="9" w16cid:durableId="466364774">
-    <w:abstractNumId w:val="9"/>
+    <w:abstractNumId w:val="12"/>
   </w:num>
   <w:num w:numId="10" w16cid:durableId="520557637">
-    <w:abstractNumId w:val="7"/>
+    <w:abstractNumId w:val="10"/>
   </w:num>
   <w:num w:numId="11" w16cid:durableId="737438673">
     <w:abstractNumId w:val="3"/>
   </w:num>
   <w:num w:numId="12" w16cid:durableId="435372544">
-    <w:abstractNumId w:val="6"/>
+    <w:abstractNumId w:val="9"/>
   </w:num>
   <w:num w:numId="13" w16cid:durableId="724721703">
     <w:abstractNumId w:val="0"/>
   </w:num>
   <w:num w:numId="14" w16cid:durableId="272057067">
-    <w:abstractNumId w:val="12"/>
+    <w:abstractNumId w:val="15"/>
   </w:num>
   <w:num w:numId="15" w16cid:durableId="1040667473">
     <w:abstractNumId w:val="2"/>
+  </w:num>
+  <w:num w:numId="16" w16cid:durableId="1015233080">
+    <w:abstractNumId w:val="6"/>
+  </w:num>
+  <w:num w:numId="17" w16cid:durableId="526724145">
+    <w:abstractNumId w:val="4"/>
+  </w:num>
+  <w:num w:numId="18" w16cid:durableId="2061324774">
+    <w:abstractNumId w:val="7"/>
   </w:num>
 </w:numbering>
 </file>
@@ -8497,7 +10909,6 @@
   <w:style w:type="character" w:default="1" w:styleId="DefaultParagraphFont">
     <w:name w:val="Default Paragraph Font"/>
     <w:uiPriority w:val="1"/>
-    <w:semiHidden/>
     <w:unhideWhenUsed/>
   </w:style>
   <w:style w:type="table" w:default="1" w:styleId="TableNormal">
@@ -8887,6 +11298,50 @@
       </w:tcPr>
     </w:tblStylePr>
   </w:style>
+  <w:style w:type="paragraph" w:styleId="Header">
+    <w:name w:val="header"/>
+    <w:basedOn w:val="Normal"/>
+    <w:link w:val="HeaderChar"/>
+    <w:uiPriority w:val="99"/>
+    <w:unhideWhenUsed/>
+    <w:rsid w:val="003A4A5A"/>
+    <w:pPr>
+      <w:tabs>
+        <w:tab w:val="center" w:pos="4680"/>
+        <w:tab w:val="right" w:pos="9360"/>
+      </w:tabs>
+      <w:spacing w:after="0" w:line="240" w:lineRule="auto"/>
+    </w:pPr>
+  </w:style>
+  <w:style w:type="character" w:customStyle="1" w:styleId="HeaderChar">
+    <w:name w:val="Header Char"/>
+    <w:basedOn w:val="DefaultParagraphFont"/>
+    <w:link w:val="Header"/>
+    <w:uiPriority w:val="99"/>
+    <w:rsid w:val="003A4A5A"/>
+  </w:style>
+  <w:style w:type="paragraph" w:styleId="Footer">
+    <w:name w:val="footer"/>
+    <w:basedOn w:val="Normal"/>
+    <w:link w:val="FooterChar"/>
+    <w:uiPriority w:val="99"/>
+    <w:unhideWhenUsed/>
+    <w:rsid w:val="003A4A5A"/>
+    <w:pPr>
+      <w:tabs>
+        <w:tab w:val="center" w:pos="4680"/>
+        <w:tab w:val="right" w:pos="9360"/>
+      </w:tabs>
+      <w:spacing w:after="0" w:line="240" w:lineRule="auto"/>
+    </w:pPr>
+  </w:style>
+  <w:style w:type="character" w:customStyle="1" w:styleId="FooterChar">
+    <w:name w:val="Footer Char"/>
+    <w:basedOn w:val="DefaultParagraphFont"/>
+    <w:link w:val="Footer"/>
+    <w:uiPriority w:val="99"/>
+    <w:rsid w:val="003A4A5A"/>
+  </w:style>
 </w:styles>
 </file>
 

</xml_diff>